<commit_message>
Document Hyperion frontier model architecture
</commit_message>
<xml_diff>
--- a/docs/engineering/hyperion-llm-coordinator-handbook.docx
+++ b/docs/engineering/hyperion-llm-coordinator-handbook.docx
@@ -17,7 +17,7 @@
           <w:color w:val="2E74B5"/>
           <w:sz w:val="20"/>
         </w:rPr>
-        <w:t>PRIVATE ENGINEERING HANDBOOK  •  VERSION 1.0</w:t>
+        <w:t>PRIVATE ENGINEERING HANDBOOK  •  VERSION 1.1</w:t>
       </w:r>
     </w:p>
     <w:p>
@@ -62,7 +62,7 @@
           <w:color w:val="FFFFFF"/>
           <w:sz w:val="24"/>
         </w:rPr>
-        <w:t>Coordinator • model-evidence pipeline • isolated verifier</w:t>
+        <w:t>Coordinator • frontier model factory • isolated verifier</w:t>
         <w:br/>
         <w:t>For ML, platform, safety, and operations teams</w:t>
       </w:r>
@@ -90,7 +90,7 @@
           <w:color w:val="25313B"/>
           <w:sz w:val="21"/>
         </w:rPr>
-        <w:t>30 July 2026</w:t>
+        <w:t>31 July 2026</w:t>
       </w:r>
     </w:p>
     <w:p>
@@ -347,7 +347,7 @@
         <w:rPr>
           <w:b w:val="0"/>
         </w:rPr>
-        <w:t>15. Kimi K3 research adoption</w:t>
+        <w:t>15. Frontier model architecture and Kimi K3 adoption</w:t>
       </w:r>
     </w:p>
     <w:p>
@@ -5248,6 +5248,418 @@
     </w:p>
     <w:p>
       <w:pPr>
+        <w:pStyle w:val="Heading2"/>
+      </w:pPr>
+      <w:r>
+        <w:t>9.5 Target challenger and teacher portfolio</w:t>
+      </w:r>
+    </w:p>
+    <w:p>
+      <w:r>
+        <w:rPr>
+          <w:b w:val="0"/>
+        </w:rPr>
+        <w:t>The four-entry catalog above is the implemented comparison contract, not the limit of Hyperion's target architecture. A separate dated registry admits any technically useful hosted, downloadable, gated, commercial, custom-licensed, or permissioned candidate for research. Access, price, terms, attribution, retention, and the accountable permission owner are provenance fields; they are not automatic technical rejection criteria.</w:t>
+      </w:r>
+    </w:p>
+    <w:tbl>
+      <w:tblPr>
+        <w:tblStyle w:val="TableGrid"/>
+        <w:tblW w:type="dxa" w:w="9360"/>
+        <w:jc w:val="center"/>
+        <w:tblLayout w:type="fixed"/>
+        <w:tblLook w:firstColumn="1" w:firstRow="1" w:lastColumn="0" w:lastRow="0" w:noHBand="0" w:noVBand="1" w:val="04A0"/>
+        <w:tblLayout w:type="fixed"/>
+        <w:tblInd w:w="120" w:type="dxa"/>
+        <w:tblCellMar>
+          <w:top w:w="80" w:type="dxa"/>
+          <w:bottom w:w="80" w:type="dxa"/>
+          <w:start w:w="120" w:type="dxa"/>
+          <w:end w:w="120" w:type="dxa"/>
+        </w:tblCellMar>
+      </w:tblPr>
+      <w:tblGrid>
+        <w:gridCol w:w="3120"/>
+        <w:gridCol w:w="3120"/>
+        <w:gridCol w:w="3120"/>
+      </w:tblGrid>
+      <w:tr>
+        <w:trPr>
+          <w:tblHeader w:val="true"/>
+          <w:cantSplit/>
+        </w:trPr>
+        <w:tc>
+          <w:tcPr>
+            <w:tcW w:type="dxa" w:w="3120"/>
+            <w:shd w:fill="E8EEF5"/>
+            <w:tcFitText/>
+            <w:vAlign w:val="top"/>
+          </w:tcPr>
+          <w:p>
+            <w:pPr>
+              <w:spacing w:after="40" w:line="259" w:lineRule="auto"/>
+            </w:pPr>
+            <w:r>
+              <w:rPr>
+                <w:b/>
+                <w:sz w:val="16"/>
+              </w:rPr>
+              <w:t>Portfolio tier</w:t>
+            </w:r>
+          </w:p>
+        </w:tc>
+        <w:tc>
+          <w:tcPr>
+            <w:tcW w:type="dxa" w:w="3120"/>
+            <w:shd w:fill="E8EEF5"/>
+            <w:tcFitText/>
+            <w:vAlign w:val="top"/>
+          </w:tcPr>
+          <w:p>
+            <w:pPr>
+              <w:spacing w:after="40" w:line="259" w:lineRule="auto"/>
+            </w:pPr>
+            <w:r>
+              <w:rPr>
+                <w:b/>
+                <w:sz w:val="16"/>
+              </w:rPr>
+              <w:t>Current source-reviewed examples</w:t>
+            </w:r>
+          </w:p>
+        </w:tc>
+        <w:tc>
+          <w:tcPr>
+            <w:tcW w:type="dxa" w:w="3120"/>
+            <w:shd w:fill="E8EEF5"/>
+            <w:tcFitText/>
+            <w:vAlign w:val="top"/>
+          </w:tcPr>
+          <w:p>
+            <w:pPr>
+              <w:spacing w:after="40" w:line="259" w:lineRule="auto"/>
+            </w:pPr>
+            <w:r>
+              <w:rPr>
+                <w:b/>
+                <w:sz w:val="16"/>
+              </w:rPr>
+              <w:t>Intended role</w:t>
+            </w:r>
+          </w:p>
+        </w:tc>
+      </w:tr>
+      <w:tr>
+        <w:trPr>
+          <w:cantSplit/>
+        </w:trPr>
+        <w:tc>
+          <w:tcPr>
+            <w:tcW w:type="dxa" w:w="3120"/>
+            <w:vAlign w:val="top"/>
+          </w:tcPr>
+          <w:p>
+            <w:pPr>
+              <w:spacing w:after="40" w:line="259" w:lineRule="auto"/>
+            </w:pPr>
+            <w:r>
+              <w:rPr>
+                <w:b w:val="0"/>
+                <w:sz w:val="16"/>
+              </w:rPr>
+              <w:t>Hosted frontier</w:t>
+            </w:r>
+          </w:p>
+        </w:tc>
+        <w:tc>
+          <w:tcPr>
+            <w:tcW w:type="dxa" w:w="3120"/>
+            <w:vAlign w:val="top"/>
+          </w:tcPr>
+          <w:p>
+            <w:pPr>
+              <w:spacing w:after="40" w:line="259" w:lineRule="auto"/>
+            </w:pPr>
+            <w:r>
+              <w:rPr>
+                <w:b w:val="0"/>
+                <w:sz w:val="16"/>
+              </w:rPr>
+              <w:t>GPT-5.6 Sol/Terra/Luna, Gemini 3.1 Pro, Claude Fable 5, Kimi K3 API</w:t>
+            </w:r>
+          </w:p>
+        </w:tc>
+        <w:tc>
+          <w:tcPr>
+            <w:tcW w:type="dxa" w:w="3120"/>
+            <w:vAlign w:val="top"/>
+          </w:tcPr>
+          <w:p>
+            <w:pPr>
+              <w:spacing w:after="40" w:line="259" w:lineRule="auto"/>
+            </w:pPr>
+            <w:r>
+              <w:rPr>
+                <w:b w:val="0"/>
+                <w:sz w:val="16"/>
+              </w:rPr>
+              <w:t>Difficult teacher traces, independent criticism, multimodal and long-context comparison</w:t>
+            </w:r>
+          </w:p>
+        </w:tc>
+      </w:tr>
+      <w:tr>
+        <w:trPr>
+          <w:cantSplit/>
+        </w:trPr>
+        <w:tc>
+          <w:tcPr>
+            <w:tcW w:type="dxa" w:w="3120"/>
+            <w:vAlign w:val="top"/>
+          </w:tcPr>
+          <w:p>
+            <w:pPr>
+              <w:spacing w:after="40" w:line="259" w:lineRule="auto"/>
+            </w:pPr>
+            <w:r>
+              <w:rPr>
+                <w:b w:val="0"/>
+                <w:sz w:val="16"/>
+              </w:rPr>
+              <w:t>Large open/downloadable</w:t>
+            </w:r>
+          </w:p>
+        </w:tc>
+        <w:tc>
+          <w:tcPr>
+            <w:tcW w:type="dxa" w:w="3120"/>
+            <w:vAlign w:val="top"/>
+          </w:tcPr>
+          <w:p>
+            <w:pPr>
+              <w:spacing w:after="40" w:line="259" w:lineRule="auto"/>
+            </w:pPr>
+            <w:r>
+              <w:rPr>
+                <w:b w:val="0"/>
+                <w:sz w:val="16"/>
+              </w:rPr>
+              <w:t>Kimi K3, Qwen3.5 large MoE, GLM-5/5.2, DeepSeek R1/V3 line, Llama 4, gpt-oss-120b, MiniMax-M2.5</w:t>
+            </w:r>
+          </w:p>
+        </w:tc>
+        <w:tc>
+          <w:tcPr>
+            <w:tcW w:type="dxa" w:w="3120"/>
+            <w:vAlign w:val="top"/>
+          </w:tcPr>
+          <w:p>
+            <w:pPr>
+              <w:spacing w:after="40" w:line="259" w:lineRule="auto"/>
+            </w:pPr>
+            <w:r>
+              <w:rPr>
+                <w:b w:val="0"/>
+                <w:sz w:val="16"/>
+              </w:rPr>
+              <w:t>Reproducible teachers, logits when available, large-cluster challengers</w:t>
+            </w:r>
+          </w:p>
+        </w:tc>
+      </w:tr>
+      <w:tr>
+        <w:trPr>
+          <w:cantSplit/>
+        </w:trPr>
+        <w:tc>
+          <w:tcPr>
+            <w:tcW w:type="dxa" w:w="3120"/>
+            <w:vAlign w:val="top"/>
+          </w:tcPr>
+          <w:p>
+            <w:pPr>
+              <w:spacing w:after="40" w:line="259" w:lineRule="auto"/>
+            </w:pPr>
+            <w:r>
+              <w:rPr>
+                <w:b w:val="0"/>
+                <w:sz w:val="16"/>
+              </w:rPr>
+              <w:t>Small-cluster students</w:t>
+            </w:r>
+          </w:p>
+        </w:tc>
+        <w:tc>
+          <w:tcPr>
+            <w:tcW w:type="dxa" w:w="3120"/>
+            <w:vAlign w:val="top"/>
+          </w:tcPr>
+          <w:p>
+            <w:pPr>
+              <w:spacing w:after="40" w:line="259" w:lineRule="auto"/>
+            </w:pPr>
+            <w:r>
+              <w:rPr>
+                <w:b w:val="0"/>
+                <w:sz w:val="16"/>
+              </w:rPr>
+              <w:t>gpt-oss-20b, practical Qwen3/Qwen3-Coder sizes, Qwen3.5-9B, Devstral Small 2 24B, Falcon-H1-34B</w:t>
+            </w:r>
+          </w:p>
+        </w:tc>
+        <w:tc>
+          <w:tcPr>
+            <w:tcW w:type="dxa" w:w="3120"/>
+            <w:vAlign w:val="top"/>
+          </w:tcPr>
+          <w:p>
+            <w:pPr>
+              <w:spacing w:after="40" w:line="259" w:lineRule="auto"/>
+            </w:pPr>
+            <w:r>
+              <w:rPr>
+                <w:b w:val="0"/>
+                <w:sz w:val="16"/>
+              </w:rPr>
+              <w:t>Private adapter training and economical serving</w:t>
+            </w:r>
+          </w:p>
+        </w:tc>
+      </w:tr>
+      <w:tr>
+        <w:trPr>
+          <w:cantSplit/>
+        </w:trPr>
+        <w:tc>
+          <w:tcPr>
+            <w:tcW w:type="dxa" w:w="3120"/>
+            <w:vAlign w:val="top"/>
+          </w:tcPr>
+          <w:p>
+            <w:pPr>
+              <w:spacing w:after="40" w:line="259" w:lineRule="auto"/>
+            </w:pPr>
+            <w:r>
+              <w:rPr>
+                <w:b w:val="0"/>
+                <w:sz w:val="16"/>
+              </w:rPr>
+              <w:t>Specialists</w:t>
+            </w:r>
+          </w:p>
+        </w:tc>
+        <w:tc>
+          <w:tcPr>
+            <w:tcW w:type="dxa" w:w="3120"/>
+            <w:vAlign w:val="top"/>
+          </w:tcPr>
+          <w:p>
+            <w:pPr>
+              <w:spacing w:after="40" w:line="259" w:lineRule="auto"/>
+            </w:pPr>
+            <w:r>
+              <w:rPr>
+                <w:b w:val="0"/>
+                <w:sz w:val="16"/>
+              </w:rPr>
+              <w:t>C#/architecture, UI, quant/math, risk/portfolio, research/tool-use adapters at measured effort levels</w:t>
+            </w:r>
+          </w:p>
+        </w:tc>
+        <w:tc>
+          <w:tcPr>
+            <w:tcW w:type="dxa" w:w="3120"/>
+            <w:vAlign w:val="top"/>
+          </w:tcPr>
+          <w:p>
+            <w:pPr>
+              <w:spacing w:after="40" w:line="259" w:lineRule="auto"/>
+            </w:pPr>
+            <w:r>
+              <w:rPr>
+                <w:b w:val="0"/>
+                <w:sz w:val="16"/>
+              </w:rPr>
+              <w:t>Domain depth without forcing one checkpoint to dominate every task</w:t>
+            </w:r>
+          </w:p>
+        </w:tc>
+      </w:tr>
+      <w:tr>
+        <w:trPr>
+          <w:cantSplit/>
+        </w:trPr>
+        <w:tc>
+          <w:tcPr>
+            <w:tcW w:type="dxa" w:w="3120"/>
+            <w:vAlign w:val="top"/>
+          </w:tcPr>
+          <w:p>
+            <w:pPr>
+              <w:spacing w:after="40" w:line="259" w:lineRule="auto"/>
+            </w:pPr>
+            <w:r>
+              <w:rPr>
+                <w:b w:val="0"/>
+                <w:sz w:val="16"/>
+              </w:rPr>
+              <w:t>Control models</w:t>
+            </w:r>
+          </w:p>
+        </w:tc>
+        <w:tc>
+          <w:tcPr>
+            <w:tcW w:type="dxa" w:w="3120"/>
+            <w:vAlign w:val="top"/>
+          </w:tcPr>
+          <w:p>
+            <w:pPr>
+              <w:spacing w:after="40" w:line="259" w:lineRule="auto"/>
+            </w:pPr>
+            <w:r>
+              <w:rPr>
+                <w:b w:val="0"/>
+                <w:sz w:val="16"/>
+              </w:rPr>
+              <w:t>Router, critic, judge, embedding model, reranker</w:t>
+            </w:r>
+          </w:p>
+        </w:tc>
+        <w:tc>
+          <w:tcPr>
+            <w:tcW w:type="dxa" w:w="3120"/>
+            <w:vAlign w:val="top"/>
+          </w:tcPr>
+          <w:p>
+            <w:pPr>
+              <w:spacing w:after="40" w:line="259" w:lineRule="auto"/>
+            </w:pPr>
+            <w:r>
+              <w:rPr>
+                <w:b w:val="0"/>
+                <w:sz w:val="16"/>
+              </w:rPr>
+              <w:t>Selection, retrieval, uncertainty, and independent challenge</w:t>
+            </w:r>
+          </w:p>
+        </w:tc>
+      </w:tr>
+    </w:tbl>
+    <w:p>
+      <w:pPr>
+        <w:spacing w:after="40"/>
+      </w:pPr>
+    </w:p>
+    <w:p>
+      <w:r>
+        <w:rPr>
+          <w:b w:val="0"/>
+        </w:rPr>
+        <w:t>Every registry record pins the source/revision and records modality, context, disclosed total/active parameters, architecture, template/tool protocol, precision, runtime, measured resources, quality/latency/cost evidence, allowed roles, data policy, and lifecycle state. Unknown internals stay unknown. Adding a record grants no training, promotion, activation, or user-data authority.</w:t>
+      </w:r>
+    </w:p>
+    <w:p>
+      <w:pPr>
         <w:pStyle w:val="Heading1"/>
       </w:pPr>
       <w:r>
@@ -5589,6 +6001,177 @@
           <w:b w:val="0"/>
         </w:rPr>
         <w:t>Hyperion currently has no conforming training run, adapter, checkpoint, or trained weights.</w:t>
+      </w:r>
+    </w:p>
+    <w:p>
+      <w:pPr>
+        <w:pStyle w:val="Heading2"/>
+      </w:pPr>
+      <w:r>
+        <w:t>10.6 Target distillation and post-training ladder</w:t>
+      </w:r>
+    </w:p>
+    <w:p>
+      <w:r>
+        <w:rPr>
+          <w:b w:val="0"/>
+        </w:rPr>
+        <w:t>QLoRA SFT is the first experiment, not the final architecture. Each later stage starts only when the previous stage beats the raw base and strongest frozen baseline on sealed primary gates without protected-domain, safety, latency, or cost regression.</w:t>
+      </w:r>
+    </w:p>
+    <w:p>
+      <w:pPr>
+        <w:pStyle w:val="ListNumber"/>
+        <w:numPr>
+          <w:ilvl w:val="0"/>
+          <w:numId w:val="14"/>
+        </w:numPr>
+      </w:pPr>
+      <w:r>
+        <w:rPr>
+          <w:b/>
+        </w:rPr>
+        <w:t>Raw-base plus retrieval bake-off:</w:t>
+      </w:r>
+      <w:r>
+        <w:rPr>
+          <w:b w:val="0"/>
+        </w:rPr>
+        <w:t xml:space="preserve"> compare unmodified candidates with and without the same retrieval pack so retrieval gains are not misattributed to training.</w:t>
+      </w:r>
+    </w:p>
+    <w:p>
+      <w:pPr>
+        <w:pStyle w:val="ListNumber"/>
+        <w:numPr>
+          <w:ilvl w:val="0"/>
+          <w:numId w:val="14"/>
+        </w:numPr>
+      </w:pPr>
+      <w:r>
+        <w:rPr>
+          <w:b/>
+        </w:rPr>
+        <w:t>Verified SFT:</w:t>
+      </w:r>
+      <w:r>
+        <w:rPr>
+          <w:b w:val="0"/>
+        </w:rPr>
+        <w:t xml:space="preserve"> use reviewed human examples and teacher sequences whose compiler, tests, numerical oracle, citations, or risk checks pass. For MoE students such as gpt-oss, tune the supported expert projections as well as attention when the upstream recipe requires it.</w:t>
+      </w:r>
+    </w:p>
+    <w:p>
+      <w:pPr>
+        <w:pStyle w:val="ListNumber"/>
+        <w:numPr>
+          <w:ilvl w:val="0"/>
+          <w:numId w:val="14"/>
+        </w:numPr>
+      </w:pPr>
+      <w:r>
+        <w:rPr>
+          <w:b/>
+        </w:rPr>
+        <w:t>Preference optimisation:</w:t>
+      </w:r>
+      <w:r>
+        <w:rPr>
+          <w:b w:val="0"/>
+        </w:rPr>
+        <w:t xml:space="preserve"> test DPO first after SFT stability. SimPO, KTO, or another objective is a challenger only when its data assumptions match the reviewed preference records.</w:t>
+      </w:r>
+    </w:p>
+    <w:p>
+      <w:pPr>
+        <w:pStyle w:val="ListNumber"/>
+        <w:numPr>
+          <w:ilvl w:val="0"/>
+          <w:numId w:val="14"/>
+        </w:numPr>
+      </w:pPr>
+      <w:r>
+        <w:rPr>
+          <w:b/>
+        </w:rPr>
+        <w:t>RL with verifiable rewards:</w:t>
+      </w:r>
+      <w:r>
+        <w:rPr>
+          <w:b w:val="0"/>
+        </w:rPr>
+        <w:t xml:space="preserve"> compare RLOO and GRPO on identical tasks. Reward exact outcomes and bounded efficiency; log KL, entropy, group composition, zero-variance groups, response length, and each reward component. Never optimise backtest PnL, Sharpe, or public benchmark rank directly.</w:t>
+      </w:r>
+    </w:p>
+    <w:p>
+      <w:pPr>
+        <w:pStyle w:val="ListNumber"/>
+        <w:numPr>
+          <w:ilvl w:val="0"/>
+          <w:numId w:val="14"/>
+        </w:numPr>
+      </w:pPr>
+      <w:r>
+        <w:rPr>
+          <w:b/>
+        </w:rPr>
+        <w:t>Multi-teacher/on-policy distillation:</w:t>
+      </w:r>
+      <w:r>
+        <w:rPr>
+          <w:b w:val="0"/>
+        </w:rPr>
+        <w:t xml:space="preserve"> route prompts to teachers that passed domain calibration, retain disagreements and provenance, and use student-generated trajectories. Token-level distillation requires authorised teacher probabilities or logits; hosted text is not equivalent.</w:t>
+      </w:r>
+    </w:p>
+    <w:p>
+      <w:pPr>
+        <w:pStyle w:val="ListNumber"/>
+        <w:numPr>
+          <w:ilvl w:val="0"/>
+          <w:numId w:val="14"/>
+        </w:numPr>
+      </w:pPr>
+      <w:r>
+        <w:rPr>
+          <w:b/>
+        </w:rPr>
+        <w:t>Specialists and routing:</w:t>
+      </w:r>
+      <w:r>
+        <w:rPr>
+          <w:b w:val="0"/>
+        </w:rPr>
+        <w:t xml:space="preserve"> isolate C#/architecture, UI, quant/math, risk/portfolio, and research/tool-use adapters at low/high/max effort. Start with rules; accept a learned router only after it improves calibration, cost, abstention, and worst-domain quality.</w:t>
+      </w:r>
+    </w:p>
+    <w:p>
+      <w:pPr>
+        <w:pStyle w:val="ListNumber"/>
+        <w:numPr>
+          <w:ilvl w:val="0"/>
+          <w:numId w:val="14"/>
+        </w:numPr>
+      </w:pPr>
+      <w:r>
+        <w:rPr>
+          <w:b/>
+        </w:rPr>
+        <w:t>Architecture research:</w:t>
+      </w:r>
+      <w:r>
+        <w:rPr>
+          <w:b w:val="0"/>
+        </w:rPr>
+        <w:t xml:space="preserve"> KDA/DeltaNet, sparse attention, Transformer-Mamba hybrids, Attention Residuals, Stable LatentMoE, MTP, early-fusion vision, and Muon variants require controlled pretraining ablations. They are not features that QLoRA can retrofit faithfully.</w:t>
+      </w:r>
+    </w:p>
+    <w:p>
+      <w:r>
+        <w:rPr>
+          <w:b w:val="0"/>
+        </w:rPr>
+        <w:t>Process reward models may improve long-trajectory credit assignment, but they are auxiliary where an executable verifier exists. DAPO, asynchronous RL, and large disaggregated rollout stacks are later pilots after small-scale correctness and reward-hacking audits.</w:t>
       </w:r>
     </w:p>
     <w:p>
@@ -6218,7 +6801,7 @@
         <w:pStyle w:val="ListNumber"/>
         <w:numPr>
           <w:ilvl w:val="0"/>
-          <w:numId w:val="14"/>
+          <w:numId w:val="15"/>
         </w:numPr>
       </w:pPr>
       <w:r>
@@ -6241,7 +6824,7 @@
         <w:pStyle w:val="ListNumber"/>
         <w:numPr>
           <w:ilvl w:val="0"/>
-          <w:numId w:val="14"/>
+          <w:numId w:val="15"/>
         </w:numPr>
       </w:pPr>
       <w:r>
@@ -6264,7 +6847,7 @@
         <w:pStyle w:val="ListNumber"/>
         <w:numPr>
           <w:ilvl w:val="0"/>
-          <w:numId w:val="14"/>
+          <w:numId w:val="15"/>
         </w:numPr>
       </w:pPr>
       <w:r>
@@ -6287,7 +6870,7 @@
         <w:pStyle w:val="ListNumber"/>
         <w:numPr>
           <w:ilvl w:val="0"/>
-          <w:numId w:val="14"/>
+          <w:numId w:val="15"/>
         </w:numPr>
       </w:pPr>
       <w:r>
@@ -6310,7 +6893,7 @@
         <w:pStyle w:val="ListNumber"/>
         <w:numPr>
           <w:ilvl w:val="0"/>
-          <w:numId w:val="14"/>
+          <w:numId w:val="15"/>
         </w:numPr>
       </w:pPr>
       <w:r>
@@ -6333,7 +6916,7 @@
         <w:pStyle w:val="ListNumber"/>
         <w:numPr>
           <w:ilvl w:val="0"/>
-          <w:numId w:val="14"/>
+          <w:numId w:val="15"/>
         </w:numPr>
       </w:pPr>
       <w:r>
@@ -7160,7 +7743,7 @@
         <w:pStyle w:val="ListNumber"/>
         <w:numPr>
           <w:ilvl w:val="0"/>
-          <w:numId w:val="15"/>
+          <w:numId w:val="16"/>
         </w:numPr>
       </w:pPr>
       <w:r>
@@ -7181,7 +7764,7 @@
         <w:pStyle w:val="ListNumber"/>
         <w:numPr>
           <w:ilvl w:val="0"/>
-          <w:numId w:val="15"/>
+          <w:numId w:val="16"/>
         </w:numPr>
       </w:pPr>
       <w:r>
@@ -7196,7 +7779,7 @@
         <w:pStyle w:val="ListNumber"/>
         <w:numPr>
           <w:ilvl w:val="0"/>
-          <w:numId w:val="15"/>
+          <w:numId w:val="16"/>
         </w:numPr>
       </w:pPr>
       <w:r>
@@ -7241,7 +7824,64 @@
         <w:pStyle w:val="Heading1"/>
       </w:pPr>
       <w:r>
-        <w:t>15. Kimi K3 research adoption</w:t>
+        <w:t>15. Frontier model architecture and Kimi K3 adoption</w:t>
+      </w:r>
+    </w:p>
+    <w:p>
+      <w:pPr>
+        <w:keepLines/>
+        <w:jc w:val="center"/>
+      </w:pPr>
+      <w:r>
+        <w:drawing>
+          <wp:inline xmlns:a="http://schemas.openxmlformats.org/drawingml/2006/main" xmlns:pic="http://schemas.openxmlformats.org/drawingml/2006/picture">
+            <wp:extent cx="5806440" cy="3887089"/>
+            <wp:docPr id="5" name="Picture 5" descr="Hyperion frontier model factory" title="Hyperion frontier model factory"/>
+            <wp:cNvGraphicFramePr>
+              <a:graphicFrameLocks noChangeAspect="1"/>
+            </wp:cNvGraphicFramePr>
+            <a:graphic>
+              <a:graphicData uri="http://schemas.openxmlformats.org/drawingml/2006/picture">
+                <pic:pic>
+                  <pic:nvPicPr>
+                    <pic:cNvPr id="0" name="hyperion-frontier-model-factory.png"/>
+                    <pic:cNvPicPr/>
+                  </pic:nvPicPr>
+                  <pic:blipFill>
+                    <a:blip r:embed="rId15"/>
+                    <a:stretch>
+                      <a:fillRect/>
+                    </a:stretch>
+                  </pic:blipFill>
+                  <pic:spPr>
+                    <a:xfrm>
+                      <a:off x="0" y="0"/>
+                      <a:ext cx="5806440" cy="3887089"/>
+                    </a:xfrm>
+                    <a:prstGeom prst="rect"/>
+                  </pic:spPr>
+                </pic:pic>
+              </a:graphicData>
+            </a:graphic>
+          </wp:inline>
+        </w:drawing>
+      </w:r>
+    </w:p>
+    <w:p>
+      <w:pPr>
+        <w:pStyle w:val="FigureCaption"/>
+        <w:jc w:val="center"/>
+      </w:pPr>
+      <w:r>
+        <w:t>Figure 4. Hyperion frontier model factory</w:t>
+      </w:r>
+    </w:p>
+    <w:p>
+      <w:r>
+        <w:rPr>
+          <w:b w:val="0"/>
+        </w:rPr>
+        <w:t>Hyperion's target is a governed portfolio rather than a single winner: hosted frontier teachers, large downloadable teachers, small-cluster students, domain/effort adapters, critics, judges, routers, embeddings, and rerankers all sit behind one evidence protocol. Kimi K3 is an important source of architecture and agent-training ideas inside that portfolio, not the only design input.</w:t>
       </w:r>
     </w:p>
     <w:p>
@@ -7906,7 +8546,7 @@
         <w:pStyle w:val="Heading2"/>
       </w:pPr>
       <w:r>
-        <w:t>15.4 Research only</w:t>
+        <w:t>15.4 Pretraining research tracks</w:t>
       </w:r>
     </w:p>
     <w:p>
@@ -7938,37 +8578,692 @@
         <w:pStyle w:val="Heading2"/>
       </w:pPr>
       <w:r>
-        <w:t>15.5 Licence boundary</w:t>
-      </w:r>
-    </w:p>
-    <w:p>
-      <w:r>
-        <w:rPr>
-          <w:b w:val="0"/>
-        </w:rPr>
-        <w:t xml:space="preserve">Kimi K3 uses a custom Kimi K3 License identified as </w:t>
-      </w:r>
-      <w:r>
-        <w:rPr>
-          <w:rFonts w:ascii="Consolas" w:hAnsi="Consolas"/>
-          <w:color w:val="1F4D78"/>
-          <w:sz w:val="17"/>
-        </w:rPr>
-        <w:t>other</w:t>
-      </w:r>
-      <w:r>
-        <w:rPr>
-          <w:b w:val="0"/>
-        </w:rPr>
-        <w:t xml:space="preserve"> on the reviewed model card, not a standard OSI/permissive licence. The reviewed text requires notice retention; a separate Moonshot agreement for a qualifying Model-as-a-Service business and affiliates above US$20 million aggregate revenue in any consecutive 12 months; and prominent “Kimi K3” attribution for commercial products above stated monthly-active-user or revenue thresholds. Defined internal use and access through official/certified providers have specified exceptions. Counsel must review the current exact licence before any weight, derivative, hosting, or commercial use.</w:t>
-      </w:r>
-    </w:p>
-    <w:p>
-      <w:r>
-        <w:rPr>
-          <w:b w:val="0"/>
-        </w:rPr>
-        <w:t>No Kimi code, weights, training data, prompt traces, or outputs were copied into Hyperion. The paper does not publish the complete pretraining/RL corpora, total tokens/FLOPs, full GPU schedule, or a reproducible end-to-end recipe; all performance and architecture claims remain source claims until independently reproduced.</w:t>
+        <w:t>15.5 Permission-managed access and reproducibility</w:t>
+      </w:r>
+    </w:p>
+    <w:p>
+      <w:r>
+        <w:rPr>
+          <w:b w:val="0"/>
+        </w:rPr>
+        <w:t>Kimi K3's custom licence, any paid or gated model, and any separately negotiated research/service access are acquisition records rather than architecture exclusions. The accountable user or delegated operator owns account, payment, permission, attribution, renewal, and contractual review. The registry preserves the exact source/revision, acquired bytes, price/terms snapshot, permission owner, data-retention policy, and allowed Hyperion roles so experiments remain reproducible and can be revoked or replaced. A technically superior candidate stays eligible when required permission has been obtained.</w:t>
+      </w:r>
+    </w:p>
+    <w:p>
+      <w:r>
+        <w:rPr>
+          <w:b w:val="0"/>
+        </w:rPr>
+        <w:t>Hyperion still does not bypass access controls, copy undisclosed private material, or infer closed architecture details from benchmark scores. Kimi K3's report does not publish the complete pretraining/RL corpora, total tokens/FLOPs, full GPU schedule, or a reproducible end-to-end recipe; all performance and architecture claims remain source claims until independently reproduced. No Kimi code, weights, training data, prompt traces, or outputs were copied by this architecture review.</w:t>
+      </w:r>
+    </w:p>
+    <w:p>
+      <w:pPr>
+        <w:pStyle w:val="Heading2"/>
+      </w:pPr>
+      <w:r>
+        <w:t>15.6 Cross-family architecture decisions</w:t>
+      </w:r>
+    </w:p>
+    <w:p>
+      <w:r>
+        <w:rPr>
+          <w:b w:val="0"/>
+        </w:rPr>
+        <w:t>The source review includes GPT-5.6, gpt-oss, Kimi K3, Qwen3/Qwen3-Coder/Qwen3.5, DeepSeek V3/R1, GLM-5/5.2, Llama 4, Gemini 3.1 Pro, Claude Fable 5, MiniMax-M2.5, Devstral Small 2, and Falcon-H1. Closed models expose useful service capabilities but not reproducible internals. Open/downloadable models can be exact local teachers or students after snapshot/runtime validation.</w:t>
+      </w:r>
+    </w:p>
+    <w:tbl>
+      <w:tblPr>
+        <w:tblStyle w:val="TableGrid"/>
+        <w:tblW w:type="dxa" w:w="9360"/>
+        <w:jc w:val="center"/>
+        <w:tblLayout w:type="fixed"/>
+        <w:tblLook w:firstColumn="1" w:firstRow="1" w:lastColumn="0" w:lastRow="0" w:noHBand="0" w:noVBand="1" w:val="04A0"/>
+        <w:tblLayout w:type="fixed"/>
+        <w:tblInd w:w="120" w:type="dxa"/>
+        <w:tblCellMar>
+          <w:top w:w="80" w:type="dxa"/>
+          <w:bottom w:w="80" w:type="dxa"/>
+          <w:start w:w="120" w:type="dxa"/>
+          <w:end w:w="120" w:type="dxa"/>
+        </w:tblCellMar>
+      </w:tblPr>
+      <w:tblGrid>
+        <w:gridCol w:w="3120"/>
+        <w:gridCol w:w="3120"/>
+        <w:gridCol w:w="3120"/>
+      </w:tblGrid>
+      <w:tr>
+        <w:trPr>
+          <w:tblHeader w:val="true"/>
+          <w:cantSplit/>
+        </w:trPr>
+        <w:tc>
+          <w:tcPr>
+            <w:tcW w:type="dxa" w:w="3120"/>
+            <w:shd w:fill="E8EEF5"/>
+            <w:tcFitText/>
+            <w:vAlign w:val="top"/>
+          </w:tcPr>
+          <w:p>
+            <w:pPr>
+              <w:spacing w:after="40" w:line="259" w:lineRule="auto"/>
+            </w:pPr>
+            <w:r>
+              <w:rPr>
+                <w:b/>
+                <w:sz w:val="16"/>
+              </w:rPr>
+              <w:t>Mechanism</w:t>
+            </w:r>
+          </w:p>
+        </w:tc>
+        <w:tc>
+          <w:tcPr>
+            <w:tcW w:type="dxa" w:w="3120"/>
+            <w:shd w:fill="E8EEF5"/>
+            <w:tcFitText/>
+            <w:vAlign w:val="top"/>
+          </w:tcPr>
+          <w:p>
+            <w:pPr>
+              <w:spacing w:after="40" w:line="259" w:lineRule="auto"/>
+            </w:pPr>
+            <w:r>
+              <w:rPr>
+                <w:b/>
+                <w:sz w:val="16"/>
+              </w:rPr>
+              <w:t>Target use</w:t>
+            </w:r>
+          </w:p>
+        </w:tc>
+        <w:tc>
+          <w:tcPr>
+            <w:tcW w:type="dxa" w:w="3120"/>
+            <w:shd w:fill="E8EEF5"/>
+            <w:tcFitText/>
+            <w:vAlign w:val="top"/>
+          </w:tcPr>
+          <w:p>
+            <w:pPr>
+              <w:spacing w:after="40" w:line="259" w:lineRule="auto"/>
+            </w:pPr>
+            <w:r>
+              <w:rPr>
+                <w:b/>
+                <w:sz w:val="16"/>
+              </w:rPr>
+              <w:t>Adoption gate</w:t>
+            </w:r>
+          </w:p>
+        </w:tc>
+      </w:tr>
+      <w:tr>
+        <w:trPr>
+          <w:cantSplit/>
+        </w:trPr>
+        <w:tc>
+          <w:tcPr>
+            <w:tcW w:type="dxa" w:w="3120"/>
+            <w:vAlign w:val="top"/>
+          </w:tcPr>
+          <w:p>
+            <w:pPr>
+              <w:spacing w:after="40" w:line="259" w:lineRule="auto"/>
+            </w:pPr>
+            <w:r>
+              <w:rPr>
+                <w:b w:val="0"/>
+                <w:sz w:val="16"/>
+              </w:rPr>
+              <w:t>Dense decoder</w:t>
+            </w:r>
+          </w:p>
+        </w:tc>
+        <w:tc>
+          <w:tcPr>
+            <w:tcW w:type="dxa" w:w="3120"/>
+            <w:vAlign w:val="top"/>
+          </w:tcPr>
+          <w:p>
+            <w:pPr>
+              <w:spacing w:after="40" w:line="259" w:lineRule="auto"/>
+            </w:pPr>
+            <w:r>
+              <w:rPr>
+                <w:b w:val="0"/>
+                <w:sz w:val="16"/>
+              </w:rPr>
+              <w:t>Simplest student/training/serving baseline</w:t>
+            </w:r>
+          </w:p>
+        </w:tc>
+        <w:tc>
+          <w:tcPr>
+            <w:tcW w:type="dxa" w:w="3120"/>
+            <w:vAlign w:val="top"/>
+          </w:tcPr>
+          <w:p>
+            <w:pPr>
+              <w:spacing w:after="40" w:line="259" w:lineRule="auto"/>
+            </w:pPr>
+            <w:r>
+              <w:rPr>
+                <w:b w:val="0"/>
+                <w:sz w:val="16"/>
+              </w:rPr>
+              <w:t>Keep one dense baseline in every bake-off</w:t>
+            </w:r>
+          </w:p>
+        </w:tc>
+      </w:tr>
+      <w:tr>
+        <w:trPr>
+          <w:cantSplit/>
+        </w:trPr>
+        <w:tc>
+          <w:tcPr>
+            <w:tcW w:type="dxa" w:w="3120"/>
+            <w:vAlign w:val="top"/>
+          </w:tcPr>
+          <w:p>
+            <w:pPr>
+              <w:spacing w:after="40" w:line="259" w:lineRule="auto"/>
+            </w:pPr>
+            <w:r>
+              <w:rPr>
+                <w:b w:val="0"/>
+                <w:sz w:val="16"/>
+              </w:rPr>
+              <w:t>Sparse MoE</w:t>
+            </w:r>
+          </w:p>
+        </w:tc>
+        <w:tc>
+          <w:tcPr>
+            <w:tcW w:type="dxa" w:w="3120"/>
+            <w:vAlign w:val="top"/>
+          </w:tcPr>
+          <w:p>
+            <w:pPr>
+              <w:spacing w:after="40" w:line="259" w:lineRule="auto"/>
+            </w:pPr>
+            <w:r>
+              <w:rPr>
+                <w:b w:val="0"/>
+                <w:sz w:val="16"/>
+              </w:rPr>
+              <w:t>More capacity per active FLOP</w:t>
+            </w:r>
+          </w:p>
+        </w:tc>
+        <w:tc>
+          <w:tcPr>
+            <w:tcW w:type="dxa" w:w="3120"/>
+            <w:vAlign w:val="top"/>
+          </w:tcPr>
+          <w:p>
+            <w:pPr>
+              <w:spacing w:after="40" w:line="259" w:lineRule="auto"/>
+            </w:pPr>
+            <w:r>
+              <w:rPr>
+                <w:b w:val="0"/>
+                <w:sz w:val="16"/>
+              </w:rPr>
+              <w:t>Existing active-sparse bases first; measure routing, expert use, all-to-all, quality per joule</w:t>
+            </w:r>
+          </w:p>
+        </w:tc>
+      </w:tr>
+      <w:tr>
+        <w:trPr>
+          <w:cantSplit/>
+        </w:trPr>
+        <w:tc>
+          <w:tcPr>
+            <w:tcW w:type="dxa" w:w="3120"/>
+            <w:vAlign w:val="top"/>
+          </w:tcPr>
+          <w:p>
+            <w:pPr>
+              <w:spacing w:after="40" w:line="259" w:lineRule="auto"/>
+            </w:pPr>
+            <w:r>
+              <w:rPr>
+                <w:b w:val="0"/>
+                <w:sz w:val="16"/>
+              </w:rPr>
+              <w:t>GQA/MLA/latent KV</w:t>
+            </w:r>
+          </w:p>
+        </w:tc>
+        <w:tc>
+          <w:tcPr>
+            <w:tcW w:type="dxa" w:w="3120"/>
+            <w:vAlign w:val="top"/>
+          </w:tcPr>
+          <w:p>
+            <w:pPr>
+              <w:spacing w:after="40" w:line="259" w:lineRule="auto"/>
+            </w:pPr>
+            <w:r>
+              <w:rPr>
+                <w:b w:val="0"/>
+                <w:sz w:val="16"/>
+              </w:rPr>
+              <w:t>Lower KV memory and long-context cost</w:t>
+            </w:r>
+          </w:p>
+        </w:tc>
+        <w:tc>
+          <w:tcPr>
+            <w:tcW w:type="dxa" w:w="3120"/>
+            <w:vAlign w:val="top"/>
+          </w:tcPr>
+          <w:p>
+            <w:pPr>
+              <w:spacing w:after="40" w:line="259" w:lineRule="auto"/>
+            </w:pPr>
+            <w:r>
+              <w:rPr>
+                <w:b w:val="0"/>
+                <w:sz w:val="16"/>
+              </w:rPr>
+              <w:t>Upstream-supported implementation plus memory/latency/quality curves</w:t>
+            </w:r>
+          </w:p>
+        </w:tc>
+      </w:tr>
+      <w:tr>
+        <w:trPr>
+          <w:cantSplit/>
+        </w:trPr>
+        <w:tc>
+          <w:tcPr>
+            <w:tcW w:type="dxa" w:w="3120"/>
+            <w:vAlign w:val="top"/>
+          </w:tcPr>
+          <w:p>
+            <w:pPr>
+              <w:spacing w:after="40" w:line="259" w:lineRule="auto"/>
+            </w:pPr>
+            <w:r>
+              <w:rPr>
+                <w:b w:val="0"/>
+                <w:sz w:val="16"/>
+              </w:rPr>
+              <w:t>Sparse attention/IndexShare</w:t>
+            </w:r>
+          </w:p>
+        </w:tc>
+        <w:tc>
+          <w:tcPr>
+            <w:tcW w:type="dxa" w:w="3120"/>
+            <w:vAlign w:val="top"/>
+          </w:tcPr>
+          <w:p>
+            <w:pPr>
+              <w:spacing w:after="40" w:line="259" w:lineRule="auto"/>
+            </w:pPr>
+            <w:r>
+              <w:rPr>
+                <w:b w:val="0"/>
+                <w:sz w:val="16"/>
+              </w:rPr>
+              <w:t>Lower very-long-context compute</w:t>
+            </w:r>
+          </w:p>
+        </w:tc>
+        <w:tc>
+          <w:tcPr>
+            <w:tcW w:type="dxa" w:w="3120"/>
+            <w:vAlign w:val="top"/>
+          </w:tcPr>
+          <w:p>
+            <w:pPr>
+              <w:spacing w:after="40" w:line="259" w:lineRule="auto"/>
+            </w:pPr>
+            <w:r>
+              <w:rPr>
+                <w:b w:val="0"/>
+                <w:sz w:val="16"/>
+              </w:rPr>
+              <w:t>Research until implementation and length-stratified evidence are reproducible</w:t>
+            </w:r>
+          </w:p>
+        </w:tc>
+      </w:tr>
+      <w:tr>
+        <w:trPr>
+          <w:cantSplit/>
+        </w:trPr>
+        <w:tc>
+          <w:tcPr>
+            <w:tcW w:type="dxa" w:w="3120"/>
+            <w:vAlign w:val="top"/>
+          </w:tcPr>
+          <w:p>
+            <w:pPr>
+              <w:spacing w:after="40" w:line="259" w:lineRule="auto"/>
+            </w:pPr>
+            <w:r>
+              <w:rPr>
+                <w:b w:val="0"/>
+                <w:sz w:val="16"/>
+              </w:rPr>
+              <w:t>DeltaNet/KDA or Transformer-Mamba hybrid</w:t>
+            </w:r>
+          </w:p>
+        </w:tc>
+        <w:tc>
+          <w:tcPr>
+            <w:tcW w:type="dxa" w:w="3120"/>
+            <w:vAlign w:val="top"/>
+          </w:tcPr>
+          <w:p>
+            <w:pPr>
+              <w:spacing w:after="40" w:line="259" w:lineRule="auto"/>
+            </w:pPr>
+            <w:r>
+              <w:rPr>
+                <w:b w:val="0"/>
+                <w:sz w:val="16"/>
+              </w:rPr>
+              <w:t>Linear/recurrent long-context path with selective attention</w:t>
+            </w:r>
+          </w:p>
+        </w:tc>
+        <w:tc>
+          <w:tcPr>
+            <w:tcW w:type="dxa" w:w="3120"/>
+            <w:vAlign w:val="top"/>
+          </w:tcPr>
+          <w:p>
+            <w:pPr>
+              <w:spacing w:after="40" w:line="259" w:lineRule="auto"/>
+            </w:pPr>
+            <w:r>
+              <w:rPr>
+                <w:b w:val="0"/>
+                <w:sz w:val="16"/>
+              </w:rPr>
+              <w:t>Equal-compute small pretraining or Falcon-H1 challenger evaluation</w:t>
+            </w:r>
+          </w:p>
+        </w:tc>
+      </w:tr>
+      <w:tr>
+        <w:trPr>
+          <w:cantSplit/>
+        </w:trPr>
+        <w:tc>
+          <w:tcPr>
+            <w:tcW w:type="dxa" w:w="3120"/>
+            <w:vAlign w:val="top"/>
+          </w:tcPr>
+          <w:p>
+            <w:pPr>
+              <w:spacing w:after="40" w:line="259" w:lineRule="auto"/>
+            </w:pPr>
+            <w:r>
+              <w:rPr>
+                <w:b w:val="0"/>
+                <w:sz w:val="16"/>
+              </w:rPr>
+              <w:t>MTP/speculative heads</w:t>
+            </w:r>
+          </w:p>
+        </w:tc>
+        <w:tc>
+          <w:tcPr>
+            <w:tcW w:type="dxa" w:w="3120"/>
+            <w:vAlign w:val="top"/>
+          </w:tcPr>
+          <w:p>
+            <w:pPr>
+              <w:spacing w:after="40" w:line="259" w:lineRule="auto"/>
+            </w:pPr>
+            <w:r>
+              <w:rPr>
+                <w:b w:val="0"/>
+                <w:sz w:val="16"/>
+              </w:rPr>
+              <w:t>Extra training signal and faster decoding opportunity</w:t>
+            </w:r>
+          </w:p>
+        </w:tc>
+        <w:tc>
+          <w:tcPr>
+            <w:tcW w:type="dxa" w:w="3120"/>
+            <w:vAlign w:val="top"/>
+          </w:tcPr>
+          <w:p>
+            <w:pPr>
+              <w:spacing w:after="40" w:line="259" w:lineRule="auto"/>
+            </w:pPr>
+            <w:r>
+              <w:rPr>
+                <w:b w:val="0"/>
+                <w:sz w:val="16"/>
+              </w:rPr>
+              <w:t>Exact runtime support, acceptance, output parity, and tail-latency proof</w:t>
+            </w:r>
+          </w:p>
+        </w:tc>
+      </w:tr>
+      <w:tr>
+        <w:trPr>
+          <w:cantSplit/>
+        </w:trPr>
+        <w:tc>
+          <w:tcPr>
+            <w:tcW w:type="dxa" w:w="3120"/>
+            <w:vAlign w:val="top"/>
+          </w:tcPr>
+          <w:p>
+            <w:pPr>
+              <w:spacing w:after="40" w:line="259" w:lineRule="auto"/>
+            </w:pPr>
+            <w:r>
+              <w:rPr>
+                <w:b w:val="0"/>
+                <w:sz w:val="16"/>
+              </w:rPr>
+              <w:t>Native multimodality</w:t>
+            </w:r>
+          </w:p>
+        </w:tc>
+        <w:tc>
+          <w:tcPr>
+            <w:tcW w:type="dxa" w:w="3120"/>
+            <w:vAlign w:val="top"/>
+          </w:tcPr>
+          <w:p>
+            <w:pPr>
+              <w:spacing w:after="40" w:line="259" w:lineRule="auto"/>
+            </w:pPr>
+            <w:r>
+              <w:rPr>
+                <w:b w:val="0"/>
+                <w:sz w:val="16"/>
+              </w:rPr>
+              <w:t>UI screenshots, charts, PDFs, and repository reasoning</w:t>
+            </w:r>
+          </w:p>
+        </w:tc>
+        <w:tc>
+          <w:tcPr>
+            <w:tcW w:type="dxa" w:w="3120"/>
+            <w:vAlign w:val="top"/>
+          </w:tcPr>
+          <w:p>
+            <w:pPr>
+              <w:spacing w:after="40" w:line="259" w:lineRule="auto"/>
+            </w:pPr>
+            <w:r>
+              <w:rPr>
+                <w:b w:val="0"/>
+                <w:sz w:val="16"/>
+              </w:rPr>
+              <w:t>Hosted/large teacher first; sealed modality/privacy tests before student training</w:t>
+            </w:r>
+          </w:p>
+        </w:tc>
+      </w:tr>
+      <w:tr>
+        <w:trPr>
+          <w:cantSplit/>
+        </w:trPr>
+        <w:tc>
+          <w:tcPr>
+            <w:tcW w:type="dxa" w:w="3120"/>
+            <w:vAlign w:val="top"/>
+          </w:tcPr>
+          <w:p>
+            <w:pPr>
+              <w:spacing w:after="40" w:line="259" w:lineRule="auto"/>
+            </w:pPr>
+            <w:r>
+              <w:rPr>
+                <w:b w:val="0"/>
+                <w:sz w:val="16"/>
+              </w:rPr>
+              <w:t>FP8/MXFP4/MXFP8/QAT</w:t>
+            </w:r>
+          </w:p>
+        </w:tc>
+        <w:tc>
+          <w:tcPr>
+            <w:tcW w:type="dxa" w:w="3120"/>
+            <w:vAlign w:val="top"/>
+          </w:tcPr>
+          <w:p>
+            <w:pPr>
+              <w:spacing w:after="40" w:line="259" w:lineRule="auto"/>
+            </w:pPr>
+            <w:r>
+              <w:rPr>
+                <w:b w:val="0"/>
+                <w:sz w:val="16"/>
+              </w:rPr>
+              <w:t>Lower training/serving memory and cost</w:t>
+            </w:r>
+          </w:p>
+        </w:tc>
+        <w:tc>
+          <w:tcPr>
+            <w:tcW w:type="dxa" w:w="3120"/>
+            <w:vAlign w:val="top"/>
+          </w:tcPr>
+          <w:p>
+            <w:pPr>
+              <w:spacing w:after="40" w:line="259" w:lineRule="auto"/>
+            </w:pPr>
+            <w:r>
+              <w:rPr>
+                <w:b w:val="0"/>
+                <w:sz w:val="16"/>
+              </w:rPr>
+              <w:t>Separate promoted artifact with verifier parity and rollback</w:t>
+            </w:r>
+          </w:p>
+        </w:tc>
+      </w:tr>
+    </w:tbl>
+    <w:p>
+      <w:pPr>
+        <w:spacing w:after="40"/>
+      </w:pPr>
+    </w:p>
+    <w:p>
+      <w:r>
+        <w:rPr>
+          <w:b w:val="0"/>
+        </w:rPr>
+        <w:t>Reported million-token or multi-million-token windows are capacity claims, not proof that a model uses distant evidence correctly. Hyperion extends context only after shorter tasks are stable and tests retrieval dependency, recall position, distractors, memory, latency, and short-context non-regression.</w:t>
+      </w:r>
+    </w:p>
+    <w:p>
+      <w:pPr>
+        <w:pStyle w:val="Heading2"/>
+      </w:pPr>
+      <w:r>
+        <w:t>15.7 Target coordinator and agent runtime</w:t>
+      </w:r>
+    </w:p>
+    <w:p>
+      <w:r>
+        <w:rPr>
+          <w:b w:val="0"/>
+        </w:rPr>
+        <w:t>The implemented five-role workflow remains the safe baseline. The target runtime permits a bounded typed graph of planner, retriever/researcher, architect or quant analyst, coder/UI specialist, executor/tester, critic, risk judge, synthesizer, and human releaser. The deterministic controller—not the model—owns role schemas, graph width/depth, requests, tokens, tools, elapsed time, cost, artifacts, retry limits, approvals, and terminal states.</w:t>
+      </w:r>
+    </w:p>
+    <w:p>
+      <w:r>
+        <w:rPr>
+          <w:b w:val="0"/>
+        </w:rPr>
+        <w:t>Every trajectory event binds observation, role, model/adapter/effort, prompt or state hash, visible response, tool call/result, environment and verifier revisions, latency, tokens/cost, and terminal outcome. The controller can resume an explicit interrupted state and can run independent specialists in parallel, but a model cannot invent a role, tool, endpoint, credential, permission, or budget.</w:t>
+      </w:r>
+    </w:p>
+    <w:p>
+      <w:r>
+        <w:rPr>
+          <w:b w:val="0"/>
+        </w:rPr>
+        <w:t>Routing considers domain, difficulty, modality, context, tool need, data/privacy class, latency, credit budget, calibrated model quality, availability, and live queue/KV pressure. It freezes model, adapter, effort, sampling, retrieval, and fallback before charging. Low confidence or high risk routes to a stronger independent model or human review; it never routes around policy or readiness.</w:t>
+      </w:r>
+    </w:p>
+    <w:p>
+      <w:pPr>
+        <w:pStyle w:val="Heading2"/>
+      </w:pPr>
+      <w:r>
+        <w:t>15.8 Evaluation and promotion scorecard</w:t>
+      </w:r>
+    </w:p>
+    <w:p>
+      <w:r>
+        <w:rPr>
+          <w:b w:val="0"/>
+        </w:rPr>
+        <w:t>The target scorecard combines compile/test/numeric/risk correctness; source grounding; mutation and scaffold robustness; uncertainty calibration and abstention; tool schema/state/recovery; forbidden capability attempts; latency percentiles; tokens/tool calls; GPU seconds, energy and memory; credit cost; and human review burden. Report pass@1 and pass@k plus paired uncertainty. Public SWE-bench, LiveCodeBench, IFEval, HELM, tau-bench, ToolSandbox, WebArena, and OSWorld lanes are diagnostic; promotion uses a sealed Hyperion-domain suite with exact prompt, tool, environment, budget, sampling, and verifier identities.</w:t>
+      </w:r>
+    </w:p>
+    <w:p>
+      <w:r>
+        <w:rPr>
+          <w:b w:val="0"/>
+        </w:rPr>
+        <w:t>One candidate must beat the raw base and strongest promoted baseline on predeclared primary gates, stay within non-inferiority margins on every protected domain, survive contamination and reward-hacking audit, satisfy efficiency/capacity budgets, and pass independent replay plus human review. Activation binds the exact model, adapter, quantization, tokenizer/template, engine, image, arguments, policy, retrieval release, and report. Vendor benchmark tables never substitute for this.</w:t>
+      </w:r>
+    </w:p>
+    <w:p>
+      <w:pPr>
+        <w:pStyle w:val="Heading2"/>
+      </w:pPr>
+      <w:r>
+        <w:t>15.9 Target inference fabric</w:t>
+      </w:r>
+    </w:p>
+    <w:p>
+      <w:r>
+        <w:rPr>
+          <w:b w:val="0"/>
+        </w:rPr>
+        <w:t>Use an engine-neutral gateway with vLLM as the first self-hosted baseline, SGLang as the prefix/cache/structured-agent challenger, TensorRT-LLM after an NVIDIA model and quantization profile stabilises, and llama.cpp/CPU as an optional development or edge lane. Pin images, commits, model revisions, templates, arguments, and quantized artifacts.</w:t>
+      </w:r>
+    </w:p>
+    <w:p>
+      <w:r>
+        <w:rPr>
+          <w:b w:val="0"/>
+        </w:rPr>
+        <w:t>Continuous batching, chunked prefill, structured decoding, tenant-safe prefix/KV caches, streaming, cancellation, overload, and canary/rollback are gateway responsibilities. Benchmark speculative decoding, Medusa/EAGLE, disaggregated prefill/decode, AWQ/GPTQ/SmoothQuant, FP8, or MXFP only on real Hyperion traffic; require output/verifier parity, acceptance, memory, throughput, and tail-latency evidence. Unsupported provider fields fail closed rather than silently changing semantics.</w:t>
       </w:r>
     </w:p>
     <w:p>
@@ -7988,7 +9283,7 @@
         <w:drawing>
           <wp:inline xmlns:a="http://schemas.openxmlformats.org/drawingml/2006/main" xmlns:pic="http://schemas.openxmlformats.org/drawingml/2006/picture">
             <wp:extent cx="5806440" cy="3354832"/>
-            <wp:docPr id="5" name="Picture 5" descr="Proposed Hyperion small-GPU-cluster topology" title="Proposed Hyperion small-GPU-cluster topology"/>
+            <wp:docPr id="6" name="Picture 6" descr="Proposed Hyperion small-GPU-cluster topology" title="Proposed Hyperion small-GPU-cluster topology"/>
             <wp:cNvGraphicFramePr>
               <a:graphicFrameLocks noChangeAspect="1"/>
             </wp:cNvGraphicFramePr>
@@ -8000,7 +9295,7 @@
                     <pic:cNvPicPr/>
                   </pic:nvPicPr>
                   <pic:blipFill>
-                    <a:blip r:embed="rId15"/>
+                    <a:blip r:embed="rId16"/>
                     <a:stretch>
                       <a:fillRect/>
                     </a:stretch>
@@ -8025,7 +9320,7 @@
         <w:jc w:val="center"/>
       </w:pPr>
       <w:r>
-        <w:t>Figure 4. Proposed Hyperion small-GPU-cluster topology</w:t>
+        <w:t>Figure 5. Proposed Hyperion small-GPU-cluster topology</w:t>
       </w:r>
     </w:p>
     <w:p>
@@ -8402,7 +9697,18 @@
         <w:rPr>
           <w:b w:val="0"/>
         </w:rPr>
-        <w:t>Prefer at least 10/25 GbE for model/data distribution and artifact collection; measure before assuming distributed-training viability. RDMA/NVLink benefits must be proven on the chosen stack.</w:t>
+        <w:t>Use 10 GbE only for management, model/data distribution, artifact collection, and independent single-node jobs; it is not a distributed-training fabric.</w:t>
+      </w:r>
+    </w:p>
+    <w:p>
+      <w:pPr>
+        <w:pStyle w:val="ListBullet"/>
+      </w:pPr>
+      <w:r>
+        <w:rPr>
+          <w:b w:val="0"/>
+        </w:rPr>
+        <w:t>Require measured 25 GbE or faster for any cross-node collective, and prefer qualified 100 GbE/RDMA for Tier C or sustained model/expert parallel work. Enable RDMA/RoCE/InfiniBand only after fabric, MTU, congestion, isolation, and failure tests; prove NVLink benefits on the chosen stack.</w:t>
       </w:r>
     </w:p>
     <w:p>
@@ -8459,7 +9765,7 @@
         <w:pStyle w:val="ListNumber"/>
         <w:numPr>
           <w:ilvl w:val="0"/>
-          <w:numId w:val="16"/>
+          <w:numId w:val="17"/>
         </w:numPr>
       </w:pPr>
       <w:r>
@@ -8474,7 +9780,7 @@
         <w:pStyle w:val="ListNumber"/>
         <w:numPr>
           <w:ilvl w:val="0"/>
-          <w:numId w:val="16"/>
+          <w:numId w:val="17"/>
         </w:numPr>
       </w:pPr>
       <w:r>
@@ -8489,7 +9795,7 @@
         <w:pStyle w:val="ListNumber"/>
         <w:numPr>
           <w:ilvl w:val="0"/>
-          <w:numId w:val="16"/>
+          <w:numId w:val="17"/>
         </w:numPr>
       </w:pPr>
       <w:r>
@@ -8504,7 +9810,7 @@
         <w:pStyle w:val="ListNumber"/>
         <w:numPr>
           <w:ilvl w:val="0"/>
-          <w:numId w:val="16"/>
+          <w:numId w:val="17"/>
         </w:numPr>
       </w:pPr>
       <w:r>
@@ -8519,7 +9825,7 @@
         <w:pStyle w:val="ListNumber"/>
         <w:numPr>
           <w:ilvl w:val="0"/>
-          <w:numId w:val="16"/>
+          <w:numId w:val="17"/>
         </w:numPr>
       </w:pPr>
       <w:r>
@@ -8534,7 +9840,7 @@
         <w:pStyle w:val="ListNumber"/>
         <w:numPr>
           <w:ilvl w:val="0"/>
-          <w:numId w:val="16"/>
+          <w:numId w:val="17"/>
         </w:numPr>
       </w:pPr>
       <w:r>
@@ -8549,7 +9855,7 @@
         <w:pStyle w:val="ListNumber"/>
         <w:numPr>
           <w:ilvl w:val="0"/>
-          <w:numId w:val="16"/>
+          <w:numId w:val="17"/>
         </w:numPr>
       </w:pPr>
       <w:r>
@@ -8564,7 +9870,7 @@
         <w:pStyle w:val="ListNumber"/>
         <w:numPr>
           <w:ilvl w:val="0"/>
-          <w:numId w:val="16"/>
+          <w:numId w:val="17"/>
         </w:numPr>
       </w:pPr>
       <w:r>
@@ -8596,6 +9902,328 @@
           <w:b w:val="0"/>
         </w:rPr>
         <w:t>Training workers should not hold promotion, review, or deployment keys. Evaluation workers should not write the training corpus. Verifier workers should not receive sealed expected answers or model weights. Control-plane compromise remains high impact; protect it with MFA, patching, backups, restricted administration, and auditable change control.</w:t>
+      </w:r>
+    </w:p>
+    <w:p>
+      <w:pPr>
+        <w:pStyle w:val="Heading2"/>
+      </w:pPr>
+      <w:r>
+        <w:t>16.6 Compute tiers and distributed stack</w:t>
+      </w:r>
+    </w:p>
+    <w:tbl>
+      <w:tblPr>
+        <w:tblStyle w:val="TableGrid"/>
+        <w:tblW w:type="dxa" w:w="9360"/>
+        <w:jc w:val="center"/>
+        <w:tblLayout w:type="fixed"/>
+        <w:tblLook w:firstColumn="1" w:firstRow="1" w:lastColumn="0" w:lastRow="0" w:noHBand="0" w:noVBand="1" w:val="04A0"/>
+        <w:tblLayout w:type="fixed"/>
+        <w:tblInd w:w="120" w:type="dxa"/>
+        <w:tblCellMar>
+          <w:top w:w="80" w:type="dxa"/>
+          <w:bottom w:w="80" w:type="dxa"/>
+          <w:start w:w="120" w:type="dxa"/>
+          <w:end w:w="120" w:type="dxa"/>
+        </w:tblCellMar>
+      </w:tblPr>
+      <w:tblGrid>
+        <w:gridCol w:w="3120"/>
+        <w:gridCol w:w="3120"/>
+        <w:gridCol w:w="3120"/>
+      </w:tblGrid>
+      <w:tr>
+        <w:trPr>
+          <w:tblHeader w:val="true"/>
+          <w:cantSplit/>
+        </w:trPr>
+        <w:tc>
+          <w:tcPr>
+            <w:tcW w:type="dxa" w:w="3120"/>
+            <w:shd w:fill="E8EEF5"/>
+            <w:tcFitText/>
+            <w:vAlign w:val="top"/>
+          </w:tcPr>
+          <w:p>
+            <w:pPr>
+              <w:spacing w:after="40" w:line="259" w:lineRule="auto"/>
+            </w:pPr>
+            <w:r>
+              <w:rPr>
+                <w:b/>
+                <w:sz w:val="16"/>
+              </w:rPr>
+              <w:t>Tier</w:t>
+            </w:r>
+          </w:p>
+        </w:tc>
+        <w:tc>
+          <w:tcPr>
+            <w:tcW w:type="dxa" w:w="3120"/>
+            <w:shd w:fill="E8EEF5"/>
+            <w:tcFitText/>
+            <w:vAlign w:val="top"/>
+          </w:tcPr>
+          <w:p>
+            <w:pPr>
+              <w:spacing w:after="40" w:line="259" w:lineRule="auto"/>
+            </w:pPr>
+            <w:r>
+              <w:rPr>
+                <w:b/>
+                <w:sz w:val="16"/>
+              </w:rPr>
+              <w:t>Workload</w:t>
+            </w:r>
+          </w:p>
+        </w:tc>
+        <w:tc>
+          <w:tcPr>
+            <w:tcW w:type="dxa" w:w="3120"/>
+            <w:shd w:fill="E8EEF5"/>
+            <w:tcFitText/>
+            <w:vAlign w:val="top"/>
+          </w:tcPr>
+          <w:p>
+            <w:pPr>
+              <w:spacing w:after="40" w:line="259" w:lineRule="auto"/>
+            </w:pPr>
+            <w:r>
+              <w:rPr>
+                <w:b/>
+                <w:sz w:val="16"/>
+              </w:rPr>
+              <w:t>Default approach</w:t>
+            </w:r>
+          </w:p>
+        </w:tc>
+      </w:tr>
+      <w:tr>
+        <w:trPr>
+          <w:cantSplit/>
+        </w:trPr>
+        <w:tc>
+          <w:tcPr>
+            <w:tcW w:type="dxa" w:w="3120"/>
+            <w:vAlign w:val="top"/>
+          </w:tcPr>
+          <w:p>
+            <w:pPr>
+              <w:spacing w:after="40" w:line="259" w:lineRule="auto"/>
+            </w:pPr>
+            <w:r>
+              <w:rPr>
+                <w:b w:val="0"/>
+                <w:sz w:val="16"/>
+              </w:rPr>
+              <w:t>A: one or two GPUs</w:t>
+            </w:r>
+          </w:p>
+        </w:tc>
+        <w:tc>
+          <w:tcPr>
+            <w:tcW w:type="dxa" w:w="3120"/>
+            <w:vAlign w:val="top"/>
+          </w:tcPr>
+          <w:p>
+            <w:pPr>
+              <w:spacing w:after="40" w:line="259" w:lineRule="auto"/>
+            </w:pPr>
+            <w:r>
+              <w:rPr>
+                <w:b w:val="0"/>
+                <w:sz w:val="16"/>
+              </w:rPr>
+              <w:t>4B-14B dense and roughly 20B active-sparse QLoRA/SFT, evaluation, development serving</w:t>
+            </w:r>
+          </w:p>
+        </w:tc>
+        <w:tc>
+          <w:tcPr>
+            <w:tcW w:type="dxa" w:w="3120"/>
+            <w:vAlign w:val="top"/>
+          </w:tcPr>
+          <w:p>
+            <w:pPr>
+              <w:spacing w:after="40" w:line="259" w:lineRule="auto"/>
+            </w:pPr>
+            <w:r>
+              <w:rPr>
+                <w:b w:val="0"/>
+                <w:sz w:val="16"/>
+              </w:rPr>
+              <w:t>Single-node first; avoid sharding when the job fits</w:t>
+            </w:r>
+          </w:p>
+        </w:tc>
+      </w:tr>
+      <w:tr>
+        <w:trPr>
+          <w:cantSplit/>
+        </w:trPr>
+        <w:tc>
+          <w:tcPr>
+            <w:tcW w:type="dxa" w:w="3120"/>
+            <w:vAlign w:val="top"/>
+          </w:tcPr>
+          <w:p>
+            <w:pPr>
+              <w:spacing w:after="40" w:line="259" w:lineRule="auto"/>
+            </w:pPr>
+            <w:r>
+              <w:rPr>
+                <w:b w:val="0"/>
+                <w:sz w:val="16"/>
+              </w:rPr>
+              <w:t>B: four to eight homogeneous GPUs</w:t>
+            </w:r>
+          </w:p>
+        </w:tc>
+        <w:tc>
+          <w:tcPr>
+            <w:tcW w:type="dxa" w:w="3120"/>
+            <w:vAlign w:val="top"/>
+          </w:tcPr>
+          <w:p>
+            <w:pPr>
+              <w:spacing w:after="40" w:line="259" w:lineRule="auto"/>
+            </w:pPr>
+            <w:r>
+              <w:rPr>
+                <w:b w:val="0"/>
+                <w:sz w:val="16"/>
+              </w:rPr>
+              <w:t>24B-70B adapters, longer context, parallel seeds, verifiable-RL rollouts</w:t>
+            </w:r>
+          </w:p>
+        </w:tc>
+        <w:tc>
+          <w:tcPr>
+            <w:tcW w:type="dxa" w:w="3120"/>
+            <w:vAlign w:val="top"/>
+          </w:tcPr>
+          <w:p>
+            <w:pPr>
+              <w:spacing w:after="40" w:line="259" w:lineRule="auto"/>
+            </w:pPr>
+            <w:r>
+              <w:rPr>
+                <w:b w:val="0"/>
+                <w:sz w:val="16"/>
+              </w:rPr>
+              <w:t>Slurm plus PyTorch FSDP/TorchTitan; add ZeRO only when measurements justify it</w:t>
+            </w:r>
+          </w:p>
+        </w:tc>
+      </w:tr>
+      <w:tr>
+        <w:trPr>
+          <w:cantSplit/>
+        </w:trPr>
+        <w:tc>
+          <w:tcPr>
+            <w:tcW w:type="dxa" w:w="3120"/>
+            <w:vAlign w:val="top"/>
+          </w:tcPr>
+          <w:p>
+            <w:pPr>
+              <w:spacing w:after="40" w:line="259" w:lineRule="auto"/>
+            </w:pPr>
+            <w:r>
+              <w:rPr>
+                <w:b w:val="0"/>
+                <w:sz w:val="16"/>
+              </w:rPr>
+              <w:t>C: multi-node fast fabric</w:t>
+            </w:r>
+          </w:p>
+        </w:tc>
+        <w:tc>
+          <w:tcPr>
+            <w:tcW w:type="dxa" w:w="3120"/>
+            <w:vAlign w:val="top"/>
+          </w:tcPr>
+          <w:p>
+            <w:pPr>
+              <w:spacing w:after="40" w:line="259" w:lineRule="auto"/>
+            </w:pPr>
+            <w:r>
+              <w:rPr>
+                <w:b w:val="0"/>
+                <w:sz w:val="16"/>
+              </w:rPr>
+              <w:t>100B+ models, larger full tuning, MoE/expert parallelism, architecture pretraining</w:t>
+            </w:r>
+          </w:p>
+        </w:tc>
+        <w:tc>
+          <w:tcPr>
+            <w:tcW w:type="dxa" w:w="3120"/>
+            <w:vAlign w:val="top"/>
+          </w:tcPr>
+          <w:p>
+            <w:pPr>
+              <w:spacing w:after="40" w:line="259" w:lineRule="auto"/>
+            </w:pPr>
+            <w:r>
+              <w:rPr>
+                <w:b w:val="0"/>
+                <w:sz w:val="16"/>
+              </w:rPr>
+              <w:t>Megatron/DeepSpeed/context/expert parallel after full topology qualification</w:t>
+            </w:r>
+          </w:p>
+        </w:tc>
+      </w:tr>
+    </w:tbl>
+    <w:p>
+      <w:pPr>
+        <w:spacing w:after="40"/>
+      </w:pPr>
+    </w:p>
+    <w:p>
+      <w:r>
+        <w:rPr>
+          <w:b w:val="0"/>
+        </w:rPr>
+        <w:t>Use one scheduler for one GPU pool. Slurm is the first dedicated-cluster profile. Kubernetes with Volcano/Kueue and the NVIDIA GPU Operator is an alternative when multi-tenancy and always-on services justify its operational cost, not a second scheduler competing for the same devices. TRL is the first post-training implementation; veRL, OpenRLHF, NeMo RL, and Ray enter when rollout/training throughput—not algorithm correctness—is the measured bottleneck.</w:t>
+      </w:r>
+    </w:p>
+    <w:p>
+      <w:r>
+        <w:rPr>
+          <w:b w:val="0"/>
+        </w:rPr>
+        <w:t xml:space="preserve">Inventory </w:t>
+      </w:r>
+      <w:r>
+        <w:rPr>
+          <w:rFonts w:ascii="Consolas" w:hAnsi="Consolas"/>
+          <w:color w:val="1F4D78"/>
+          <w:sz w:val="17"/>
+        </w:rPr>
+        <w:t>nvidia-smi topo -m</w:t>
+      </w:r>
+      <w:r>
+        <w:rPr>
+          <w:b w:val="0"/>
+        </w:rPr>
+        <w:t xml:space="preserve">, run CUDA peer-to-peer checks and </w:t>
+      </w:r>
+      <w:r>
+        <w:rPr>
+          <w:rFonts w:ascii="Consolas" w:hAnsi="Consolas"/>
+          <w:color w:val="1F4D78"/>
+          <w:sz w:val="17"/>
+        </w:rPr>
+        <w:t>nccl-tests</w:t>
+      </w:r>
+      <w:r>
+        <w:rPr>
+          <w:b w:val="0"/>
+        </w:rPr>
+        <w:t>, and retain the bandwidth/latency matrix. Keep tensor/expert parallel groups inside fast NVLink domains and prefer data or pipeline parallelism across slower links. RDMA/RoCE/InfiniBand is accepted only after fabric, MTU, congestion, isolation, and fault tests. Actual fit must be measured from precision, total and active weights, sequence length, activations, optimizer, attention kernel, batch/accumulation, checkpointing, KV cache, and runtime—not from a parameter-count label.</w:t>
       </w:r>
     </w:p>
     <w:p>
@@ -9154,7 +10782,7 @@
         <w:pStyle w:val="ListNumber"/>
         <w:numPr>
           <w:ilvl w:val="0"/>
-          <w:numId w:val="17"/>
+          <w:numId w:val="18"/>
         </w:numPr>
       </w:pPr>
       <w:r>
@@ -9162,157 +10790,6 @@
           <w:b w:val="0"/>
         </w:rPr>
         <w:t>Register exact source bytes, provenance, licence, cutoff, and five rights.</w:t>
-      </w:r>
-    </w:p>
-    <w:p>
-      <w:pPr>
-        <w:pStyle w:val="ListNumber"/>
-        <w:numPr>
-          <w:ilvl w:val="0"/>
-          <w:numId w:val="17"/>
-        </w:numPr>
-      </w:pPr>
-      <w:r>
-        <w:rPr>
-          <w:b w:val="0"/>
-        </w:rPr>
-        <w:t>Author a development row with correct task/domain/knowledge-class labels.</w:t>
-      </w:r>
-    </w:p>
-    <w:p>
-      <w:pPr>
-        <w:pStyle w:val="ListNumber"/>
-        <w:numPr>
-          <w:ilvl w:val="0"/>
-          <w:numId w:val="17"/>
-        </w:numPr>
-      </w:pPr>
-      <w:r>
-        <w:rPr>
-          <w:b w:val="0"/>
-        </w:rPr>
-        <w:t>Compile the draft; fix validation rather than editing generated output.</w:t>
-      </w:r>
-    </w:p>
-    <w:p>
-      <w:pPr>
-        <w:pStyle w:val="ListNumber"/>
-        <w:numPr>
-          <w:ilvl w:val="0"/>
-          <w:numId w:val="17"/>
-        </w:numPr>
-      </w:pPr>
-      <w:r>
-        <w:rPr>
-          <w:b w:val="0"/>
-        </w:rPr>
-        <w:t>Run deterministic and supported executable checks.</w:t>
-      </w:r>
-    </w:p>
-    <w:p>
-      <w:pPr>
-        <w:pStyle w:val="ListNumber"/>
-        <w:numPr>
-          <w:ilvl w:val="0"/>
-          <w:numId w:val="17"/>
-        </w:numPr>
-      </w:pPr>
-      <w:r>
-        <w:rPr>
-          <w:b w:val="0"/>
-        </w:rPr>
-        <w:t>Package exact row/source/evidence for an independent reviewer.</w:t>
-      </w:r>
-    </w:p>
-    <w:p>
-      <w:pPr>
-        <w:pStyle w:val="ListNumber"/>
-        <w:numPr>
-          <w:ilvl w:val="0"/>
-          <w:numId w:val="17"/>
-        </w:numPr>
-      </w:pPr>
-      <w:r>
-        <w:rPr>
-          <w:b w:val="0"/>
-        </w:rPr>
-        <w:t>Compile complete row/source decisions and reapply review to fresh bytes.</w:t>
-      </w:r>
-    </w:p>
-    <w:p>
-      <w:pPr>
-        <w:pStyle w:val="ListNumber"/>
-        <w:numPr>
-          <w:ilvl w:val="0"/>
-          <w:numId w:val="17"/>
-        </w:numPr>
-      </w:pPr>
-      <w:r>
-        <w:rPr>
-          <w:b w:val="0"/>
-        </w:rPr>
-        <w:t>Obtain detached signed row receipts; add independent teacher-lineage admission where required.</w:t>
-      </w:r>
-    </w:p>
-    <w:p>
-      <w:pPr>
-        <w:pStyle w:val="ListNumber"/>
-        <w:numPr>
-          <w:ilvl w:val="0"/>
-          <w:numId w:val="17"/>
-        </w:numPr>
-      </w:pPr>
-      <w:r>
-        <w:rPr>
-          <w:b w:val="0"/>
-        </w:rPr>
-        <w:t>Export SFT and verify coverage/contamination.</w:t>
-      </w:r>
-    </w:p>
-    <w:p>
-      <w:pPr>
-        <w:pStyle w:val="ListNumber"/>
-        <w:numPr>
-          <w:ilvl w:val="0"/>
-          <w:numId w:val="17"/>
-        </w:numPr>
-      </w:pPr>
-      <w:r>
-        <w:rPr>
-          <w:b w:val="0"/>
-        </w:rPr>
-        <w:t>Build and independently sign the evaluation-authoring/release inventory.</w:t>
-      </w:r>
-    </w:p>
-    <w:p>
-      <w:pPr>
-        <w:pStyle w:val="ListNumber"/>
-        <w:numPr>
-          <w:ilvl w:val="0"/>
-          <w:numId w:val="17"/>
-        </w:numPr>
-      </w:pPr>
-      <w:r>
-        <w:rPr>
-          <w:b w:val="0"/>
-        </w:rPr>
-        <w:t>Obtain separate corpus-quality admission before non-smoke training.</w:t>
-      </w:r>
-    </w:p>
-    <w:p>
-      <w:r>
-        <w:rPr>
-          <w:b w:val="0"/>
-        </w:rPr>
-        <w:t>At every step preserve previous artifacts and IDs. Never “repair” a signed artifact in place; create a new version and repeat downstream gates.</w:t>
-      </w:r>
-    </w:p>
-    <w:p>
-      <w:pPr>
-        <w:pStyle w:val="Heading2"/>
-      </w:pPr>
-      <w:r>
-        <w:t>17.5 Teacher runbook</w:t>
       </w:r>
     </w:p>
     <w:p>
@@ -9327,7 +10804,7 @@
         <w:rPr>
           <w:b w:val="0"/>
         </w:rPr>
-        <w:t>Confirm provider/weight licence permits the intended training use.</w:t>
+        <w:t>Author a development row with correct task/domain/knowledge-class labels.</w:t>
       </w:r>
     </w:p>
     <w:p>
@@ -9342,7 +10819,7 @@
         <w:rPr>
           <w:b w:val="0"/>
         </w:rPr>
-        <w:t>Freeze teacher revision, tokenizer/template, runtime descriptor, and capture budget.</w:t>
+        <w:t>Compile the draft; fix validation rather than editing generated output.</w:t>
       </w:r>
     </w:p>
     <w:p>
@@ -9357,7 +10834,7 @@
         <w:rPr>
           <w:b w:val="0"/>
         </w:rPr>
-        <w:t>Start the controlled loopback engine and create/revalidate its passive binding.</w:t>
+        <w:t>Run deterministic and supported executable checks.</w:t>
       </w:r>
     </w:p>
     <w:p>
@@ -9372,7 +10849,7 @@
         <w:rPr>
           <w:b w:val="0"/>
         </w:rPr>
-        <w:t>Compile manifest v2 from source-grounded development rows; confirm references are absent.</w:t>
+        <w:t>Package exact row/source/evidence for an independent reviewer.</w:t>
       </w:r>
     </w:p>
     <w:p>
@@ -9387,7 +10864,7 @@
         <w:rPr>
           <w:b w:val="0"/>
         </w:rPr>
-        <w:t>Run live token/context preflight, then bounded multi-seed capture.</w:t>
+        <w:t>Compile complete row/source decisions and reapply review to fresh bytes.</w:t>
       </w:r>
     </w:p>
     <w:p>
@@ -9402,7 +10879,7 @@
         <w:rPr>
           <w:b w:val="0"/>
         </w:rPr>
-        <w:t>Have the independent custodian generate the withheld deny-set.</w:t>
+        <w:t>Obtain detached signed row receipts; add independent teacher-lineage admission where required.</w:t>
       </w:r>
     </w:p>
     <w:p>
@@ -9417,7 +10894,7 @@
         <w:rPr>
           <w:b w:val="0"/>
         </w:rPr>
-        <w:t>Select at most one candidate per task and materialize the immutable package.</w:t>
+        <w:t>Export SFT and verify coverage/contamination.</w:t>
       </w:r>
     </w:p>
     <w:p>
@@ -9432,15 +10909,30 @@
         <w:rPr>
           <w:b w:val="0"/>
         </w:rPr>
-        <w:t>Perform subject-matter review; issue separate lineage admission and row receipts.</w:t>
-      </w:r>
-    </w:p>
-    <w:p>
-      <w:r>
-        <w:rPr>
-          <w:b w:val="0"/>
-        </w:rPr>
-        <w:t>Failure, timeout, disagreement, overlap, or unverifiable runtime state leaves the candidate unreviewed. There is no “best effort” promotion into SFT.</w:t>
+        <w:t>Build and independently sign the evaluation-authoring/release inventory.</w:t>
+      </w:r>
+    </w:p>
+    <w:p>
+      <w:pPr>
+        <w:pStyle w:val="ListNumber"/>
+        <w:numPr>
+          <w:ilvl w:val="0"/>
+          <w:numId w:val="18"/>
+        </w:numPr>
+      </w:pPr>
+      <w:r>
+        <w:rPr>
+          <w:b w:val="0"/>
+        </w:rPr>
+        <w:t>Obtain separate corpus-quality admission before non-smoke training.</w:t>
+      </w:r>
+    </w:p>
+    <w:p>
+      <w:r>
+        <w:rPr>
+          <w:b w:val="0"/>
+        </w:rPr>
+        <w:t>At every step preserve previous artifacts and IDs. Never “repair” a signed artifact in place; create a new version and repeat downstream gates.</w:t>
       </w:r>
     </w:p>
     <w:p>
@@ -9448,7 +10940,7 @@
         <w:pStyle w:val="Heading2"/>
       </w:pPr>
       <w:r>
-        <w:t>17.6 Base selection and training runbook</w:t>
+        <w:t>17.5 Teacher runbook</w:t>
       </w:r>
     </w:p>
     <w:p>
@@ -9463,7 +10955,7 @@
         <w:rPr>
           <w:b w:val="0"/>
         </w:rPr>
-        <w:t>Acquire every student snapshot at its pinned revision and verify the source lock/tree.</w:t>
+        <w:t>Confirm the user-designated permission owner has recorded authorised acquisition/use, current terms, attribution, data handling, and expiry for the provider or weights.</w:t>
       </w:r>
     </w:p>
     <w:p>
@@ -9478,7 +10970,7 @@
         <w:rPr>
           <w:b w:val="0"/>
         </w:rPr>
-        <w:t>Create equivalent raw-base profiles and run the complete catalog matrix against the frozen release/suites/baseline.</w:t>
+        <w:t>Freeze teacher revision, tokenizer/template, runtime descriptor, and capture budget.</w:t>
       </w:r>
     </w:p>
     <w:p>
@@ -9493,7 +10985,7 @@
         <w:rPr>
           <w:b w:val="0"/>
         </w:rPr>
-        <w:t>Aggregate gates and obtain independent selection v2 over the exact winning snapshot.</w:t>
+        <w:t>Start the controlled loopback engine and create/revalidate its passive binding.</w:t>
       </w:r>
     </w:p>
     <w:p>
@@ -9508,7 +11000,7 @@
         <w:rPr>
           <w:b w:val="0"/>
         </w:rPr>
-        <w:t>Validate the full Linux/CUDA lock and hardware; execute a smoke run.</w:t>
+        <w:t>Compile manifest v2 from source-grounded development rows; confirm references are absent.</w:t>
       </w:r>
     </w:p>
     <w:p>
@@ -9523,7 +11015,7 @@
         <w:rPr>
           <w:b w:val="0"/>
         </w:rPr>
-        <w:t>Prepare manifest v3 from signed release, corpus admission, and selection.</w:t>
+        <w:t>Run live token/context preflight, then bounded multi-seed capture.</w:t>
       </w:r>
     </w:p>
     <w:p>
@@ -9538,7 +11030,7 @@
         <w:rPr>
           <w:b w:val="0"/>
         </w:rPr>
-        <w:t>Run the bounded QLoRA pilot; retain telemetry and negative results.</w:t>
+        <w:t>Have the independent custodian generate the withheld deny-set.</w:t>
       </w:r>
     </w:p>
     <w:p>
@@ -9553,7 +11045,7 @@
         <w:rPr>
           <w:b w:val="0"/>
         </w:rPr>
-        <w:t>Produce the pending safe adapter tree; obtain external trainer-provenance signature; finalize artifact v2.</w:t>
+        <w:t>Select at most one candidate per task and materialize the immutable package.</w:t>
       </w:r>
     </w:p>
     <w:p>
@@ -9568,7 +11060,15 @@
         <w:rPr>
           <w:b w:val="0"/>
         </w:rPr>
-        <w:t>Evaluate without changing prompts, thresholds, or sealed tasks. A failed gate returns to a new experiment, not an edited report.</w:t>
+        <w:t>Perform subject-matter review; issue separate lineage admission and row receipts.</w:t>
+      </w:r>
+    </w:p>
+    <w:p>
+      <w:r>
+        <w:rPr>
+          <w:b w:val="0"/>
+        </w:rPr>
+        <w:t>Failure, timeout, disagreement, overlap, or unverifiable runtime state leaves the candidate unreviewed. There is no “best effort” promotion into SFT.</w:t>
       </w:r>
     </w:p>
     <w:p>
@@ -9576,7 +11076,7 @@
         <w:pStyle w:val="Heading2"/>
       </w:pPr>
       <w:r>
-        <w:t>17.7 Promotion and deployment runbook</w:t>
+        <w:t>17.6 Base selection and training runbook</w:t>
       </w:r>
     </w:p>
     <w:p>
@@ -9591,7 +11091,7 @@
         <w:rPr>
           <w:b w:val="0"/>
         </w:rPr>
-        <w:t>Re-run complete candidate/baseline aggregation from exact bytes.</w:t>
+        <w:t>Acquire every student snapshot at its pinned revision and verify the source lock/tree.</w:t>
       </w:r>
     </w:p>
     <w:p>
@@ -9606,7 +11106,7 @@
         <w:rPr>
           <w:b w:val="0"/>
         </w:rPr>
-        <w:t>Fully replay C# rows and obtain the distinct replay-audit signature.</w:t>
+        <w:t>Create equivalent raw-base profiles and run the complete catalog matrix against the frozen release/suites/baseline.</w:t>
       </w:r>
     </w:p>
     <w:p>
@@ -9621,7 +11121,7 @@
         <w:rPr>
           <w:b w:val="0"/>
         </w:rPr>
-        <w:t>Review quality, regressions, cost/latency, safety, rights, licence, and operational capacity.</w:t>
+        <w:t>Aggregate gates and obtain independent selection v2 over the exact winning snapshot.</w:t>
       </w:r>
     </w:p>
     <w:p>
@@ -9636,7 +11136,7 @@
         <w:rPr>
           <w:b w:val="0"/>
         </w:rPr>
-        <w:t>Issue a signed promotion with exact capability and expiry; do not reuse a research-only policy for strategy authoring.</w:t>
+        <w:t>Validate the full Linux/CUDA lock and hardware; execute a smoke run.</w:t>
       </w:r>
     </w:p>
     <w:p>
@@ -9651,7 +11151,7 @@
         <w:rPr>
           <w:b w:val="0"/>
         </w:rPr>
-        <w:t>Prepare engine-wrapper v7 with immutable base/adapter/image and all trust roots.</w:t>
+        <w:t>Prepare manifest v3 from signed release, corpus admission, and selection.</w:t>
       </w:r>
     </w:p>
     <w:p>
@@ -9666,7 +11166,7 @@
         <w:rPr>
           <w:b w:val="0"/>
         </w:rPr>
-        <w:t>Launch under the distinct service identity; verify post-load model/adapter and readiness v2.</w:t>
+        <w:t>Run the bounded QLoRA pilot; retain telemetry and negative results.</w:t>
       </w:r>
     </w:p>
     <w:p>
@@ -9681,7 +11181,7 @@
         <w:rPr>
           <w:b w:val="0"/>
         </w:rPr>
-        <w:t>Exercise Platform credit/run flow in shadow mode, then stage the rollout.</w:t>
+        <w:t>Produce the pending safe adapter tree; obtain external trainer-provenance signature; finalize artifact v2.</w:t>
       </w:r>
     </w:p>
     <w:p>
@@ -9690,6 +11190,134 @@
         <w:numPr>
           <w:ilvl w:val="0"/>
           <w:numId w:val="20"/>
+        </w:numPr>
+      </w:pPr>
+      <w:r>
+        <w:rPr>
+          <w:b w:val="0"/>
+        </w:rPr>
+        <w:t>Evaluate without changing prompts, thresholds, or sealed tasks. A failed gate returns to a new experiment, not an edited report.</w:t>
+      </w:r>
+    </w:p>
+    <w:p>
+      <w:pPr>
+        <w:pStyle w:val="Heading2"/>
+      </w:pPr>
+      <w:r>
+        <w:t>17.7 Promotion and deployment runbook</w:t>
+      </w:r>
+    </w:p>
+    <w:p>
+      <w:pPr>
+        <w:pStyle w:val="ListNumber"/>
+        <w:numPr>
+          <w:ilvl w:val="0"/>
+          <w:numId w:val="21"/>
+        </w:numPr>
+      </w:pPr>
+      <w:r>
+        <w:rPr>
+          <w:b w:val="0"/>
+        </w:rPr>
+        <w:t>Re-run complete candidate/baseline aggregation from exact bytes.</w:t>
+      </w:r>
+    </w:p>
+    <w:p>
+      <w:pPr>
+        <w:pStyle w:val="ListNumber"/>
+        <w:numPr>
+          <w:ilvl w:val="0"/>
+          <w:numId w:val="21"/>
+        </w:numPr>
+      </w:pPr>
+      <w:r>
+        <w:rPr>
+          <w:b w:val="0"/>
+        </w:rPr>
+        <w:t>Fully replay C# rows and obtain the distinct replay-audit signature.</w:t>
+      </w:r>
+    </w:p>
+    <w:p>
+      <w:pPr>
+        <w:pStyle w:val="ListNumber"/>
+        <w:numPr>
+          <w:ilvl w:val="0"/>
+          <w:numId w:val="21"/>
+        </w:numPr>
+      </w:pPr>
+      <w:r>
+        <w:rPr>
+          <w:b w:val="0"/>
+        </w:rPr>
+        <w:t>Review quality, regressions, cost/latency, safety, the permission/provenance record, and operational capacity.</w:t>
+      </w:r>
+    </w:p>
+    <w:p>
+      <w:pPr>
+        <w:pStyle w:val="ListNumber"/>
+        <w:numPr>
+          <w:ilvl w:val="0"/>
+          <w:numId w:val="21"/>
+        </w:numPr>
+      </w:pPr>
+      <w:r>
+        <w:rPr>
+          <w:b w:val="0"/>
+        </w:rPr>
+        <w:t>Issue a signed promotion with exact capability and expiry; do not reuse a research-only policy for strategy authoring.</w:t>
+      </w:r>
+    </w:p>
+    <w:p>
+      <w:pPr>
+        <w:pStyle w:val="ListNumber"/>
+        <w:numPr>
+          <w:ilvl w:val="0"/>
+          <w:numId w:val="21"/>
+        </w:numPr>
+      </w:pPr>
+      <w:r>
+        <w:rPr>
+          <w:b w:val="0"/>
+        </w:rPr>
+        <w:t>Prepare engine-wrapper v7 with immutable base/adapter/image and all trust roots.</w:t>
+      </w:r>
+    </w:p>
+    <w:p>
+      <w:pPr>
+        <w:pStyle w:val="ListNumber"/>
+        <w:numPr>
+          <w:ilvl w:val="0"/>
+          <w:numId w:val="21"/>
+        </w:numPr>
+      </w:pPr>
+      <w:r>
+        <w:rPr>
+          <w:b w:val="0"/>
+        </w:rPr>
+        <w:t>Launch under the distinct service identity; verify post-load model/adapter and readiness v2.</w:t>
+      </w:r>
+    </w:p>
+    <w:p>
+      <w:pPr>
+        <w:pStyle w:val="ListNumber"/>
+        <w:numPr>
+          <w:ilvl w:val="0"/>
+          <w:numId w:val="21"/>
+        </w:numPr>
+      </w:pPr>
+      <w:r>
+        <w:rPr>
+          <w:b w:val="0"/>
+        </w:rPr>
+        <w:t>Exercise Platform credit/run flow in shadow mode, then stage the rollout.</w:t>
+      </w:r>
+    </w:p>
+    <w:p>
+      <w:pPr>
+        <w:pStyle w:val="ListNumber"/>
+        <w:numPr>
+          <w:ilvl w:val="0"/>
+          <w:numId w:val="21"/>
         </w:numPr>
       </w:pPr>
       <w:r>
@@ -10526,7 +12154,7 @@
                 <w:b w:val="0"/>
                 <w:sz w:val="16"/>
               </w:rPr>
-              <w:t>Expand rights-clean rows, independent correctness/source decisions, receipts, teacher lineage where used, evaluation authoring</w:t>
+              <w:t>Expand permission-recorded rows, independent correctness/source decisions, receipts, teacher lineage where used, evaluation authoring</w:t>
             </w:r>
           </w:p>
         </w:tc>
@@ -10644,7 +12272,7 @@
                 <w:b w:val="0"/>
                 <w:sz w:val="16"/>
               </w:rPr>
-              <w:t>Run every catalog student and baseline under one frozen condition</w:t>
+              <w:t>Run the production catalog plus retrieval/no-retrieval comparisons; evaluate registry challengers separately</w:t>
             </w:r>
           </w:p>
         </w:tc>
@@ -10662,7 +12290,7 @@
                 <w:b w:val="0"/>
                 <w:sz w:val="16"/>
               </w:rPr>
-              <w:t>Signed selection v2 over complete matrix and exact snapshot</w:t>
+              <w:t>Signed selection v2 over complete production matrix and exact snapshot</w:t>
             </w:r>
           </w:p>
         </w:tc>
@@ -10685,7 +12313,7 @@
                 <w:b w:val="0"/>
                 <w:sz w:val="16"/>
               </w:rPr>
-              <w:t>4. QLoRA pilot</w:t>
+              <w:t>4. Expert-student pilot</w:t>
             </w:r>
           </w:p>
         </w:tc>
@@ -10703,7 +12331,7 @@
                 <w:b w:val="0"/>
                 <w:sz w:val="16"/>
               </w:rPr>
-              <w:t>Run bounded SFT, safe tree sealing, external trainer provenance, multi-seed comparison</w:t>
+              <w:t>Run bounded verified SFT, then DPO only if SFT passes; seal safe artifacts and compare multiple seeds</w:t>
             </w:r>
           </w:p>
         </w:tc>
@@ -10721,7 +12349,7 @@
                 <w:b w:val="0"/>
                 <w:sz w:val="16"/>
               </w:rPr>
-              <w:t>Artifact v2; reproducible improvement without critical/per-domain regression</w:t>
+              <w:t>Reproducible improvement over raw base and strongest baseline without protected-domain regression</w:t>
             </w:r>
           </w:p>
         </w:tc>
@@ -10744,7 +12372,66 @@
                 <w:b w:val="0"/>
                 <w:sz w:val="16"/>
               </w:rPr>
-              <w:t>5. Evaluation/promotion</w:t>
+              <w:t>5. Verifiable reasoning</w:t>
+            </w:r>
+          </w:p>
+        </w:tc>
+        <w:tc>
+          <w:tcPr>
+            <w:tcW w:type="dxa" w:w="3120"/>
+            <w:vAlign w:val="top"/>
+          </w:tcPr>
+          <w:p>
+            <w:pPr>
+              <w:spacing w:after="40" w:line="259" w:lineRule="auto"/>
+            </w:pPr>
+            <w:r>
+              <w:rPr>
+                <w:b w:val="0"/>
+                <w:sz w:val="16"/>
+              </w:rPr>
+              <w:t>Compare RLOO/GRPO on compiler/test/math/risk rewards; train isolated domain/effort adapters and router</w:t>
+            </w:r>
+          </w:p>
+        </w:tc>
+        <w:tc>
+          <w:tcPr>
+            <w:tcW w:type="dxa" w:w="3120"/>
+            <w:vAlign w:val="top"/>
+          </w:tcPr>
+          <w:p>
+            <w:pPr>
+              <w:spacing w:after="40" w:line="259" w:lineRule="auto"/>
+            </w:pPr>
+            <w:r>
+              <w:rPr>
+                <w:b w:val="0"/>
+                <w:sz w:val="16"/>
+              </w:rPr>
+              <w:t>Reward-hacking audit, specialist gates, calibrated routing, and bounded efficiency all pass</w:t>
+            </w:r>
+          </w:p>
+        </w:tc>
+      </w:tr>
+      <w:tr>
+        <w:trPr>
+          <w:cantSplit/>
+        </w:trPr>
+        <w:tc>
+          <w:tcPr>
+            <w:tcW w:type="dxa" w:w="3120"/>
+            <w:vAlign w:val="top"/>
+          </w:tcPr>
+          <w:p>
+            <w:pPr>
+              <w:spacing w:after="40" w:line="259" w:lineRule="auto"/>
+            </w:pPr>
+            <w:r>
+              <w:rPr>
+                <w:b w:val="0"/>
+                <w:sz w:val="16"/>
+              </w:rPr>
+              <w:t>6. Evaluation/promotion</w:t>
             </w:r>
           </w:p>
         </w:tc>
@@ -10803,7 +12490,7 @@
                 <w:b w:val="0"/>
                 <w:sz w:val="16"/>
               </w:rPr>
-              <w:t>6. Serving rollout</w:t>
+              <w:t>7. Serving rollout</w:t>
             </w:r>
           </w:p>
         </w:tc>
@@ -10821,7 +12508,7 @@
                 <w:b w:val="0"/>
                 <w:sz w:val="16"/>
               </w:rPr>
-              <w:t>Engine-wrapper v7, readiness, remote auth, credits, staged shadow/cohort deployment</w:t>
+              <w:t>Engine-wrapper v7, vLLM/SGLang comparison, readiness, remote auth, credits, staged shadow/cohort deployment</w:t>
             </w:r>
           </w:p>
         </w:tc>
@@ -10862,7 +12549,7 @@
                 <w:b w:val="0"/>
                 <w:sz w:val="16"/>
               </w:rPr>
-              <w:t>7. Advanced research</w:t>
+              <w:t>8. Multi-teacher scale-out</w:t>
             </w:r>
           </w:p>
         </w:tc>
@@ -10880,7 +12567,7 @@
                 <w:b w:val="0"/>
                 <w:sz w:val="16"/>
               </w:rPr>
-              <w:t>Effort adapters, diverse scaffolds, preference/RLVR, multi-teacher or architecture ablations</w:t>
+              <w:t>Domain-calibrated teachers, on-policy distillation where probabilities/logits are authorised, persistent agent rollouts</w:t>
             </w:r>
           </w:p>
         </w:tc>
@@ -10898,7 +12585,66 @@
                 <w:b w:val="0"/>
                 <w:sz w:val="16"/>
               </w:rPr>
-              <w:t>Each change independently beats the simpler accepted baseline</w:t>
+              <w:t>Beats sequence-SFT and routed specialists under identical sealed conditions</w:t>
+            </w:r>
+          </w:p>
+        </w:tc>
+      </w:tr>
+      <w:tr>
+        <w:trPr>
+          <w:cantSplit/>
+        </w:trPr>
+        <w:tc>
+          <w:tcPr>
+            <w:tcW w:type="dxa" w:w="3120"/>
+            <w:vAlign w:val="top"/>
+          </w:tcPr>
+          <w:p>
+            <w:pPr>
+              <w:spacing w:after="40" w:line="259" w:lineRule="auto"/>
+            </w:pPr>
+            <w:r>
+              <w:rPr>
+                <w:b w:val="0"/>
+                <w:sz w:val="16"/>
+              </w:rPr>
+              <w:t>9. Architecture research</w:t>
+            </w:r>
+          </w:p>
+        </w:tc>
+        <w:tc>
+          <w:tcPr>
+            <w:tcW w:type="dxa" w:w="3120"/>
+            <w:vAlign w:val="top"/>
+          </w:tcPr>
+          <w:p>
+            <w:pPr>
+              <w:spacing w:after="40" w:line="259" w:lineRule="auto"/>
+            </w:pPr>
+            <w:r>
+              <w:rPr>
+                <w:b w:val="0"/>
+                <w:sz w:val="16"/>
+              </w:rPr>
+              <w:t>Equal-compute KDA/DeltaNet, sparse-attention, Mamba-hybrid, MTP, MoE, multimodal and quantisation ablations</w:t>
+            </w:r>
+          </w:p>
+        </w:tc>
+        <w:tc>
+          <w:tcPr>
+            <w:tcW w:type="dxa" w:w="3120"/>
+            <w:vAlign w:val="top"/>
+          </w:tcPr>
+          <w:p>
+            <w:pPr>
+              <w:spacing w:after="40" w:line="259" w:lineRule="auto"/>
+            </w:pPr>
+            <w:r>
+              <w:rPr>
+                <w:b w:val="0"/>
+                <w:sz w:val="16"/>
+              </w:rPr>
+              <w:t>Each mechanism independently beats the simpler accepted baseline before scale-up</w:t>
             </w:r>
           </w:p>
         </w:tc>
@@ -10914,7 +12660,7 @@
         <w:rPr>
           <w:b w:val="0"/>
         </w:rPr>
-        <w:t>Stop rather than advance when rights are ambiguous, sealed custody is compromised, signer separation is unavailable, the runtime/snapshot drifts, the evaluator is gameable, critical failures appear, gains vanish across seeds, cost/latency exceeds policy, or rollback cannot be demonstrated. More infrastructure cannot substitute for missing real evidence.</w:t>
+        <w:t>Stop rather than advance when the required access/permission owner has not supplied an authoritative source and permission record, sealed custody is compromised, signer separation is unavailable, the runtime/snapshot drifts, the evaluator is gameable, critical failures appear, gains vanish across seeds, cost/latency exceeds policy, or rollback cannot be demonstrated. More infrastructure cannot substitute for missing real evidence.</w:t>
       </w:r>
     </w:p>
     <w:p>
@@ -12657,13 +14403,13 @@
           <w:color w:val="1F4D78"/>
           <w:sz w:val="17"/>
         </w:rPr>
-        <w:t>docs/​guides/​hyperion-​coordinator.​md</w:t>
-      </w:r>
-      <w:r>
-        <w:rPr>
-          <w:b w:val="0"/>
-        </w:rPr>
-        <w:t xml:space="preserve"> — hosted workflow and operator/data contracts.</w:t>
+        <w:t>docs/​architecture/​hyperion-​frontier-​architecture.​md</w:t>
+      </w:r>
+      <w:r>
+        <w:rPr>
+          <w:b w:val="0"/>
+        </w:rPr>
+        <w:t xml:space="preserve"> — canonical target model portfolio, training ladder, agent runtime, inference fabric, and cluster design.</w:t>
       </w:r>
     </w:p>
     <w:p>
@@ -12676,13 +14422,13 @@
           <w:color w:val="1F4D78"/>
           <w:sz w:val="17"/>
         </w:rPr>
-        <w:t>docs/​research/​hyperion-​expert-​model.​md</w:t>
-      </w:r>
-      <w:r>
-        <w:rPr>
-          <w:b w:val="0"/>
-        </w:rPr>
-        <w:t xml:space="preserve"> — detailed model, corpus, evaluation, signing, and serving design.</w:t>
+        <w:t>docs/​guides/​hyperion-​coordinator.​md</w:t>
+      </w:r>
+      <w:r>
+        <w:rPr>
+          <w:b w:val="0"/>
+        </w:rPr>
+        <w:t xml:space="preserve"> — hosted workflow and operator/data contracts.</w:t>
       </w:r>
     </w:p>
     <w:p>
@@ -12695,13 +14441,13 @@
           <w:color w:val="1F4D78"/>
           <w:sz w:val="17"/>
         </w:rPr>
-        <w:t>docs/​research/​kimi-​k3-​adoption-​notes.​md</w:t>
-      </w:r>
-      <w:r>
-        <w:rPr>
-          <w:b w:val="0"/>
-        </w:rPr>
-        <w:t xml:space="preserve"> — pinned K3 source review and adoption analysis.</w:t>
+        <w:t>docs/​research/​hyperion-​expert-​model.​md</w:t>
+      </w:r>
+      <w:r>
+        <w:rPr>
+          <w:b w:val="0"/>
+        </w:rPr>
+        <w:t xml:space="preserve"> — detailed model, corpus, evaluation, signing, and serving design.</w:t>
       </w:r>
     </w:p>
     <w:p>
@@ -12714,13 +14460,13 @@
           <w:color w:val="1F4D78"/>
           <w:sz w:val="17"/>
         </w:rPr>
-        <w:t>tasks/​2026-​07-​27-​1911-​expert-​model-​coordinator.​md</w:t>
-      </w:r>
-      <w:r>
-        <w:rPr>
-          <w:b w:val="0"/>
-        </w:rPr>
-        <w:t xml:space="preserve"> — implementation/test history and explicit blockers.</w:t>
+        <w:t>docs/​research/​kimi-​k3-​adoption-​notes.​md</w:t>
+      </w:r>
+      <w:r>
+        <w:rPr>
+          <w:b w:val="0"/>
+        </w:rPr>
+        <w:t xml:space="preserve"> — pinned K3 source review and adoption analysis.</w:t>
       </w:r>
     </w:p>
     <w:p>
@@ -12733,13 +14479,13 @@
           <w:color w:val="1F4D78"/>
           <w:sz w:val="17"/>
         </w:rPr>
-        <w:t>tools/​hyperion-​model/​schemas/​</w:t>
-      </w:r>
-      <w:r>
-        <w:rPr>
-          <w:b w:val="0"/>
-        </w:rPr>
-        <w:t xml:space="preserve"> and the matching C#/Python validators — normative machine contracts.</w:t>
+        <w:t>tasks/​2026-​07-​27-​1911-​expert-​model-​coordinator.​md</w:t>
+      </w:r>
+      <w:r>
+        <w:rPr>
+          <w:b w:val="0"/>
+        </w:rPr>
+        <w:t xml:space="preserve"> — implementation/test history and explicit blockers.</w:t>
       </w:r>
     </w:p>
     <w:p>
@@ -12752,21 +14498,26 @@
           <w:color w:val="1F4D78"/>
           <w:sz w:val="17"/>
         </w:rPr>
-        <w:t>tools/​hyperion-​model/​candidate-​catalog.​v1.​json</w:t>
-      </w:r>
-      <w:r>
-        <w:rPr>
-          <w:b w:val="0"/>
-        </w:rPr>
-        <w:t xml:space="preserve">, </w:t>
-      </w:r>
+        <w:t>tools/​hyperion-​model/​schemas/​</w:t>
+      </w:r>
+      <w:r>
+        <w:rPr>
+          <w:b w:val="0"/>
+        </w:rPr>
+        <w:t xml:space="preserve"> and the matching C#/Python validators — normative machine contracts.</w:t>
+      </w:r>
+    </w:p>
+    <w:p>
+      <w:pPr>
+        <w:pStyle w:val="ListBullet"/>
+      </w:pPr>
       <w:r>
         <w:rPr>
           <w:rFonts w:ascii="Consolas" w:hAnsi="Consolas"/>
           <w:color w:val="1F4D78"/>
           <w:sz w:val="17"/>
         </w:rPr>
-        <w:t>base-​model-​source-​lock.​v1.​json</w:t>
+        <w:t>tools/​hyperion-​model/​candidate-​catalog.​v1.​json</w:t>
       </w:r>
       <w:r>
         <w:rPr>
@@ -12780,13 +14531,13 @@
           <w:color w:val="1F4D78"/>
           <w:sz w:val="17"/>
         </w:rPr>
-        <w:t>training-​runtime-​profile.​v1.​json</w:t>
-      </w:r>
-      <w:r>
-        <w:rPr>
-          <w:b w:val="0"/>
-        </w:rPr>
-        <w:t xml:space="preserve">, and </w:t>
+        <w:t>base-​model-​source-​lock.​v1.​json</w:t>
+      </w:r>
+      <w:r>
+        <w:rPr>
+          <w:b w:val="0"/>
+        </w:rPr>
+        <w:t xml:space="preserve">, </w:t>
       </w:r>
       <w:r>
         <w:rPr>
@@ -12794,6 +14545,20 @@
           <w:color w:val="1F4D78"/>
           <w:sz w:val="17"/>
         </w:rPr>
+        <w:t>training-​runtime-​profile.​v1.​json</w:t>
+      </w:r>
+      <w:r>
+        <w:rPr>
+          <w:b w:val="0"/>
+        </w:rPr>
+        <w:t xml:space="preserve">, and </w:t>
+      </w:r>
+      <w:r>
+        <w:rPr>
+          <w:rFonts w:ascii="Consolas" w:hAnsi="Consolas"/>
+          <w:color w:val="1F4D78"/>
+          <w:sz w:val="17"/>
+        </w:rPr>
         <w:t>pylock.train.toml</w:t>
       </w:r>
       <w:r>
@@ -12812,6 +14577,14 @@
       </w:r>
     </w:p>
     <w:p>
+      <w:r>
+        <w:rPr>
+          <w:b w:val="0"/>
+        </w:rPr>
+        <w:t>Online primary sources in sections 22.2-22.4 were accessed 31 July 2026. Model cards, services, framework APIs, availability, prices, and terms are version-sensitive and must be re-pinned for a real acquisition or experiment.</w:t>
+      </w:r>
+    </w:p>
+    <w:p>
       <w:pPr>
         <w:pStyle w:val="ListBullet"/>
       </w:pPr>
@@ -12820,29 +14593,6 @@
           <w:b w:val="0"/>
         </w:rPr>
         <w:t xml:space="preserve">Hinton et al., “Distilling the Knowledge in a Neural Network,” </w:t>
-      </w:r>
-      <w:hyperlink r:id="rId16">
-        <w:r>
-          <w:rPr>
-            <w:color w:val="2E74B5"/>
-            <w:u w:val="single"/>
-          </w:rPr>
-          <w:t>https://arxiv.org/abs/1503.02531</w:t>
-        </w:r>
-      </w:hyperlink>
-      <w:r>
-        <w:t>.</w:t>
-      </w:r>
-    </w:p>
-    <w:p>
-      <w:pPr>
-        <w:pStyle w:val="ListBullet"/>
-      </w:pPr>
-      <w:r>
-        <w:rPr>
-          <w:b w:val="0"/>
-        </w:rPr>
-        <w:t xml:space="preserve">Hsieh et al., “Distilling Step-by-Step,” </w:t>
       </w:r>
       <w:hyperlink r:id="rId17">
         <w:r>
@@ -12850,7 +14600,7 @@
             <w:color w:val="2E74B5"/>
             <w:u w:val="single"/>
           </w:rPr>
-          <w:t>https://arxiv.org/abs/2305.02301</w:t>
+          <w:t>arxiv.org / abs/1503.02531</w:t>
         </w:r>
       </w:hyperlink>
       <w:r>
@@ -12865,7 +14615,7 @@
         <w:rPr>
           <w:b w:val="0"/>
         </w:rPr>
-        <w:t xml:space="preserve">Mukherjee et al., “Orca,” </w:t>
+        <w:t xml:space="preserve">Hsieh et al., “Distilling Step-by-Step,” </w:t>
       </w:r>
       <w:hyperlink r:id="rId18">
         <w:r>
@@ -12873,7 +14623,7 @@
             <w:color w:val="2E74B5"/>
             <w:u w:val="single"/>
           </w:rPr>
-          <w:t>https://arxiv.org/abs/2306.02707</w:t>
+          <w:t>arxiv.org / abs/2305.02301</w:t>
         </w:r>
       </w:hyperlink>
       <w:r>
@@ -12888,7 +14638,7 @@
         <w:rPr>
           <w:b w:val="0"/>
         </w:rPr>
-        <w:t xml:space="preserve">Hu et al., “LoRA,” </w:t>
+        <w:t xml:space="preserve">Mukherjee et al., “Orca,” </w:t>
       </w:r>
       <w:hyperlink r:id="rId19">
         <w:r>
@@ -12896,7 +14646,7 @@
             <w:color w:val="2E74B5"/>
             <w:u w:val="single"/>
           </w:rPr>
-          <w:t>https://arxiv.org/abs/2106.09685</w:t>
+          <w:t>arxiv.org / abs/2306.02707</w:t>
         </w:r>
       </w:hyperlink>
       <w:r>
@@ -12911,7 +14661,7 @@
         <w:rPr>
           <w:b w:val="0"/>
         </w:rPr>
-        <w:t xml:space="preserve">Dettmers et al., “QLoRA,” </w:t>
+        <w:t xml:space="preserve">Hu et al., “LoRA,” </w:t>
       </w:r>
       <w:hyperlink r:id="rId20">
         <w:r>
@@ -12919,7 +14669,7 @@
             <w:color w:val="2E74B5"/>
             <w:u w:val="single"/>
           </w:rPr>
-          <w:t>https://arxiv.org/abs/2305.14314</w:t>
+          <w:t>arxiv.org / abs/2106.09685</w:t>
         </w:r>
       </w:hyperlink>
       <w:r>
@@ -12934,7 +14684,7 @@
         <w:rPr>
           <w:b w:val="0"/>
         </w:rPr>
-        <w:t xml:space="preserve">Rafailov et al., “Direct Preference Optimization,” </w:t>
+        <w:t xml:space="preserve">Dettmers et al., “QLoRA,” </w:t>
       </w:r>
       <w:hyperlink r:id="rId21">
         <w:r>
@@ -12942,7 +14692,7 @@
             <w:color w:val="2E74B5"/>
             <w:u w:val="single"/>
           </w:rPr>
-          <w:t>https://arxiv.org/abs/2305.18290</w:t>
+          <w:t>arxiv.org / abs/2305.14314</w:t>
         </w:r>
       </w:hyperlink>
       <w:r>
@@ -12957,7 +14707,7 @@
         <w:rPr>
           <w:b w:val="0"/>
         </w:rPr>
-        <w:t xml:space="preserve">Lambert et al., “Tülu 3,” </w:t>
+        <w:t xml:space="preserve">Rafailov et al., “Direct Preference Optimization,” </w:t>
       </w:r>
       <w:hyperlink r:id="rId22">
         <w:r>
@@ -12965,7 +14715,7 @@
             <w:color w:val="2E74B5"/>
             <w:u w:val="single"/>
           </w:rPr>
-          <w:t>https://arxiv.org/abs/2411.15124</w:t>
+          <w:t>arxiv.org / abs/2305.18290</w:t>
         </w:r>
       </w:hyperlink>
       <w:r>
@@ -12980,7 +14730,7 @@
         <w:rPr>
           <w:b w:val="0"/>
         </w:rPr>
-        <w:t xml:space="preserve">Hui et al., “Qwen2.5-Coder Technical Report,” </w:t>
+        <w:t xml:space="preserve">Ahmadian et al., “Back to Basics: Revisiting REINFORCE Style Optimization for Learning from Human Feedback in LLMs” (RLOO), </w:t>
       </w:r>
       <w:hyperlink r:id="rId23">
         <w:r>
@@ -12988,7 +14738,7 @@
             <w:color w:val="2E74B5"/>
             <w:u w:val="single"/>
           </w:rPr>
-          <w:t>https://arxiv.org/abs/2409.12186</w:t>
+          <w:t>arxiv.org / abs/2402.14740</w:t>
         </w:r>
       </w:hyperlink>
       <w:r>
@@ -13003,7 +14753,7 @@
         <w:rPr>
           <w:b w:val="0"/>
         </w:rPr>
-        <w:t xml:space="preserve">Qwen Team, “Qwen3 Technical Report,” </w:t>
+        <w:t xml:space="preserve">DeepSeek-AI, “DeepSeekMath” (GRPO), </w:t>
       </w:r>
       <w:hyperlink r:id="rId24">
         <w:r>
@@ -13011,7 +14761,7 @@
             <w:color w:val="2E74B5"/>
             <w:u w:val="single"/>
           </w:rPr>
-          <w:t>https://arxiv.org/abs/2505.09388</w:t>
+          <w:t>arxiv.org / abs/2402.03300</w:t>
         </w:r>
       </w:hyperlink>
       <w:r>
@@ -13026,7 +14776,7 @@
         <w:rPr>
           <w:b w:val="0"/>
         </w:rPr>
-        <w:t xml:space="preserve">DeepSeek-AI, DeepSeek-R1 report/repository, </w:t>
+        <w:t xml:space="preserve">Lightman et al., “Let's Verify Step by Step,” </w:t>
       </w:r>
       <w:hyperlink r:id="rId25">
         <w:r>
@@ -13034,7 +14784,7 @@
             <w:color w:val="2E74B5"/>
             <w:u w:val="single"/>
           </w:rPr>
-          <w:t>https://github.com/deepseek-ai/DeepSeek-R1</w:t>
+          <w:t>arxiv.org / abs/2305.20050</w:t>
         </w:r>
       </w:hyperlink>
       <w:r>
@@ -13043,21 +14793,13 @@
     </w:p>
     <w:p>
       <w:pPr>
-        <w:pStyle w:val="Heading2"/>
-      </w:pPr>
-      <w:r>
-        <w:t>22.3 Kimi K3 primary sources</w:t>
-      </w:r>
-    </w:p>
-    <w:p>
-      <w:pPr>
         <w:pStyle w:val="ListBullet"/>
       </w:pPr>
       <w:r>
         <w:rPr>
           <w:b w:val="0"/>
         </w:rPr>
-        <w:t xml:space="preserve">Kimi Team, “Kimi K3: Open Frontier Intelligence,” </w:t>
+        <w:t xml:space="preserve">Agarwal et al., “On-Policy Distillation of Language Models” (GKD), </w:t>
       </w:r>
       <w:hyperlink r:id="rId26">
         <w:r>
@@ -13065,7 +14807,7 @@
             <w:color w:val="2E74B5"/>
             <w:u w:val="single"/>
           </w:rPr>
-          <w:t>https://arxiv.org/abs/2607.24653</w:t>
+          <w:t>arxiv.org / abs/2306.13649</w:t>
         </w:r>
       </w:hyperlink>
       <w:r>
@@ -13080,7 +14822,7 @@
         <w:rPr>
           <w:b w:val="0"/>
         </w:rPr>
-        <w:t xml:space="preserve">Official report snapshot at reviewed commit: </w:t>
+        <w:t xml:space="preserve">Lambert et al., “Tülu 3,” </w:t>
       </w:r>
       <w:hyperlink r:id="rId27">
         <w:r>
@@ -13088,7 +14830,7 @@
             <w:color w:val="2E74B5"/>
             <w:u w:val="single"/>
           </w:rPr>
-          <w:t>https://github.com/MoonshotAI/Kimi-K3/blob/7c5be9599120d7993748de66a76128614f15f210/k3_tech_report.pdf</w:t>
+          <w:t>arxiv.org / abs/2411.15124</w:t>
         </w:r>
       </w:hyperlink>
       <w:r>
@@ -13103,7 +14845,7 @@
         <w:rPr>
           <w:b w:val="0"/>
         </w:rPr>
-        <w:t xml:space="preserve">Official repository, </w:t>
+        <w:t xml:space="preserve">Hui et al., “Qwen2.5-Coder Technical Report,” </w:t>
       </w:r>
       <w:hyperlink r:id="rId28">
         <w:r>
@@ -13111,7 +14853,7 @@
             <w:color w:val="2E74B5"/>
             <w:u w:val="single"/>
           </w:rPr>
-          <w:t>https://github.com/MoonshotAI/Kimi-K3</w:t>
+          <w:t>arxiv.org / abs/2409.12186</w:t>
         </w:r>
       </w:hyperlink>
       <w:r>
@@ -13126,7 +14868,7 @@
         <w:rPr>
           <w:b w:val="0"/>
         </w:rPr>
-        <w:t xml:space="preserve">Official model page, </w:t>
+        <w:t xml:space="preserve">Qwen Team, “Qwen3 Technical Report,” </w:t>
       </w:r>
       <w:hyperlink r:id="rId29">
         <w:r>
@@ -13134,7 +14876,7 @@
             <w:color w:val="2E74B5"/>
             <w:u w:val="single"/>
           </w:rPr>
-          <w:t>https://huggingface.co/moonshotai/Kimi-K3</w:t>
+          <w:t>arxiv.org / abs/2505.09388</w:t>
         </w:r>
       </w:hyperlink>
       <w:r>
@@ -13149,7 +14891,7 @@
         <w:rPr>
           <w:b w:val="0"/>
         </w:rPr>
-        <w:t xml:space="preserve">Reviewed licence snapshot: </w:t>
+        <w:t xml:space="preserve">DeepSeek-AI, DeepSeek-R1 report/repository, </w:t>
       </w:r>
       <w:hyperlink r:id="rId30">
         <w:r>
@@ -13157,7 +14899,7 @@
             <w:color w:val="2E74B5"/>
             <w:u w:val="single"/>
           </w:rPr>
-          <w:t>https://github.com/MoonshotAI/Kimi-K3/blob/7c5be9599120d7993748de66a76128614f15f210/LICENSE</w:t>
+          <w:t>github.com / deepseek-ai/DeepSeek-R1</w:t>
         </w:r>
       </w:hyperlink>
       <w:r>
@@ -13169,7 +14911,7 @@
         <w:pStyle w:val="Heading2"/>
       </w:pPr>
       <w:r>
-        <w:t>22.4 Evaluation, orchestration, serving, and custody</w:t>
+        <w:t>22.3 Frontier-model and Kimi K3 primary sources</w:t>
       </w:r>
     </w:p>
     <w:p>
@@ -13180,7 +14922,7 @@
         <w:rPr>
           <w:b w:val="0"/>
         </w:rPr>
-        <w:t xml:space="preserve">Jimenez et al., “SWE-bench,” </w:t>
+        <w:t xml:space="preserve">OpenAI, latest-model guide, </w:t>
       </w:r>
       <w:hyperlink r:id="rId31">
         <w:r>
@@ -13188,22 +14930,17 @@
             <w:color w:val="2E74B5"/>
             <w:u w:val="single"/>
           </w:rPr>
-          <w:t>https://arxiv.org/abs/2310.06770</w:t>
+          <w:t>developers.openai.com / guides/latest-model</w:t>
         </w:r>
       </w:hyperlink>
       <w:r>
-        <w:t>.</w:t>
-      </w:r>
-    </w:p>
-    <w:p>
-      <w:pPr>
-        <w:pStyle w:val="ListBullet"/>
-      </w:pPr>
-      <w:r>
-        <w:rPr>
-          <w:b w:val="0"/>
-        </w:rPr>
-        <w:t xml:space="preserve">Jain et al., “LiveCodeBench,” </w:t>
+        <w:t>,</w:t>
+      </w:r>
+      <w:r>
+        <w:rPr>
+          <w:b w:val="0"/>
+        </w:rPr>
+        <w:t xml:space="preserve"> and gpt-oss repository, </w:t>
       </w:r>
       <w:hyperlink r:id="rId32">
         <w:r>
@@ -13211,7 +14948,7 @@
             <w:color w:val="2E74B5"/>
             <w:u w:val="single"/>
           </w:rPr>
-          <w:t>https://arxiv.org/abs/2403.07974</w:t>
+          <w:t>github.com / openai/gpt-oss</w:t>
         </w:r>
       </w:hyperlink>
       <w:r>
@@ -13226,7 +14963,7 @@
         <w:rPr>
           <w:b w:val="0"/>
         </w:rPr>
-        <w:t xml:space="preserve">Anthropic, “Building effective agents,” </w:t>
+        <w:t xml:space="preserve">Qwen, Qwen3, </w:t>
       </w:r>
       <w:hyperlink r:id="rId33">
         <w:r>
@@ -13234,22 +14971,17 @@
             <w:color w:val="2E74B5"/>
             <w:u w:val="single"/>
           </w:rPr>
-          <w:t>https://www.anthropic.com/research/building-effective-agents</w:t>
+          <w:t>github.com / QwenLM/Qwen3</w:t>
         </w:r>
       </w:hyperlink>
       <w:r>
-        <w:t>.</w:t>
-      </w:r>
-    </w:p>
-    <w:p>
-      <w:pPr>
-        <w:pStyle w:val="ListBullet"/>
-      </w:pPr>
-      <w:r>
-        <w:rPr>
-          <w:b w:val="0"/>
-        </w:rPr>
-        <w:t xml:space="preserve">vLLM serving documentation, </w:t>
+        <w:t>;</w:t>
+      </w:r>
+      <w:r>
+        <w:rPr>
+          <w:b w:val="0"/>
+        </w:rPr>
+        <w:t xml:space="preserve"> Qwen3-Coder, </w:t>
       </w:r>
       <w:hyperlink r:id="rId34">
         <w:r>
@@ -13257,22 +14989,17 @@
             <w:color w:val="2E74B5"/>
             <w:u w:val="single"/>
           </w:rPr>
-          <w:t>https://docs.vllm.ai/en/latest/cli/serve/</w:t>
+          <w:t>github.com / QwenLM/Qwen3-Coder</w:t>
         </w:r>
       </w:hyperlink>
       <w:r>
-        <w:t>.</w:t>
-      </w:r>
-    </w:p>
-    <w:p>
-      <w:pPr>
-        <w:pStyle w:val="ListBullet"/>
-      </w:pPr>
-      <w:r>
-        <w:rPr>
-          <w:b w:val="0"/>
-        </w:rPr>
-        <w:t xml:space="preserve">Python Packaging Authority, PEP 751, </w:t>
+        <w:t>;</w:t>
+      </w:r>
+      <w:r>
+        <w:rPr>
+          <w:b w:val="0"/>
+        </w:rPr>
+        <w:t xml:space="preserve"> and Qwen3.5-397B-A17B, </w:t>
       </w:r>
       <w:hyperlink r:id="rId35">
         <w:r>
@@ -13280,7 +15007,7 @@
             <w:color w:val="2E74B5"/>
             <w:u w:val="single"/>
           </w:rPr>
-          <w:t>https://peps.python.org/pep-0751/</w:t>
+          <w:t>huggingface.co / Qwen/Qwen3.5-397B-A17B</w:t>
         </w:r>
       </w:hyperlink>
       <w:r>
@@ -13295,21 +15022,7 @@
         <w:rPr>
           <w:b w:val="0"/>
         </w:rPr>
-        <w:t xml:space="preserve">Astral, </w:t>
-      </w:r>
-      <w:r>
-        <w:rPr>
-          <w:rFonts w:ascii="Consolas" w:hAnsi="Consolas"/>
-          <w:color w:val="1F4D78"/>
-          <w:sz w:val="17"/>
-        </w:rPr>
-        <w:t>uv pip compile</w:t>
-      </w:r>
-      <w:r>
-        <w:rPr>
-          <w:b w:val="0"/>
-        </w:rPr>
-        <w:t xml:space="preserve">, </w:t>
+        <w:t xml:space="preserve">DeepSeek-AI, DeepSeek-V3, </w:t>
       </w:r>
       <w:hyperlink r:id="rId36">
         <w:r>
@@ -13317,22 +15030,17 @@
             <w:color w:val="2E74B5"/>
             <w:u w:val="single"/>
           </w:rPr>
-          <w:t>https://docs.astral.sh/uv/pip/compile/</w:t>
+          <w:t>github.com / deepseek-ai/DeepSeek-V3</w:t>
         </w:r>
       </w:hyperlink>
       <w:r>
-        <w:t>.</w:t>
-      </w:r>
-    </w:p>
-    <w:p>
-      <w:pPr>
-        <w:pStyle w:val="ListBullet"/>
-      </w:pPr>
-      <w:r>
-        <w:rPr>
-          <w:b w:val="0"/>
-        </w:rPr>
-        <w:t xml:space="preserve">IETF RFC 7518 §3.4 (ECDSA/JWA), </w:t>
+        <w:t>,</w:t>
+      </w:r>
+      <w:r>
+        <w:rPr>
+          <w:b w:val="0"/>
+        </w:rPr>
+        <w:t xml:space="preserve"> and DeepSeek-V3.2-Exp, </w:t>
       </w:r>
       <w:hyperlink r:id="rId37">
         <w:r>
@@ -13340,7 +15048,7 @@
             <w:color w:val="2E74B5"/>
             <w:u w:val="single"/>
           </w:rPr>
-          <w:t>https://www.rfc-editor.org/rfc/rfc7518#section-3.4</w:t>
+          <w:t>github.com / deepseek-ai/DeepSeek-V3.2-Exp</w:t>
         </w:r>
       </w:hyperlink>
       <w:r>
@@ -13355,21 +15063,7 @@
         <w:rPr>
           <w:b w:val="0"/>
         </w:rPr>
-        <w:t xml:space="preserve">AWS KMS </w:t>
-      </w:r>
-      <w:r>
-        <w:rPr>
-          <w:rFonts w:ascii="Consolas" w:hAnsi="Consolas"/>
-          <w:color w:val="1F4D78"/>
-          <w:sz w:val="17"/>
-        </w:rPr>
-        <w:t>Sign</w:t>
-      </w:r>
-      <w:r>
-        <w:rPr>
-          <w:b w:val="0"/>
-        </w:rPr>
-        <w:t xml:space="preserve">, </w:t>
+        <w:t xml:space="preserve">Z.ai, GLM-5, </w:t>
       </w:r>
       <w:hyperlink r:id="rId38">
         <w:r>
@@ -13377,36 +15071,17 @@
             <w:color w:val="2E74B5"/>
             <w:u w:val="single"/>
           </w:rPr>
-          <w:t>https://docs.aws.amazon.com/kms/latest/APIReference/API_Sign.html</w:t>
+          <w:t>github.com / zai-org/GLM-5</w:t>
         </w:r>
       </w:hyperlink>
       <w:r>
-        <w:t>.</w:t>
-      </w:r>
-    </w:p>
-    <w:p>
-      <w:pPr>
-        <w:pStyle w:val="ListBullet"/>
-      </w:pPr>
-      <w:r>
-        <w:rPr>
-          <w:b w:val="0"/>
-        </w:rPr>
-        <w:t xml:space="preserve">Azure Key Vault </w:t>
-      </w:r>
-      <w:r>
-        <w:rPr>
-          <w:rFonts w:ascii="Consolas" w:hAnsi="Consolas"/>
-          <w:color w:val="1F4D78"/>
-          <w:sz w:val="17"/>
-        </w:rPr>
-        <w:t>sign</w:t>
-      </w:r>
-      <w:r>
-        <w:rPr>
-          <w:b w:val="0"/>
-        </w:rPr>
-        <w:t xml:space="preserve">, </w:t>
+        <w:t>,</w:t>
+      </w:r>
+      <w:r>
+        <w:rPr>
+          <w:b w:val="0"/>
+        </w:rPr>
+        <w:t xml:space="preserve"> and GLM-5.2, </w:t>
       </w:r>
       <w:hyperlink r:id="rId39">
         <w:r>
@@ -13414,7 +15089,7 @@
             <w:color w:val="2E74B5"/>
             <w:u w:val="single"/>
           </w:rPr>
-          <w:t>https://learn.microsoft.com/en-us/rest/api/keyvault/keys/sign/sign</w:t>
+          <w:t>z.ai / blog/glm-5.2</w:t>
         </w:r>
       </w:hyperlink>
       <w:r>
@@ -13429,21 +15104,7 @@
         <w:rPr>
           <w:b w:val="0"/>
         </w:rPr>
-        <w:t xml:space="preserve">Google Cloud KMS </w:t>
-      </w:r>
-      <w:r>
-        <w:rPr>
-          <w:rFonts w:ascii="Consolas" w:hAnsi="Consolas"/>
-          <w:color w:val="1F4D78"/>
-          <w:sz w:val="17"/>
-        </w:rPr>
-        <w:t>asymmetricSign</w:t>
-      </w:r>
-      <w:r>
-        <w:rPr>
-          <w:b w:val="0"/>
-        </w:rPr>
-        <w:t xml:space="preserve">, </w:t>
+        <w:t xml:space="preserve">Meta, Llama 4 architecture announcement, </w:t>
       </w:r>
       <w:hyperlink r:id="rId40">
         <w:r>
@@ -13451,7 +15112,841 @@
             <w:color w:val="2E74B5"/>
             <w:u w:val="single"/>
           </w:rPr>
-          <w:t>https://cloud.google.com/kms/docs/reference/rest/v1/projects.locations.keyRings.cryptoKeys.cryptoKeyVersions/asymmetricSign</w:t>
+          <w:t>ai.meta.com / blog/llama-4-multimodal-intelligence</w:t>
+        </w:r>
+      </w:hyperlink>
+      <w:r>
+        <w:t>.</w:t>
+      </w:r>
+    </w:p>
+    <w:p>
+      <w:pPr>
+        <w:pStyle w:val="ListBullet"/>
+      </w:pPr>
+      <w:r>
+        <w:rPr>
+          <w:b w:val="0"/>
+        </w:rPr>
+        <w:t xml:space="preserve">Google DeepMind, Gemini 3.1 Pro model card, </w:t>
+      </w:r>
+      <w:hyperlink r:id="rId41">
+        <w:r>
+          <w:rPr>
+            <w:color w:val="2E74B5"/>
+            <w:u w:val="single"/>
+          </w:rPr>
+          <w:t>deepmind.google / model-cards/gemini-3-1-pro</w:t>
+        </w:r>
+      </w:hyperlink>
+      <w:r>
+        <w:t>.</w:t>
+      </w:r>
+    </w:p>
+    <w:p>
+      <w:pPr>
+        <w:pStyle w:val="ListBullet"/>
+      </w:pPr>
+      <w:r>
+        <w:rPr>
+          <w:b w:val="0"/>
+        </w:rPr>
+        <w:t xml:space="preserve">Anthropic, Claude Fable 5/Mythos 5 announcement, </w:t>
+      </w:r>
+      <w:hyperlink r:id="rId42">
+        <w:r>
+          <w:rPr>
+            <w:color w:val="2E74B5"/>
+            <w:u w:val="single"/>
+          </w:rPr>
+          <w:t>anthropic.com / news/claude-fable-5-mythos-5</w:t>
+        </w:r>
+      </w:hyperlink>
+      <w:r>
+        <w:t>.</w:t>
+      </w:r>
+    </w:p>
+    <w:p>
+      <w:pPr>
+        <w:pStyle w:val="ListBullet"/>
+      </w:pPr>
+      <w:r>
+        <w:rPr>
+          <w:b w:val="0"/>
+        </w:rPr>
+        <w:t xml:space="preserve">MiniMax, MiniMax-M2.5 model card, </w:t>
+      </w:r>
+      <w:hyperlink r:id="rId43">
+        <w:r>
+          <w:rPr>
+            <w:color w:val="2E74B5"/>
+            <w:u w:val="single"/>
+          </w:rPr>
+          <w:t>huggingface.co / MiniMaxAI/MiniMax-M2.5</w:t>
+        </w:r>
+      </w:hyperlink>
+      <w:r>
+        <w:t>.</w:t>
+      </w:r>
+    </w:p>
+    <w:p>
+      <w:pPr>
+        <w:pStyle w:val="ListBullet"/>
+      </w:pPr>
+      <w:r>
+        <w:rPr>
+          <w:b w:val="0"/>
+        </w:rPr>
+        <w:t xml:space="preserve">TII, Falcon-H1-34B model card, </w:t>
+      </w:r>
+      <w:hyperlink r:id="rId44">
+        <w:r>
+          <w:rPr>
+            <w:color w:val="2E74B5"/>
+            <w:u w:val="single"/>
+          </w:rPr>
+          <w:t>huggingface.co / tiiuae/Falcon-H1-34B-Base</w:t>
+        </w:r>
+      </w:hyperlink>
+      <w:r>
+        <w:t>.</w:t>
+      </w:r>
+    </w:p>
+    <w:p>
+      <w:pPr>
+        <w:pStyle w:val="ListBullet"/>
+      </w:pPr>
+      <w:r>
+        <w:rPr>
+          <w:b w:val="0"/>
+        </w:rPr>
+        <w:t xml:space="preserve">Mistral, Devstral Small 2 24B model card, </w:t>
+      </w:r>
+      <w:hyperlink r:id="rId45">
+        <w:r>
+          <w:rPr>
+            <w:color w:val="2E74B5"/>
+            <w:u w:val="single"/>
+          </w:rPr>
+          <w:t>huggingface.co / mistralai/Devstral-Small-2-24B-Instruct-2512</w:t>
+        </w:r>
+      </w:hyperlink>
+      <w:r>
+        <w:t>.</w:t>
+      </w:r>
+    </w:p>
+    <w:p>
+      <w:pPr>
+        <w:pStyle w:val="ListBullet"/>
+      </w:pPr>
+      <w:r>
+        <w:rPr>
+          <w:b w:val="0"/>
+        </w:rPr>
+        <w:t xml:space="preserve">Kimi Team, “Kimi K3: Open Frontier Intelligence,” </w:t>
+      </w:r>
+      <w:hyperlink r:id="rId46">
+        <w:r>
+          <w:rPr>
+            <w:color w:val="2E74B5"/>
+            <w:u w:val="single"/>
+          </w:rPr>
+          <w:t>arxiv.org / abs/2607.24653</w:t>
+        </w:r>
+      </w:hyperlink>
+      <w:r>
+        <w:t>.</w:t>
+      </w:r>
+    </w:p>
+    <w:p>
+      <w:pPr>
+        <w:pStyle w:val="ListBullet"/>
+      </w:pPr>
+      <w:r>
+        <w:rPr>
+          <w:b w:val="0"/>
+        </w:rPr>
+        <w:t xml:space="preserve">Official report snapshot at reviewed commit: </w:t>
+      </w:r>
+      <w:hyperlink r:id="rId47">
+        <w:r>
+          <w:rPr>
+            <w:color w:val="2E74B5"/>
+            <w:u w:val="single"/>
+          </w:rPr>
+          <w:t>github.com / 7c5be9599120d7993748de66a76128614f15f210/k3_tech_report.pdf</w:t>
+        </w:r>
+      </w:hyperlink>
+      <w:r>
+        <w:t>.</w:t>
+      </w:r>
+    </w:p>
+    <w:p>
+      <w:pPr>
+        <w:pStyle w:val="ListBullet"/>
+      </w:pPr>
+      <w:r>
+        <w:rPr>
+          <w:b w:val="0"/>
+        </w:rPr>
+        <w:t xml:space="preserve">Official repository, </w:t>
+      </w:r>
+      <w:hyperlink r:id="rId48">
+        <w:r>
+          <w:rPr>
+            <w:color w:val="2E74B5"/>
+            <w:u w:val="single"/>
+          </w:rPr>
+          <w:t>github.com / MoonshotAI/Kimi-K3</w:t>
+        </w:r>
+      </w:hyperlink>
+      <w:r>
+        <w:t>.</w:t>
+      </w:r>
+    </w:p>
+    <w:p>
+      <w:pPr>
+        <w:pStyle w:val="ListBullet"/>
+      </w:pPr>
+      <w:r>
+        <w:rPr>
+          <w:b w:val="0"/>
+        </w:rPr>
+        <w:t xml:space="preserve">Official model page, </w:t>
+      </w:r>
+      <w:hyperlink r:id="rId49">
+        <w:r>
+          <w:rPr>
+            <w:color w:val="2E74B5"/>
+            <w:u w:val="single"/>
+          </w:rPr>
+          <w:t>huggingface.co / moonshotai/Kimi-K3</w:t>
+        </w:r>
+      </w:hyperlink>
+      <w:r>
+        <w:t>.</w:t>
+      </w:r>
+    </w:p>
+    <w:p>
+      <w:pPr>
+        <w:pStyle w:val="ListBullet"/>
+      </w:pPr>
+      <w:r>
+        <w:rPr>
+          <w:b w:val="0"/>
+        </w:rPr>
+        <w:t xml:space="preserve">Reviewed licence snapshot: </w:t>
+      </w:r>
+      <w:hyperlink r:id="rId50">
+        <w:r>
+          <w:rPr>
+            <w:color w:val="2E74B5"/>
+            <w:u w:val="single"/>
+          </w:rPr>
+          <w:t>github.com / 7c5be9599120d7993748de66a76128614f15f210/LICENSE</w:t>
+        </w:r>
+      </w:hyperlink>
+      <w:r>
+        <w:t>.</w:t>
+      </w:r>
+    </w:p>
+    <w:p>
+      <w:pPr>
+        <w:pStyle w:val="Heading2"/>
+      </w:pPr>
+      <w:r>
+        <w:t>22.4 Evaluation, orchestration, serving, and custody</w:t>
+      </w:r>
+    </w:p>
+    <w:p>
+      <w:pPr>
+        <w:pStyle w:val="ListBullet"/>
+      </w:pPr>
+      <w:r>
+        <w:rPr>
+          <w:b w:val="0"/>
+        </w:rPr>
+        <w:t xml:space="preserve">Jimenez et al., “SWE-bench,” </w:t>
+      </w:r>
+      <w:hyperlink r:id="rId51">
+        <w:r>
+          <w:rPr>
+            <w:color w:val="2E74B5"/>
+            <w:u w:val="single"/>
+          </w:rPr>
+          <w:t>arxiv.org / abs/2310.06770</w:t>
+        </w:r>
+      </w:hyperlink>
+      <w:r>
+        <w:t>.</w:t>
+      </w:r>
+    </w:p>
+    <w:p>
+      <w:pPr>
+        <w:pStyle w:val="ListBullet"/>
+      </w:pPr>
+      <w:r>
+        <w:rPr>
+          <w:b w:val="0"/>
+        </w:rPr>
+        <w:t xml:space="preserve">Jain et al., “LiveCodeBench,” </w:t>
+      </w:r>
+      <w:hyperlink r:id="rId52">
+        <w:r>
+          <w:rPr>
+            <w:color w:val="2E74B5"/>
+            <w:u w:val="single"/>
+          </w:rPr>
+          <w:t>arxiv.org / abs/2403.07974</w:t>
+        </w:r>
+      </w:hyperlink>
+      <w:r>
+        <w:t>.</w:t>
+      </w:r>
+    </w:p>
+    <w:p>
+      <w:pPr>
+        <w:pStyle w:val="ListBullet"/>
+      </w:pPr>
+      <w:r>
+        <w:rPr>
+          <w:b w:val="0"/>
+        </w:rPr>
+        <w:t xml:space="preserve">Yao et al., “ReAct,” </w:t>
+      </w:r>
+      <w:hyperlink r:id="rId53">
+        <w:r>
+          <w:rPr>
+            <w:color w:val="2E74B5"/>
+            <w:u w:val="single"/>
+          </w:rPr>
+          <w:t>arxiv.org / abs/2210.03629</w:t>
+        </w:r>
+      </w:hyperlink>
+      <w:r>
+        <w:t>.</w:t>
+      </w:r>
+    </w:p>
+    <w:p>
+      <w:pPr>
+        <w:pStyle w:val="ListBullet"/>
+      </w:pPr>
+      <w:r>
+        <w:rPr>
+          <w:b w:val="0"/>
+        </w:rPr>
+        <w:t xml:space="preserve">Zhou et al., “tau-bench,” </w:t>
+      </w:r>
+      <w:hyperlink r:id="rId54">
+        <w:r>
+          <w:rPr>
+            <w:color w:val="2E74B5"/>
+            <w:u w:val="single"/>
+          </w:rPr>
+          <w:t>arxiv.org / abs/2406.12045</w:t>
+        </w:r>
+      </w:hyperlink>
+      <w:r>
+        <w:t>,</w:t>
+      </w:r>
+      <w:r>
+        <w:rPr>
+          <w:b w:val="0"/>
+        </w:rPr>
+        <w:t xml:space="preserve"> and Wu et al., “ToolSandbox,” </w:t>
+      </w:r>
+      <w:hyperlink r:id="rId55">
+        <w:r>
+          <w:rPr>
+            <w:color w:val="2E74B5"/>
+            <w:u w:val="single"/>
+          </w:rPr>
+          <w:t>arxiv.org / abs/2408.04682</w:t>
+        </w:r>
+      </w:hyperlink>
+      <w:r>
+        <w:t>.</w:t>
+      </w:r>
+    </w:p>
+    <w:p>
+      <w:pPr>
+        <w:pStyle w:val="ListBullet"/>
+      </w:pPr>
+      <w:r>
+        <w:rPr>
+          <w:b w:val="0"/>
+        </w:rPr>
+        <w:t xml:space="preserve">Liang et al., “HELM,” </w:t>
+      </w:r>
+      <w:hyperlink r:id="rId56">
+        <w:r>
+          <w:rPr>
+            <w:color w:val="2E74B5"/>
+            <w:u w:val="single"/>
+          </w:rPr>
+          <w:t>arxiv.org / abs/2211.09110</w:t>
+        </w:r>
+      </w:hyperlink>
+      <w:r>
+        <w:t>,</w:t>
+      </w:r>
+      <w:r>
+        <w:rPr>
+          <w:b w:val="0"/>
+        </w:rPr>
+        <w:t xml:space="preserve"> and Zhou et al., “IFEval,” </w:t>
+      </w:r>
+      <w:hyperlink r:id="rId57">
+        <w:r>
+          <w:rPr>
+            <w:color w:val="2E74B5"/>
+            <w:u w:val="single"/>
+          </w:rPr>
+          <w:t>arxiv.org / abs/2311.07911</w:t>
+        </w:r>
+      </w:hyperlink>
+      <w:r>
+        <w:t>.</w:t>
+      </w:r>
+    </w:p>
+    <w:p>
+      <w:pPr>
+        <w:pStyle w:val="ListBullet"/>
+      </w:pPr>
+      <w:r>
+        <w:rPr>
+          <w:b w:val="0"/>
+        </w:rPr>
+        <w:t xml:space="preserve">Anthropic, “Building effective agents,” </w:t>
+      </w:r>
+      <w:hyperlink r:id="rId58">
+        <w:r>
+          <w:rPr>
+            <w:color w:val="2E74B5"/>
+            <w:u w:val="single"/>
+          </w:rPr>
+          <w:t>anthropic.com / research/building-effective-agents</w:t>
+        </w:r>
+      </w:hyperlink>
+      <w:r>
+        <w:t>.</w:t>
+      </w:r>
+    </w:p>
+    <w:p>
+      <w:pPr>
+        <w:pStyle w:val="ListBullet"/>
+      </w:pPr>
+      <w:r>
+        <w:rPr>
+          <w:b w:val="0"/>
+        </w:rPr>
+        <w:t xml:space="preserve">vLLM serving documentation, </w:t>
+      </w:r>
+      <w:hyperlink r:id="rId59">
+        <w:r>
+          <w:rPr>
+            <w:color w:val="2E74B5"/>
+            <w:u w:val="single"/>
+          </w:rPr>
+          <w:t>docs.vllm.ai / cli/serve</w:t>
+        </w:r>
+      </w:hyperlink>
+      <w:r>
+        <w:t>.</w:t>
+      </w:r>
+    </w:p>
+    <w:p>
+      <w:pPr>
+        <w:pStyle w:val="ListBullet"/>
+      </w:pPr>
+      <w:r>
+        <w:rPr>
+          <w:b w:val="0"/>
+        </w:rPr>
+        <w:t xml:space="preserve">SGLang repository, </w:t>
+      </w:r>
+      <w:hyperlink r:id="rId60">
+        <w:r>
+          <w:rPr>
+            <w:color w:val="2E74B5"/>
+            <w:u w:val="single"/>
+          </w:rPr>
+          <w:t>github.com / sgl-project/sglang</w:t>
+        </w:r>
+      </w:hyperlink>
+      <w:r>
+        <w:t>,</w:t>
+      </w:r>
+      <w:r>
+        <w:rPr>
+          <w:b w:val="0"/>
+        </w:rPr>
+        <w:t xml:space="preserve"> and NVIDIA TensorRT-LLM, </w:t>
+      </w:r>
+      <w:hyperlink r:id="rId61">
+        <w:r>
+          <w:rPr>
+            <w:color w:val="2E74B5"/>
+            <w:u w:val="single"/>
+          </w:rPr>
+          <w:t>github.com / NVIDIA/TensorRT-LLM</w:t>
+        </w:r>
+      </w:hyperlink>
+      <w:r>
+        <w:t>.</w:t>
+      </w:r>
+    </w:p>
+    <w:p>
+      <w:pPr>
+        <w:pStyle w:val="ListBullet"/>
+      </w:pPr>
+      <w:r>
+        <w:rPr>
+          <w:b w:val="0"/>
+        </w:rPr>
+        <w:t xml:space="preserve">Dao et al., “FlashAttention,” </w:t>
+      </w:r>
+      <w:hyperlink r:id="rId62">
+        <w:r>
+          <w:rPr>
+            <w:color w:val="2E74B5"/>
+            <w:u w:val="single"/>
+          </w:rPr>
+          <w:t>arxiv.org / abs/2205.14135</w:t>
+        </w:r>
+      </w:hyperlink>
+      <w:r>
+        <w:t>,</w:t>
+      </w:r>
+      <w:r>
+        <w:rPr>
+          <w:b w:val="0"/>
+        </w:rPr>
+        <w:t xml:space="preserve"> and FlashAttention-2, </w:t>
+      </w:r>
+      <w:hyperlink r:id="rId63">
+        <w:r>
+          <w:rPr>
+            <w:color w:val="2E74B5"/>
+            <w:u w:val="single"/>
+          </w:rPr>
+          <w:t>arxiv.org / abs/2307.08691</w:t>
+        </w:r>
+      </w:hyperlink>
+      <w:r>
+        <w:t>.</w:t>
+      </w:r>
+    </w:p>
+    <w:p>
+      <w:pPr>
+        <w:pStyle w:val="ListBullet"/>
+      </w:pPr>
+      <w:r>
+        <w:rPr>
+          <w:b w:val="0"/>
+        </w:rPr>
+        <w:t xml:space="preserve">PyTorch FSDP, </w:t>
+      </w:r>
+      <w:hyperlink r:id="rId64">
+        <w:r>
+          <w:rPr>
+            <w:color w:val="2E74B5"/>
+            <w:u w:val="single"/>
+          </w:rPr>
+          <w:t>docs.pytorch.org / stable/fsdp.html</w:t>
+        </w:r>
+      </w:hyperlink>
+      <w:r>
+        <w:t>,</w:t>
+      </w:r>
+      <w:r>
+        <w:rPr>
+          <w:b w:val="0"/>
+        </w:rPr>
+        <w:t xml:space="preserve"> and TorchTitan, </w:t>
+      </w:r>
+      <w:hyperlink r:id="rId65">
+        <w:r>
+          <w:rPr>
+            <w:color w:val="2E74B5"/>
+            <w:u w:val="single"/>
+          </w:rPr>
+          <w:t>github.com / pytorch/torchtitan</w:t>
+        </w:r>
+      </w:hyperlink>
+      <w:r>
+        <w:t>.</w:t>
+      </w:r>
+    </w:p>
+    <w:p>
+      <w:pPr>
+        <w:pStyle w:val="ListBullet"/>
+      </w:pPr>
+      <w:r>
+        <w:rPr>
+          <w:b w:val="0"/>
+        </w:rPr>
+        <w:t xml:space="preserve">DeepSpeed ZeRO, </w:t>
+      </w:r>
+      <w:hyperlink r:id="rId66">
+        <w:r>
+          <w:rPr>
+            <w:color w:val="2E74B5"/>
+            <w:u w:val="single"/>
+          </w:rPr>
+          <w:t>arxiv.org / abs/1910.02054</w:t>
+        </w:r>
+      </w:hyperlink>
+      <w:r>
+        <w:t>,</w:t>
+      </w:r>
+      <w:r>
+        <w:rPr>
+          <w:b w:val="0"/>
+        </w:rPr>
+        <w:t xml:space="preserve"> and NVIDIA Megatron-LM, </w:t>
+      </w:r>
+      <w:hyperlink r:id="rId67">
+        <w:r>
+          <w:rPr>
+            <w:color w:val="2E74B5"/>
+            <w:u w:val="single"/>
+          </w:rPr>
+          <w:t>github.com / NVIDIA/Megatron-LM</w:t>
+        </w:r>
+      </w:hyperlink>
+      <w:r>
+        <w:t>.</w:t>
+      </w:r>
+    </w:p>
+    <w:p>
+      <w:pPr>
+        <w:pStyle w:val="ListBullet"/>
+      </w:pPr>
+      <w:r>
+        <w:rPr>
+          <w:b w:val="0"/>
+        </w:rPr>
+        <w:t xml:space="preserve">Slurm documentation, </w:t>
+      </w:r>
+      <w:hyperlink r:id="rId68">
+        <w:r>
+          <w:rPr>
+            <w:color w:val="2E74B5"/>
+            <w:u w:val="single"/>
+          </w:rPr>
+          <w:t>slurm.schedmd.com / documentation.html</w:t>
+        </w:r>
+      </w:hyperlink>
+      <w:r>
+        <w:t>,</w:t>
+      </w:r>
+      <w:r>
+        <w:rPr>
+          <w:b w:val="0"/>
+        </w:rPr>
+        <w:t xml:space="preserve"> and NVIDIA NCCL, </w:t>
+      </w:r>
+      <w:hyperlink r:id="rId69">
+        <w:r>
+          <w:rPr>
+            <w:color w:val="2E74B5"/>
+            <w:u w:val="single"/>
+          </w:rPr>
+          <w:t>docs.nvidia.com / user-guide/docs</w:t>
+        </w:r>
+      </w:hyperlink>
+      <w:r>
+        <w:t>.</w:t>
+      </w:r>
+    </w:p>
+    <w:p>
+      <w:pPr>
+        <w:pStyle w:val="ListBullet"/>
+      </w:pPr>
+      <w:r>
+        <w:rPr>
+          <w:b w:val="0"/>
+        </w:rPr>
+        <w:t xml:space="preserve">Python Packaging Authority, PEP 751, </w:t>
+      </w:r>
+      <w:hyperlink r:id="rId70">
+        <w:r>
+          <w:rPr>
+            <w:color w:val="2E74B5"/>
+            <w:u w:val="single"/>
+          </w:rPr>
+          <w:t>peps.python.org / pep-0751</w:t>
+        </w:r>
+      </w:hyperlink>
+      <w:r>
+        <w:t>.</w:t>
+      </w:r>
+    </w:p>
+    <w:p>
+      <w:pPr>
+        <w:pStyle w:val="ListBullet"/>
+      </w:pPr>
+      <w:r>
+        <w:rPr>
+          <w:b w:val="0"/>
+        </w:rPr>
+        <w:t xml:space="preserve">Astral, </w:t>
+      </w:r>
+      <w:r>
+        <w:rPr>
+          <w:rFonts w:ascii="Consolas" w:hAnsi="Consolas"/>
+          <w:color w:val="1F4D78"/>
+          <w:sz w:val="17"/>
+        </w:rPr>
+        <w:t>uv pip compile</w:t>
+      </w:r>
+      <w:r>
+        <w:rPr>
+          <w:b w:val="0"/>
+        </w:rPr>
+        <w:t xml:space="preserve">, </w:t>
+      </w:r>
+      <w:hyperlink r:id="rId71">
+        <w:r>
+          <w:rPr>
+            <w:color w:val="2E74B5"/>
+            <w:u w:val="single"/>
+          </w:rPr>
+          <w:t>docs.astral.sh / pip/compile</w:t>
+        </w:r>
+      </w:hyperlink>
+      <w:r>
+        <w:t>.</w:t>
+      </w:r>
+    </w:p>
+    <w:p>
+      <w:pPr>
+        <w:pStyle w:val="ListBullet"/>
+      </w:pPr>
+      <w:r>
+        <w:rPr>
+          <w:b w:val="0"/>
+        </w:rPr>
+        <w:t xml:space="preserve">IETF RFC 7518 §3.4 (ECDSA/JWA), </w:t>
+      </w:r>
+      <w:hyperlink r:id="rId72">
+        <w:r>
+          <w:rPr>
+            <w:color w:val="2E74B5"/>
+            <w:u w:val="single"/>
+          </w:rPr>
+          <w:t>rfc-editor.org / rfc/rfc7518</w:t>
+        </w:r>
+      </w:hyperlink>
+      <w:r>
+        <w:t>.</w:t>
+      </w:r>
+    </w:p>
+    <w:p>
+      <w:pPr>
+        <w:pStyle w:val="ListBullet"/>
+      </w:pPr>
+      <w:r>
+        <w:rPr>
+          <w:b w:val="0"/>
+        </w:rPr>
+        <w:t xml:space="preserve">AWS KMS </w:t>
+      </w:r>
+      <w:r>
+        <w:rPr>
+          <w:rFonts w:ascii="Consolas" w:hAnsi="Consolas"/>
+          <w:color w:val="1F4D78"/>
+          <w:sz w:val="17"/>
+        </w:rPr>
+        <w:t>Sign</w:t>
+      </w:r>
+      <w:r>
+        <w:rPr>
+          <w:b w:val="0"/>
+        </w:rPr>
+        <w:t xml:space="preserve">, </w:t>
+      </w:r>
+      <w:hyperlink r:id="rId73">
+        <w:r>
+          <w:rPr>
+            <w:color w:val="2E74B5"/>
+            <w:u w:val="single"/>
+          </w:rPr>
+          <w:t>docs.aws.amazon.com / APIReference/API_Sign.html</w:t>
+        </w:r>
+      </w:hyperlink>
+      <w:r>
+        <w:t>.</w:t>
+      </w:r>
+    </w:p>
+    <w:p>
+      <w:pPr>
+        <w:pStyle w:val="ListBullet"/>
+      </w:pPr>
+      <w:r>
+        <w:rPr>
+          <w:b w:val="0"/>
+        </w:rPr>
+        <w:t xml:space="preserve">Azure Key Vault </w:t>
+      </w:r>
+      <w:r>
+        <w:rPr>
+          <w:rFonts w:ascii="Consolas" w:hAnsi="Consolas"/>
+          <w:color w:val="1F4D78"/>
+          <w:sz w:val="17"/>
+        </w:rPr>
+        <w:t>sign</w:t>
+      </w:r>
+      <w:r>
+        <w:rPr>
+          <w:b w:val="0"/>
+        </w:rPr>
+        <w:t xml:space="preserve">, </w:t>
+      </w:r>
+      <w:hyperlink r:id="rId74">
+        <w:r>
+          <w:rPr>
+            <w:color w:val="2E74B5"/>
+            <w:u w:val="single"/>
+          </w:rPr>
+          <w:t>learn.microsoft.com / sign/sign</w:t>
+        </w:r>
+      </w:hyperlink>
+      <w:r>
+        <w:t>.</w:t>
+      </w:r>
+    </w:p>
+    <w:p>
+      <w:pPr>
+        <w:pStyle w:val="ListBullet"/>
+      </w:pPr>
+      <w:r>
+        <w:rPr>
+          <w:b w:val="0"/>
+        </w:rPr>
+        <w:t xml:space="preserve">Google Cloud KMS </w:t>
+      </w:r>
+      <w:r>
+        <w:rPr>
+          <w:rFonts w:ascii="Consolas" w:hAnsi="Consolas"/>
+          <w:color w:val="1F4D78"/>
+          <w:sz w:val="17"/>
+        </w:rPr>
+        <w:t>asymmetricSign</w:t>
+      </w:r>
+      <w:r>
+        <w:rPr>
+          <w:b w:val="0"/>
+        </w:rPr>
+        <w:t xml:space="preserve">, </w:t>
+      </w:r>
+      <w:hyperlink r:id="rId75">
+        <w:r>
+          <w:rPr>
+            <w:color w:val="2E74B5"/>
+            <w:u w:val="single"/>
+          </w:rPr>
+          <w:t>cloud.google.com / projects.locations.keyRings.cryptoKeys.cryptoKeyVersions/asymmetricSign</w:t>
         </w:r>
       </w:hyperlink>
       <w:r>
@@ -14256,6 +16751,54 @@
   </w:abstractNum>
   <w:num w:numId="20">
     <w:abstractNumId w:val="19"/>
+    <w:lvlOverride w:ilvl="0">
+      <w:startOverride w:val="1"/>
+    </w:lvlOverride>
+  </w:num>
+  <w:abstractNum w:abstractNumId="20">
+    <w:multiLevelType w:val="multilevel"/>
+    <w:lvl w:ilvl="0">
+      <w:start w:val="1"/>
+      <w:numFmt w:val="decimal"/>
+      <w:lvlText w:val="%1."/>
+      <w:suff w:val="space"/>
+      <w:lvlJc w:val="left"/>
+      <w:pPr>
+        <w:tabs>
+          <w:tab w:val="num" w:pos="540"/>
+        </w:tabs>
+        <w:ind w:left="540" w:hanging="270"/>
+      </w:pPr>
+    </w:lvl>
+    <w:lvl w:ilvl="1">
+      <w:start w:val="1"/>
+      <w:numFmt w:val="decimal"/>
+      <w:lvlText w:val="%2."/>
+      <w:suff w:val="space"/>
+      <w:lvlJc w:val="left"/>
+      <w:pPr>
+        <w:tabs>
+          <w:tab w:val="num" w:pos="900"/>
+        </w:tabs>
+        <w:ind w:left="900" w:hanging="270"/>
+      </w:pPr>
+    </w:lvl>
+    <w:lvl w:ilvl="2">
+      <w:start w:val="1"/>
+      <w:numFmt w:val="decimal"/>
+      <w:lvlText w:val="%3."/>
+      <w:suff w:val="space"/>
+      <w:lvlJc w:val="left"/>
+      <w:pPr>
+        <w:tabs>
+          <w:tab w:val="num" w:pos="1260"/>
+        </w:tabs>
+        <w:ind w:left="1260" w:hanging="270"/>
+      </w:pPr>
+    </w:lvl>
+  </w:abstractNum>
+  <w:num w:numId="21">
+    <w:abstractNumId w:val="20"/>
     <w:lvlOverride w:ilvl="0">
       <w:startOverride w:val="1"/>
     </w:lvlOverride>

</xml_diff>

<commit_message>
docs: refresh Hyperion handbook with Kimi K3 review
</commit_message>
<xml_diff>
--- a/docs/engineering/hyperion-llm-coordinator-handbook.docx
+++ b/docs/engineering/hyperion-llm-coordinator-handbook.docx
@@ -17,7 +17,7 @@
           <w:color w:val="2E74B5"/>
           <w:sz w:val="20"/>
         </w:rPr>
-        <w:t>PRIVATE ENGINEERING HANDBOOK  •  VERSION 1.1</w:t>
+        <w:t>PRIVATE ENGINEERING HANDBOOK  •  VERSION 1.2</w:t>
       </w:r>
     </w:p>
     <w:p>
@@ -90,7 +90,7 @@
           <w:color w:val="25313B"/>
           <w:sz w:val="21"/>
         </w:rPr>
-        <w:t>31 July 2026</w:t>
+        <w:t>5 August 2026</w:t>
       </w:r>
     </w:p>
     <w:p>
@@ -167,7 +167,12 @@
         <w:spacing w:before="0"/>
       </w:pPr>
       <w:r>
-        <w:t>Contents</w:t>
+        <w:t>Section index</w:t>
+      </w:r>
+    </w:p>
+    <w:p>
+      <w:r>
+        <w:t>This compact index lists the handbook's numbered sections; the PDF outline and Word headings provide navigation.</w:t>
       </w:r>
     </w:p>
     <w:p>
@@ -453,13 +458,15 @@
     </w:p>
     <w:p>
       <w:pPr>
+        <w:keepNext/>
+        <w:keepLines/>
         <w:jc w:val="center"/>
       </w:pPr>
       <w:r>
         <w:drawing>
           <wp:inline xmlns:a="http://schemas.openxmlformats.org/drawingml/2006/main" xmlns:pic="http://schemas.openxmlformats.org/drawingml/2006/picture">
-            <wp:extent cx="5623560" cy="3249168"/>
-            <wp:docPr id="1" name="Picture 1" descr="Hyperion system architecture overview" title="Hyperion system architecture overview"/>
+            <wp:extent cx="5806440" cy="4264508"/>
+            <wp:docPr id="1" name="Picture 1" descr="Four-layer Hyperion architecture. Implemented client and coordination components send labelled requests, approvals, frozen specifications, and bound verification requests downward. Model-evidence and safety layers return quotes, inert artifacts, results, usage, and verifier evidence upward. Status badges distinguish implemented repository infrastructure from target, research, and externally blocked work." title="Hyperion system architecture"/>
             <wp:cNvGraphicFramePr>
               <a:graphicFrameLocks noChangeAspect="1"/>
             </wp:cNvGraphicFramePr>
@@ -479,7 +486,7 @@
                   <pic:spPr>
                     <a:xfrm>
                       <a:off x="0" y="0"/>
-                      <a:ext cx="5623560" cy="3249168"/>
+                      <a:ext cx="5806440" cy="4264508"/>
                     </a:xfrm>
                     <a:prstGeom prst="rect"/>
                   </pic:spPr>
@@ -488,6 +495,16 @@
             </a:graphic>
           </wp:inline>
         </w:drawing>
+      </w:r>
+    </w:p>
+    <w:p>
+      <w:pPr>
+        <w:pStyle w:val="FigureCaption"/>
+        <w:keepLines/>
+        <w:jc w:val="center"/>
+      </w:pPr>
+      <w:r>
+        <w:t>Figure 1. Hyperion system architecture</w:t>
       </w:r>
     </w:p>
     <w:p>
@@ -3171,6 +3188,56 @@
       </w:r>
     </w:p>
     <w:p>
+      <w:r>
+        <w:rPr>
+          <w:b w:val="0"/>
+        </w:rPr>
+        <w:t xml:space="preserve">The target provider contract also needs an explicit capability record for effort levels, structured tool fields, continuation state, caching, and retention. These semantics are not interchangeable across vendors. For example, the reviewed Kimi K3 model card exposes </w:t>
+      </w:r>
+      <w:r>
+        <w:rPr>
+          <w:rFonts w:ascii="Consolas" w:hAnsi="Consolas"/>
+          <w:color w:val="1F4D78"/>
+          <w:sz w:val="17"/>
+        </w:rPr>
+        <w:t>low</w:t>
+      </w:r>
+      <w:r>
+        <w:rPr>
+          <w:b w:val="0"/>
+        </w:rPr>
+        <w:t xml:space="preserve">, </w:t>
+      </w:r>
+      <w:r>
+        <w:rPr>
+          <w:rFonts w:ascii="Consolas" w:hAnsi="Consolas"/>
+          <w:color w:val="1F4D78"/>
+          <w:sz w:val="17"/>
+        </w:rPr>
+        <w:t>high</w:t>
+      </w:r>
+      <w:r>
+        <w:rPr>
+          <w:b w:val="0"/>
+        </w:rPr>
+        <w:t xml:space="preserve">, and </w:t>
+      </w:r>
+      <w:r>
+        <w:rPr>
+          <w:rFonts w:ascii="Consolas" w:hAnsi="Consolas"/>
+          <w:color w:val="1F4D78"/>
+          <w:sz w:val="17"/>
+        </w:rPr>
+        <w:t>max</w:t>
+      </w:r>
+      <w:r>
+        <w:rPr>
+          <w:b w:val="0"/>
+        </w:rPr>
+        <w:t xml:space="preserve"> effort and requires the complete prior assistant message—including reasoning and tool state—for compatible multi-turn continuation. Hyperion must keep any such provider-private state encrypted, tenant/model scoped, expiry-bound, and absent from ordinary logs, human rationale, corpus rows, and training data. Unsupported semantics fail or use an explicitly evaluated fallback; they are never silently mapped.</w:t>
+      </w:r>
+    </w:p>
+    <w:p>
       <w:pPr>
         <w:pStyle w:val="Heading2"/>
       </w:pPr>
@@ -3180,6 +3247,7 @@
     </w:p>
     <w:p>
       <w:pPr>
+        <w:keepNext/>
         <w:keepLines/>
         <w:jc w:val="center"/>
       </w:pPr>
@@ -3187,7 +3255,7 @@
         <w:drawing>
           <wp:inline xmlns:a="http://schemas.openxmlformats.org/drawingml/2006/main" xmlns:pic="http://schemas.openxmlformats.org/drawingml/2006/picture">
             <wp:extent cx="5806440" cy="2903220"/>
-            <wp:docPr id="2" name="Picture 2" descr="Coordinator state machine" title="Coordinator state machine"/>
+            <wp:docPr id="2" name="Picture 2" descr="Hyperion run states Created, Running, Awaiting approval, Released, Cancelled, and Failed. Labelled arrows show start, candidate-ready, human-approval, cancellation or policy-stop, cleanup-fault, and retry or resume transitions; every transition is persisted with optimistic concurrency and hash-chained events." title="Coordinator state machine"/>
             <wp:cNvGraphicFramePr>
               <a:graphicFrameLocks noChangeAspect="1"/>
             </wp:cNvGraphicFramePr>
@@ -3221,10 +3289,11 @@
     <w:p>
       <w:pPr>
         <w:pStyle w:val="FigureCaption"/>
+        <w:keepLines/>
         <w:jc w:val="center"/>
       </w:pPr>
       <w:r>
-        <w:t>Figure 1. Coordinator state machine</w:t>
+        <w:t>Figure 2. Coordinator state machine</w:t>
       </w:r>
     </w:p>
     <w:p>
@@ -3700,14 +3769,15 @@
     </w:p>
     <w:p>
       <w:pPr>
+        <w:keepNext/>
         <w:keepLines/>
         <w:jc w:val="center"/>
       </w:pPr>
       <w:r>
         <w:drawing>
           <wp:inline xmlns:a="http://schemas.openxmlformats.org/drawingml/2006/main" xmlns:pic="http://schemas.openxmlformats.org/drawingml/2006/picture">
-            <wp:extent cx="5806440" cy="3354832"/>
-            <wp:docPr id="3" name="Picture 3" descr="Hyperion evidence lifecycle" title="Hyperion evidence lifecycle"/>
+            <wp:extent cx="5806440" cy="4264508"/>
+            <wp:docPr id="3" name="Picture 3" descr="Data, training, evaluation, and serving evidence layers connected by labelled evidence flows. Status badges show which contracts and harnesses exist and which production reviews, checkpoints, sealed tasks, or runtime attestation remain target or externally blocked." title="Hyperion evidence lifecycle"/>
             <wp:cNvGraphicFramePr>
               <a:graphicFrameLocks noChangeAspect="1"/>
             </wp:cNvGraphicFramePr>
@@ -3727,7 +3797,7 @@
                   <pic:spPr>
                     <a:xfrm>
                       <a:off x="0" y="0"/>
-                      <a:ext cx="5806440" cy="3354832"/>
+                      <a:ext cx="5806440" cy="4264508"/>
                     </a:xfrm>
                     <a:prstGeom prst="rect"/>
                   </pic:spPr>
@@ -3741,10 +3811,11 @@
     <w:p>
       <w:pPr>
         <w:pStyle w:val="FigureCaption"/>
+        <w:keepLines/>
         <w:jc w:val="center"/>
       </w:pPr>
       <w:r>
-        <w:t>Figure 2. Hyperion evidence lifecycle</w:t>
+        <w:t>Figure 3. Hyperion evidence lifecycle</w:t>
       </w:r>
     </w:p>
     <w:p>
@@ -7137,14 +7208,15 @@
     </w:p>
     <w:p>
       <w:pPr>
+        <w:keepNext/>
         <w:keepLines/>
         <w:jc w:val="center"/>
       </w:pPr>
       <w:r>
         <w:drawing>
           <wp:inline xmlns:a="http://schemas.openxmlformats.org/drawingml/2006/main" xmlns:pic="http://schemas.openxmlformats.org/drawingml/2006/picture">
-            <wp:extent cx="5806440" cy="3354832"/>
-            <wp:docPr id="4" name="Picture 4" descr="Hyperion trust and signing chain" title="Hyperion trust and signing chain"/>
+            <wp:extent cx="5806440" cy="4264508"/>
+            <wp:docPr id="4" name="Picture 4" descr="Trust chain from evidence producers through independent review and detached signing to coordinator, hosted platform, and deployment consumers. Bidirectional arrows label evidence bundles, findings, canonical preimages, signatures, signed envelopes, and verification results; status badges expose missing production reviewers, signer custody, and KMS or HSM integration." title="Hyperion trust and signing chain"/>
             <wp:cNvGraphicFramePr>
               <a:graphicFrameLocks noChangeAspect="1"/>
             </wp:cNvGraphicFramePr>
@@ -7164,7 +7236,7 @@
                   <pic:spPr>
                     <a:xfrm>
                       <a:off x="0" y="0"/>
-                      <a:ext cx="5806440" cy="3354832"/>
+                      <a:ext cx="5806440" cy="4264508"/>
                     </a:xfrm>
                     <a:prstGeom prst="rect"/>
                   </pic:spPr>
@@ -7178,10 +7250,11 @@
     <w:p>
       <w:pPr>
         <w:pStyle w:val="FigureCaption"/>
+        <w:keepLines/>
         <w:jc w:val="center"/>
       </w:pPr>
       <w:r>
-        <w:t>Figure 3. Hyperion trust and signing chain</w:t>
+        <w:t>Figure 4. Hyperion trust and signing chain</w:t>
       </w:r>
     </w:p>
     <w:p>
@@ -7829,14 +7902,15 @@
     </w:p>
     <w:p>
       <w:pPr>
+        <w:keepNext/>
         <w:keepLines/>
         <w:jc w:val="center"/>
       </w:pPr>
       <w:r>
         <w:drawing>
           <wp:inline xmlns:a="http://schemas.openxmlformats.org/drawingml/2006/main" xmlns:pic="http://schemas.openxmlformats.org/drawingml/2006/picture">
-            <wp:extent cx="5806440" cy="3887089"/>
-            <wp:docPr id="5" name="Picture 5" descr="Hyperion frontier model factory" title="Hyperion frontier model factory"/>
+            <wp:extent cx="5806440" cy="5032247"/>
+            <wp:docPr id="5" name="Picture 5" descr="Five-layer model factory covering authority, knowledge, teachers, student training, and runtime. Labelled flows carry policy gates, authorised examples, teacher traces, training specifications, candidates, metrics, accepted artifacts, telemetry, and rollback evidence. Status badges separate tested infrastructure from research, targets, and external blockers." title="Hyperion frontier model factory"/>
             <wp:cNvGraphicFramePr>
               <a:graphicFrameLocks noChangeAspect="1"/>
             </wp:cNvGraphicFramePr>
@@ -7856,7 +7930,7 @@
                   <pic:spPr>
                     <a:xfrm>
                       <a:off x="0" y="0"/>
-                      <a:ext cx="5806440" cy="3887089"/>
+                      <a:ext cx="5806440" cy="5032247"/>
                     </a:xfrm>
                     <a:prstGeom prst="rect"/>
                   </pic:spPr>
@@ -7870,10 +7944,11 @@
     <w:p>
       <w:pPr>
         <w:pStyle w:val="FigureCaption"/>
+        <w:keepLines/>
         <w:jc w:val="center"/>
       </w:pPr>
       <w:r>
-        <w:t>Figure 4. Hyperion frontier model factory</w:t>
+        <w:t>Figure 5. Hyperion frontier model factory</w:t>
       </w:r>
     </w:p>
     <w:p>
@@ -7897,7 +7972,7 @@
         <w:rPr>
           <w:b w:val="0"/>
         </w:rPr>
-        <w:t xml:space="preserve">The reviewed primary source is Kimi Team, “Kimi K3: Open Frontier Intelligence,” arXiv:2607.24653v1, submitted 27 July 2026. The reviewed official report was pinned to MoonshotAI/Kimi-K3 commit </w:t>
+        <w:t xml:space="preserve">The reviewed primary source is Kimi Team, “Kimi K3: Open Frontier Intelligence,” arXiv:2607.24653v1, submitted 27 July 2026. A live 5 August check found no newer arXiv revision. MoonshotAI/Kimi-K3 </w:t>
       </w:r>
       <w:r>
         <w:rPr>
@@ -7905,13 +7980,13 @@
           <w:color w:val="1F4D78"/>
           <w:sz w:val="17"/>
         </w:rPr>
-        <w:t>7c5be9599120d799​3748de66a7612861​4f15f210</w:t>
-      </w:r>
-      <w:r>
-        <w:rPr>
-          <w:b w:val="0"/>
-        </w:rPr>
-        <w:t xml:space="preserve">; the 47-page PDF hash recorded by the research review is </w:t>
+        <w:t>main</w:t>
+      </w:r>
+      <w:r>
+        <w:rPr>
+          <w:b w:val="0"/>
+        </w:rPr>
+        <w:t xml:space="preserve"> remains at commit </w:t>
       </w:r>
       <w:r>
         <w:rPr>
@@ -7919,13 +7994,55 @@
           <w:color w:val="1F4D78"/>
           <w:sz w:val="17"/>
         </w:rPr>
+        <w:t>7c5be9599120d799​3748de66a7612861​4f15f210</w:t>
+      </w:r>
+      <w:r>
+        <w:rPr>
+          <w:b w:val="0"/>
+        </w:rPr>
+        <w:t xml:space="preserve">; the arXiv-generated 47-page PDF has SHA-256 </w:t>
+      </w:r>
+      <w:r>
+        <w:rPr>
+          <w:rFonts w:ascii="Consolas" w:hAnsi="Consolas"/>
+          <w:color w:val="1F4D78"/>
+          <w:sz w:val="17"/>
+        </w:rPr>
         <w:t>936a7a3b655947b0​14ba96b8a790c3cd​b6ea8b37eea514e4​b7b52655e20af0f8</w:t>
       </w:r>
       <w:r>
         <w:rPr>
           <w:b w:val="0"/>
         </w:rPr>
-        <w:t>.</w:t>
+        <w:t xml:space="preserve">, while the official repository's separately generated 47-page report has SHA-256 </w:t>
+      </w:r>
+      <w:r>
+        <w:rPr>
+          <w:rFonts w:ascii="Consolas" w:hAnsi="Consolas"/>
+          <w:color w:val="1F4D78"/>
+          <w:sz w:val="17"/>
+        </w:rPr>
+        <w:t>1f2978d89a9d7f13​8f6d6ae5f17fd689​0dc673abeaea7fca​96c1eca432c75ce8</w:t>
+      </w:r>
+      <w:r>
+        <w:rPr>
+          <w:b w:val="0"/>
+        </w:rPr>
+        <w:t xml:space="preserve">. The arXiv page exposes </w:t>
+      </w:r>
+      <w:r>
+        <w:rPr>
+          <w:rFonts w:ascii="Consolas" w:hAnsi="Consolas"/>
+          <w:color w:val="1F4D78"/>
+          <w:sz w:val="17"/>
+        </w:rPr>
+        <w:t>10.48550/arXiv.2607.24653</w:t>
+      </w:r>
+      <w:r>
+        <w:rPr>
+          <w:b w:val="0"/>
+        </w:rPr>
+        <w:t xml:space="preserve"> as an arXiv-issued DataCite DOI pending registration. The two report PDFs are not byte-identical, so claims cite the exact reviewed snapshot.</w:t>
       </w:r>
     </w:p>
     <w:p>
@@ -7973,7 +8090,735 @@
         <w:pStyle w:val="Heading2"/>
       </w:pPr>
       <w:r>
-        <w:t>15.3 Adopt now</w:t>
+        <w:t>15.3 Paper-to-Hyperion decision map</w:t>
+      </w:r>
+    </w:p>
+    <w:p>
+      <w:pPr>
+        <w:keepNext/>
+        <w:keepLines/>
+        <w:jc w:val="center"/>
+      </w:pPr>
+      <w:r>
+        <w:drawing>
+          <wp:inline xmlns:a="http://schemas.openxmlformats.org/drawingml/2006/main" xmlns:pic="http://schemas.openxmlformats.org/drawingml/2006/picture">
+            <wp:extent cx="5806440" cy="4032250"/>
+            <wp:docPr id="6" name="Picture 6" descr="Decision map from specific Kimi K3 report areas through Hyperion's evidence and feasibility gate. The map routes agent contracts and hidden verification to immediate adoption, quantisation and serving mechanisms to controlled evaluation, and backbone mechanisms to equal-compute pretraining research, while explicitly rejecting a direct full-model or QLoRA retrofit." title="Kimi K3 to Hyperion adoption decision map"/>
+            <wp:cNvGraphicFramePr>
+              <a:graphicFrameLocks noChangeAspect="1"/>
+            </wp:cNvGraphicFramePr>
+            <a:graphic>
+              <a:graphicData uri="http://schemas.openxmlformats.org/drawingml/2006/picture">
+                <pic:pic>
+                  <pic:nvPicPr>
+                    <pic:cNvPr id="0" name="hyperion-kimi-k3-adoption-map.png"/>
+                    <pic:cNvPicPr/>
+                  </pic:nvPicPr>
+                  <pic:blipFill>
+                    <a:blip r:embed="rId16"/>
+                    <a:stretch>
+                      <a:fillRect/>
+                    </a:stretch>
+                  </pic:blipFill>
+                  <pic:spPr>
+                    <a:xfrm>
+                      <a:off x="0" y="0"/>
+                      <a:ext cx="5806440" cy="4032250"/>
+                    </a:xfrm>
+                    <a:prstGeom prst="rect"/>
+                  </pic:spPr>
+                </pic:pic>
+              </a:graphicData>
+            </a:graphic>
+          </wp:inline>
+        </w:drawing>
+      </w:r>
+    </w:p>
+    <w:p>
+      <w:pPr>
+        <w:pStyle w:val="FigureCaption"/>
+        <w:keepLines/>
+        <w:jc w:val="center"/>
+      </w:pPr>
+      <w:r>
+        <w:t>Figure 6. Kimi K3 to Hyperion adoption decision map</w:t>
+      </w:r>
+    </w:p>
+    <w:p>
+      <w:r>
+        <w:rPr>
+          <w:i/>
+        </w:rPr>
+        <w:t>Reading guide — green items enter Hyperion's target contracts and experiments; amber items require a controlled base/runtime-specific evaluation; blue items require equal-compute pretraining research; the red boundary prevents direct QLoRA-retrofit and small-cluster-scale claims.</w:t>
+      </w:r>
+    </w:p>
+    <w:tbl>
+      <w:tblPr>
+        <w:tblStyle w:val="TableGrid"/>
+        <w:tblW w:type="dxa" w:w="9360"/>
+        <w:jc w:val="center"/>
+        <w:tblLayout w:type="fixed"/>
+        <w:tblLook w:firstColumn="1" w:firstRow="1" w:lastColumn="0" w:lastRow="0" w:noHBand="0" w:noVBand="1" w:val="04A0"/>
+        <w:tblLayout w:type="fixed"/>
+        <w:tblInd w:w="120" w:type="dxa"/>
+        <w:tblCellMar>
+          <w:top w:w="80" w:type="dxa"/>
+          <w:bottom w:w="80" w:type="dxa"/>
+          <w:start w:w="120" w:type="dxa"/>
+          <w:end w:w="120" w:type="dxa"/>
+        </w:tblCellMar>
+      </w:tblPr>
+      <w:tblGrid>
+        <w:gridCol w:w="2340"/>
+        <w:gridCol w:w="2340"/>
+        <w:gridCol w:w="2340"/>
+        <w:gridCol w:w="2340"/>
+      </w:tblGrid>
+      <w:tr>
+        <w:trPr>
+          <w:tblHeader w:val="true"/>
+          <w:cantSplit/>
+        </w:trPr>
+        <w:tc>
+          <w:tcPr>
+            <w:tcW w:type="dxa" w:w="2340"/>
+            <w:shd w:fill="E8EEF5"/>
+            <w:tcFitText/>
+            <w:vAlign w:val="top"/>
+          </w:tcPr>
+          <w:p>
+            <w:pPr>
+              <w:spacing w:after="40" w:line="259" w:lineRule="auto"/>
+            </w:pPr>
+            <w:r>
+              <w:rPr>
+                <w:b/>
+                <w:sz w:val="16"/>
+              </w:rPr>
+              <w:t>Primary-source area</w:t>
+            </w:r>
+          </w:p>
+        </w:tc>
+        <w:tc>
+          <w:tcPr>
+            <w:tcW w:type="dxa" w:w="2340"/>
+            <w:shd w:fill="E8EEF5"/>
+            <w:tcFitText/>
+            <w:vAlign w:val="top"/>
+          </w:tcPr>
+          <w:p>
+            <w:pPr>
+              <w:spacing w:after="40" w:line="259" w:lineRule="auto"/>
+            </w:pPr>
+            <w:r>
+              <w:rPr>
+                <w:b/>
+                <w:sz w:val="16"/>
+              </w:rPr>
+              <w:t>Reported design</w:t>
+            </w:r>
+          </w:p>
+        </w:tc>
+        <w:tc>
+          <w:tcPr>
+            <w:tcW w:type="dxa" w:w="2340"/>
+            <w:shd w:fill="E8EEF5"/>
+            <w:tcFitText/>
+            <w:vAlign w:val="top"/>
+          </w:tcPr>
+          <w:p>
+            <w:pPr>
+              <w:spacing w:after="40" w:line="259" w:lineRule="auto"/>
+            </w:pPr>
+            <w:r>
+              <w:rPr>
+                <w:b/>
+                <w:sz w:val="16"/>
+              </w:rPr>
+              <w:t>Hyperion decision</w:t>
+            </w:r>
+          </w:p>
+        </w:tc>
+        <w:tc>
+          <w:tcPr>
+            <w:tcW w:type="dxa" w:w="2340"/>
+            <w:shd w:fill="E8EEF5"/>
+            <w:tcFitText/>
+            <w:vAlign w:val="top"/>
+          </w:tcPr>
+          <w:p>
+            <w:pPr>
+              <w:spacing w:after="40" w:line="259" w:lineRule="auto"/>
+            </w:pPr>
+            <w:r>
+              <w:rPr>
+                <w:b/>
+                <w:sz w:val="16"/>
+              </w:rPr>
+              <w:t>Evidence status</w:t>
+            </w:r>
+          </w:p>
+        </w:tc>
+      </w:tr>
+      <w:tr>
+        <w:trPr>
+          <w:cantSplit/>
+        </w:trPr>
+        <w:tc>
+          <w:tcPr>
+            <w:tcW w:type="dxa" w:w="2340"/>
+            <w:vAlign w:val="top"/>
+          </w:tcPr>
+          <w:p>
+            <w:pPr>
+              <w:spacing w:after="40" w:line="259" w:lineRule="auto"/>
+            </w:pPr>
+            <w:r>
+              <w:rPr>
+                <w:b w:val="0"/>
+                <w:sz w:val="16"/>
+              </w:rPr>
+              <w:t>Section 2, pages 3–10</w:t>
+            </w:r>
+          </w:p>
+        </w:tc>
+        <w:tc>
+          <w:tcPr>
+            <w:tcW w:type="dxa" w:w="2340"/>
+            <w:vAlign w:val="top"/>
+          </w:tcPr>
+          <w:p>
+            <w:pPr>
+              <w:spacing w:after="40" w:line="259" w:lineRule="auto"/>
+            </w:pPr>
+            <w:r>
+              <w:rPr>
+                <w:b w:val="0"/>
+                <w:sz w:val="16"/>
+              </w:rPr>
+              <w:t>KDA/Gated MLA, Attention Residuals, Stable LatentMoE, Quantile Balancing, SiTU-GLU, per-head Muon</w:t>
+            </w:r>
+          </w:p>
+        </w:tc>
+        <w:tc>
+          <w:tcPr>
+            <w:tcW w:type="dxa" w:w="2340"/>
+            <w:vAlign w:val="top"/>
+          </w:tcPr>
+          <w:p>
+            <w:pPr>
+              <w:spacing w:after="40" w:line="259" w:lineRule="auto"/>
+            </w:pPr>
+            <w:r>
+              <w:rPr>
+                <w:b w:val="0"/>
+                <w:sz w:val="16"/>
+              </w:rPr>
+              <w:t>Pretraining research only</w:t>
+            </w:r>
+          </w:p>
+        </w:tc>
+        <w:tc>
+          <w:tcPr>
+            <w:tcW w:type="dxa" w:w="2340"/>
+            <w:vAlign w:val="top"/>
+          </w:tcPr>
+          <w:p>
+            <w:pPr>
+              <w:spacing w:after="40" w:line="259" w:lineRule="auto"/>
+            </w:pPr>
+            <w:r>
+              <w:rPr>
+                <w:b w:val="0"/>
+                <w:sz w:val="16"/>
+              </w:rPr>
+              <w:t>Literature reviewed; no Hyperion ablation</w:t>
+            </w:r>
+          </w:p>
+        </w:tc>
+      </w:tr>
+      <w:tr>
+        <w:trPr>
+          <w:cantSplit/>
+        </w:trPr>
+        <w:tc>
+          <w:tcPr>
+            <w:tcW w:type="dxa" w:w="2340"/>
+            <w:vAlign w:val="top"/>
+          </w:tcPr>
+          <w:p>
+            <w:pPr>
+              <w:spacing w:after="40" w:line="259" w:lineRule="auto"/>
+            </w:pPr>
+            <w:r>
+              <w:rPr>
+                <w:b w:val="0"/>
+                <w:sz w:val="16"/>
+              </w:rPr>
+              <w:t>Sections 3.3–3.4, pages 11–12</w:t>
+            </w:r>
+          </w:p>
+        </w:tc>
+        <w:tc>
+          <w:tcPr>
+            <w:tcW w:type="dxa" w:w="2340"/>
+            <w:vAlign w:val="top"/>
+          </w:tcPr>
+          <w:p>
+            <w:pPr>
+              <w:spacing w:after="40" w:line="259" w:lineRule="auto"/>
+            </w:pPr>
+            <w:r>
+              <w:rPr>
+                <w:b w:val="0"/>
+                <w:sz w:val="16"/>
+              </w:rPr>
+              <w:t>Native multimodal training and progressive 8K→64K→256K→1M context extension</w:t>
+            </w:r>
+          </w:p>
+        </w:tc>
+        <w:tc>
+          <w:tcPr>
+            <w:tcW w:type="dxa" w:w="2340"/>
+            <w:vAlign w:val="top"/>
+          </w:tcPr>
+          <w:p>
+            <w:pPr>
+              <w:spacing w:after="40" w:line="259" w:lineRule="auto"/>
+            </w:pPr>
+            <w:r>
+              <w:rPr>
+                <w:b w:val="0"/>
+                <w:sz w:val="16"/>
+              </w:rPr>
+              <w:t>Length curriculum only after short-context stability and dependency-focused tests</w:t>
+            </w:r>
+          </w:p>
+        </w:tc>
+        <w:tc>
+          <w:tcPr>
+            <w:tcW w:type="dxa" w:w="2340"/>
+            <w:vAlign w:val="top"/>
+          </w:tcPr>
+          <w:p>
+            <w:pPr>
+              <w:spacing w:after="40" w:line="259" w:lineRule="auto"/>
+            </w:pPr>
+            <w:r>
+              <w:rPr>
+                <w:b w:val="0"/>
+                <w:sz w:val="16"/>
+              </w:rPr>
+              <w:t>Target design; no long-context run</w:t>
+            </w:r>
+          </w:p>
+        </w:tc>
+      </w:tr>
+      <w:tr>
+        <w:trPr>
+          <w:cantSplit/>
+        </w:trPr>
+        <w:tc>
+          <w:tcPr>
+            <w:tcW w:type="dxa" w:w="2340"/>
+            <w:vAlign w:val="top"/>
+          </w:tcPr>
+          <w:p>
+            <w:pPr>
+              <w:spacing w:after="40" w:line="259" w:lineRule="auto"/>
+            </w:pPr>
+            <w:r>
+              <w:rPr>
+                <w:b w:val="0"/>
+                <w:sz w:val="16"/>
+              </w:rPr>
+              <w:t>Sections 4.1.1–4.1.3, pages 12–14</w:t>
+            </w:r>
+          </w:p>
+        </w:tc>
+        <w:tc>
+          <w:tcPr>
+            <w:tcW w:type="dxa" w:w="2340"/>
+            <w:vAlign w:val="top"/>
+          </w:tcPr>
+          <w:p>
+            <w:pPr>
+              <w:spacing w:after="40" w:line="259" w:lineRule="auto"/>
+            </w:pPr>
+            <w:r>
+              <w:rPr>
+                <w:b w:val="0"/>
+                <w:sz w:val="16"/>
+              </w:rPr>
+              <w:t>Verified trajectory SFT, nine domain/effort RL specialists, MOPD</w:t>
+            </w:r>
+          </w:p>
+        </w:tc>
+        <w:tc>
+          <w:tcPr>
+            <w:tcW w:type="dxa" w:w="2340"/>
+            <w:vAlign w:val="top"/>
+          </w:tcPr>
+          <w:p>
+            <w:pPr>
+              <w:spacing w:after="40" w:line="259" w:lineRule="auto"/>
+            </w:pPr>
+            <w:r>
+              <w:rPr>
+                <w:b w:val="0"/>
+                <w:sz w:val="16"/>
+              </w:rPr>
+              <w:t>Verified SFT and routed specialists first; consolidation only with authorised probabilities/logits</w:t>
+            </w:r>
+          </w:p>
+        </w:tc>
+        <w:tc>
+          <w:tcPr>
+            <w:tcW w:type="dxa" w:w="2340"/>
+            <w:vAlign w:val="top"/>
+          </w:tcPr>
+          <w:p>
+            <w:pPr>
+              <w:spacing w:after="40" w:line="259" w:lineRule="auto"/>
+            </w:pPr>
+            <w:r>
+              <w:rPr>
+                <w:b w:val="0"/>
+                <w:sz w:val="16"/>
+              </w:rPr>
+              <w:t>Infrastructure only; no reviewed corpus or specialist</w:t>
+            </w:r>
+          </w:p>
+        </w:tc>
+      </w:tr>
+      <w:tr>
+        <w:trPr>
+          <w:cantSplit/>
+        </w:trPr>
+        <w:tc>
+          <w:tcPr>
+            <w:tcW w:type="dxa" w:w="2340"/>
+            <w:vAlign w:val="top"/>
+          </w:tcPr>
+          <w:p>
+            <w:pPr>
+              <w:spacing w:after="40" w:line="259" w:lineRule="auto"/>
+            </w:pPr>
+            <w:r>
+              <w:rPr>
+                <w:b w:val="0"/>
+                <w:sz w:val="16"/>
+              </w:rPr>
+              <w:t>Sections 4.1.2 and 4.2.6, pages 13 and 16</w:t>
+            </w:r>
+          </w:p>
+        </w:tc>
+        <w:tc>
+          <w:tcPr>
+            <w:tcW w:type="dxa" w:w="2340"/>
+            <w:vAlign w:val="top"/>
+          </w:tcPr>
+          <w:p>
+            <w:pPr>
+              <w:spacing w:after="40" w:line="259" w:lineRule="auto"/>
+            </w:pPr>
+            <w:r>
+              <w:rPr>
+                <w:b w:val="0"/>
+                <w:sz w:val="16"/>
+              </w:rPr>
+              <w:t>Per-task budgets, outcome-state rewards, public/hidden verifiers, limited submissions</w:t>
+            </w:r>
+          </w:p>
+        </w:tc>
+        <w:tc>
+          <w:tcPr>
+            <w:tcW w:type="dxa" w:w="2340"/>
+            <w:vAlign w:val="top"/>
+          </w:tcPr>
+          <w:p>
+            <w:pPr>
+              <w:spacing w:after="40" w:line="259" w:lineRule="auto"/>
+            </w:pPr>
+            <w:r>
+              <w:rPr>
+                <w:b w:val="0"/>
+                <w:sz w:val="16"/>
+              </w:rPr>
+              <w:t>Adopt budget-conditioned evaluation and independent hidden verification</w:t>
+            </w:r>
+          </w:p>
+        </w:tc>
+        <w:tc>
+          <w:tcPr>
+            <w:tcW w:type="dxa" w:w="2340"/>
+            <w:vAlign w:val="top"/>
+          </w:tcPr>
+          <w:p>
+            <w:pPr>
+              <w:spacing w:after="40" w:line="259" w:lineRule="auto"/>
+            </w:pPr>
+            <w:r>
+              <w:rPr>
+                <w:b w:val="0"/>
+                <w:sz w:val="16"/>
+              </w:rPr>
+              <w:t>Target contracts; no K3 result reproduced</w:t>
+            </w:r>
+          </w:p>
+        </w:tc>
+      </w:tr>
+      <w:tr>
+        <w:trPr>
+          <w:cantSplit/>
+        </w:trPr>
+        <w:tc>
+          <w:tcPr>
+            <w:tcW w:type="dxa" w:w="2340"/>
+            <w:vAlign w:val="top"/>
+          </w:tcPr>
+          <w:p>
+            <w:pPr>
+              <w:spacing w:after="40" w:line="259" w:lineRule="auto"/>
+            </w:pPr>
+            <w:r>
+              <w:rPr>
+                <w:b w:val="0"/>
+                <w:sz w:val="16"/>
+              </w:rPr>
+              <w:t>Section 4.1.4, page 14</w:t>
+            </w:r>
+          </w:p>
+        </w:tc>
+        <w:tc>
+          <w:tcPr>
+            <w:tcW w:type="dxa" w:w="2340"/>
+            <w:vAlign w:val="top"/>
+          </w:tcPr>
+          <w:p>
+            <w:pPr>
+              <w:spacing w:after="40" w:line="259" w:lineRule="auto"/>
+            </w:pPr>
+            <w:r>
+              <w:rPr>
+                <w:b w:val="0"/>
+                <w:sz w:val="16"/>
+              </w:rPr>
+              <w:t>QAT throughout post-training and an MTP-derived EAGLE-3 draft trained toward acceptance</w:t>
+            </w:r>
+          </w:p>
+        </w:tc>
+        <w:tc>
+          <w:tcPr>
+            <w:tcW w:type="dxa" w:w="2340"/>
+            <w:vAlign w:val="top"/>
+          </w:tcPr>
+          <w:p>
+            <w:pPr>
+              <w:spacing w:after="40" w:line="259" w:lineRule="auto"/>
+            </w:pPr>
+            <w:r>
+              <w:rPr>
+                <w:b w:val="0"/>
+                <w:sz w:val="16"/>
+              </w:rPr>
+              <w:t>Controlled student-specific evaluation</w:t>
+            </w:r>
+          </w:p>
+        </w:tc>
+        <w:tc>
+          <w:tcPr>
+            <w:tcW w:type="dxa" w:w="2340"/>
+            <w:vAlign w:val="top"/>
+          </w:tcPr>
+          <w:p>
+            <w:pPr>
+              <w:spacing w:after="40" w:line="259" w:lineRule="auto"/>
+            </w:pPr>
+            <w:r>
+              <w:rPr>
+                <w:b w:val="0"/>
+                <w:sz w:val="16"/>
+              </w:rPr>
+              <w:t>Research target only</w:t>
+            </w:r>
+          </w:p>
+        </w:tc>
+      </w:tr>
+      <w:tr>
+        <w:trPr>
+          <w:cantSplit/>
+        </w:trPr>
+        <w:tc>
+          <w:tcPr>
+            <w:tcW w:type="dxa" w:w="2340"/>
+            <w:vAlign w:val="top"/>
+          </w:tcPr>
+          <w:p>
+            <w:pPr>
+              <w:spacing w:after="40" w:line="259" w:lineRule="auto"/>
+            </w:pPr>
+            <w:r>
+              <w:rPr>
+                <w:b w:val="0"/>
+                <w:sz w:val="16"/>
+              </w:rPr>
+              <w:t>Sections 5.3–5.4, pages 21–25</w:t>
+            </w:r>
+          </w:p>
+        </w:tc>
+        <w:tc>
+          <w:tcPr>
+            <w:tcW w:type="dxa" w:w="2340"/>
+            <w:vAlign w:val="top"/>
+          </w:tcPr>
+          <w:p>
+            <w:pPr>
+              <w:spacing w:after="40" w:line="259" w:lineRule="auto"/>
+            </w:pPr>
+            <w:r>
+              <w:rPr>
+                <w:b w:val="0"/>
+                <w:sz w:val="16"/>
+              </w:rPr>
+              <w:t>External KV pool, auto-throttling, resumable microVMs, cache affinity, request-class budgets</w:t>
+            </w:r>
+          </w:p>
+        </w:tc>
+        <w:tc>
+          <w:tcPr>
+            <w:tcW w:type="dxa" w:w="2340"/>
+            <w:vAlign w:val="top"/>
+          </w:tcPr>
+          <w:p>
+            <w:pPr>
+              <w:spacing w:after="40" w:line="259" w:lineRule="auto"/>
+            </w:pPr>
+            <w:r>
+              <w:rPr>
+                <w:b w:val="0"/>
+                <w:sz w:val="16"/>
+              </w:rPr>
+              <w:t>Adopt scheduling/state-lifecycle principles at measured Hyperion scale</w:t>
+            </w:r>
+          </w:p>
+        </w:tc>
+        <w:tc>
+          <w:tcPr>
+            <w:tcW w:type="dxa" w:w="2340"/>
+            <w:vAlign w:val="top"/>
+          </w:tcPr>
+          <w:p>
+            <w:pPr>
+              <w:spacing w:after="40" w:line="259" w:lineRule="auto"/>
+            </w:pPr>
+            <w:r>
+              <w:rPr>
+                <w:b w:val="0"/>
+                <w:sz w:val="16"/>
+              </w:rPr>
+              <w:t>No production cluster</w:t>
+            </w:r>
+          </w:p>
+        </w:tc>
+      </w:tr>
+      <w:tr>
+        <w:trPr>
+          <w:cantSplit/>
+        </w:trPr>
+        <w:tc>
+          <w:tcPr>
+            <w:tcW w:type="dxa" w:w="2340"/>
+            <w:vAlign w:val="top"/>
+          </w:tcPr>
+          <w:p>
+            <w:pPr>
+              <w:spacing w:after="40" w:line="259" w:lineRule="auto"/>
+            </w:pPr>
+            <w:r>
+              <w:rPr>
+                <w:b w:val="0"/>
+                <w:sz w:val="16"/>
+              </w:rPr>
+              <w:t>Appendix F, pages 46–47, and model card</w:t>
+            </w:r>
+          </w:p>
+        </w:tc>
+        <w:tc>
+          <w:tcPr>
+            <w:tcW w:type="dxa" w:w="2340"/>
+            <w:vAlign w:val="top"/>
+          </w:tcPr>
+          <w:p>
+            <w:pPr>
+              <w:spacing w:after="40" w:line="259" w:lineRule="auto"/>
+            </w:pPr>
+            <w:r>
+              <w:rPr>
+                <w:b w:val="0"/>
+                <w:sz w:val="16"/>
+              </w:rPr>
+              <w:t>Scope-aware options, indexed/typed tool calls, preserved reasoning/tool continuation state</w:t>
+            </w:r>
+          </w:p>
+        </w:tc>
+        <w:tc>
+          <w:tcPr>
+            <w:tcW w:type="dxa" w:w="2340"/>
+            <w:vAlign w:val="top"/>
+          </w:tcPr>
+          <w:p>
+            <w:pPr>
+              <w:spacing w:after="40" w:line="259" w:lineRule="auto"/>
+            </w:pPr>
+            <w:r>
+              <w:rPr>
+                <w:b w:val="0"/>
+                <w:sz w:val="16"/>
+              </w:rPr>
+              <w:t>Provider capability mapping plus a restricted continuation-state lane</w:t>
+            </w:r>
+          </w:p>
+        </w:tc>
+        <w:tc>
+          <w:tcPr>
+            <w:tcW w:type="dxa" w:w="2340"/>
+            <w:vAlign w:val="top"/>
+          </w:tcPr>
+          <w:p>
+            <w:pPr>
+              <w:spacing w:after="40" w:line="259" w:lineRule="auto"/>
+            </w:pPr>
+            <w:r>
+              <w:rPr>
+                <w:b w:val="0"/>
+                <w:sz w:val="16"/>
+              </w:rPr>
+              <w:t>Architecture update; current wire unchanged</w:t>
+            </w:r>
+          </w:p>
+        </w:tc>
+      </w:tr>
+    </w:tbl>
+    <w:p>
+      <w:pPr>
+        <w:spacing w:after="40"/>
+      </w:pPr>
+    </w:p>
+    <w:p>
+      <w:r>
+        <w:rPr>
+          <w:b w:val="0"/>
+        </w:rPr>
+        <w:t>The diagram and table classify source claims; they do not copy K3 code, confer production authority, or convert paper results into Hyperion evidence.</w:t>
+      </w:r>
+    </w:p>
+    <w:p>
+      <w:pPr>
+        <w:pStyle w:val="Heading2"/>
+      </w:pPr>
+      <w:r>
+        <w:t>15.4 Adopt now</w:t>
       </w:r>
     </w:p>
     <w:tbl>
@@ -8453,7 +9298,7 @@
                 <w:b w:val="0"/>
                 <w:sz w:val="16"/>
               </w:rPr>
-              <w:t>Separate roles, visible answers, tool calls/results, scope, and provider state; avoid retaining hidden reasoning</w:t>
+              <w:t>Separate roles, visible answers, indexed tool calls/results, scope, and restricted provider state; never present provider reasoning as human rationale</w:t>
             </w:r>
           </w:p>
         </w:tc>
@@ -8471,7 +9316,7 @@
                 <w:b w:val="0"/>
                 <w:sz w:val="16"/>
               </w:rPr>
-              <w:t>Round-trip/provider tests and privacy review</w:t>
+              <w:t>Round-trip/provider tests, field-level retention/deletion, and privacy review</w:t>
             </w:r>
           </w:p>
         </w:tc>
@@ -8494,6 +9339,183 @@
                 <w:b w:val="0"/>
                 <w:sz w:val="16"/>
               </w:rPr>
+              <w:t>Provider capability mapping</w:t>
+            </w:r>
+          </w:p>
+        </w:tc>
+        <w:tc>
+          <w:tcPr>
+            <w:tcW w:type="dxa" w:w="3120"/>
+            <w:vAlign w:val="top"/>
+          </w:tcPr>
+          <w:p>
+            <w:pPr>
+              <w:spacing w:after="40" w:line="259" w:lineRule="auto"/>
+            </w:pPr>
+            <w:r>
+              <w:rPr>
+                <w:b w:val="0"/>
+                <w:sz w:val="16"/>
+              </w:rPr>
+              <w:t>Version supported effort names, option scope, continuation semantics, tool schema, and fallback for each exact model revision</w:t>
+            </w:r>
+          </w:p>
+        </w:tc>
+        <w:tc>
+          <w:tcPr>
+            <w:tcW w:type="dxa" w:w="3120"/>
+            <w:vAlign w:val="top"/>
+          </w:tcPr>
+          <w:p>
+            <w:pPr>
+              <w:spacing w:after="40" w:line="259" w:lineRule="auto"/>
+            </w:pPr>
+            <w:r>
+              <w:rPr>
+                <w:b w:val="0"/>
+                <w:sz w:val="16"/>
+              </w:rPr>
+              <w:t>Unsupported-field failure, parity across multi-turn/tool sessions, and no silent aliasing</w:t>
+            </w:r>
+          </w:p>
+        </w:tc>
+      </w:tr>
+      <w:tr>
+        <w:trPr>
+          <w:cantSplit/>
+        </w:trPr>
+        <w:tc>
+          <w:tcPr>
+            <w:tcW w:type="dxa" w:w="3120"/>
+            <w:vAlign w:val="top"/>
+          </w:tcPr>
+          <w:p>
+            <w:pPr>
+              <w:spacing w:after="40" w:line="259" w:lineRule="auto"/>
+            </w:pPr>
+            <w:r>
+              <w:rPr>
+                <w:b w:val="0"/>
+                <w:sz w:val="16"/>
+              </w:rPr>
+              <w:t>Structured judge scorepad</w:t>
+            </w:r>
+          </w:p>
+        </w:tc>
+        <w:tc>
+          <w:tcPr>
+            <w:tcW w:type="dxa" w:w="3120"/>
+            <w:vAlign w:val="top"/>
+          </w:tcPr>
+          <w:p>
+            <w:pPr>
+              <w:spacing w:after="40" w:line="259" w:lineRule="auto"/>
+            </w:pPr>
+            <w:r>
+              <w:rPr>
+                <w:b w:val="0"/>
+                <w:sz w:val="16"/>
+              </w:rPr>
+              <w:t>Require inspected output, bound rubric, criterion scores, evidence references, and a verbosity guard for non-verifiable qualities</w:t>
+            </w:r>
+          </w:p>
+        </w:tc>
+        <w:tc>
+          <w:tcPr>
+            <w:tcW w:type="dxa" w:w="3120"/>
+            <w:vAlign w:val="top"/>
+          </w:tcPr>
+          <w:p>
+            <w:pPr>
+              <w:spacing w:after="40" w:line="259" w:lineRule="auto"/>
+            </w:pPr>
+            <w:r>
+              <w:rPr>
+                <w:b w:val="0"/>
+                <w:sz w:val="16"/>
+              </w:rPr>
+              <w:t>Judge disagreement/calibration, rubric mutation, verbosity gaming, and human correlation</w:t>
+            </w:r>
+          </w:p>
+        </w:tc>
+      </w:tr>
+      <w:tr>
+        <w:trPr>
+          <w:cantSplit/>
+        </w:trPr>
+        <w:tc>
+          <w:tcPr>
+            <w:tcW w:type="dxa" w:w="3120"/>
+            <w:vAlign w:val="top"/>
+          </w:tcPr>
+          <w:p>
+            <w:pPr>
+              <w:spacing w:after="40" w:line="259" w:lineRule="auto"/>
+            </w:pPr>
+            <w:r>
+              <w:rPr>
+                <w:b w:val="0"/>
+                <w:sz w:val="16"/>
+              </w:rPr>
+              <w:t>Quantization-consistent evidence</w:t>
+            </w:r>
+          </w:p>
+        </w:tc>
+        <w:tc>
+          <w:tcPr>
+            <w:tcW w:type="dxa" w:w="3120"/>
+            <w:vAlign w:val="top"/>
+          </w:tcPr>
+          <w:p>
+            <w:pPr>
+              <w:spacing w:after="40" w:line="259" w:lineRule="auto"/>
+            </w:pPr>
+            <w:r>
+              <w:rPr>
+                <w:b w:val="0"/>
+                <w:sz w:val="16"/>
+              </w:rPr>
+              <w:t>When the selected base supports it, bind training, rollout, evaluation, and serving precision to one artifact identity</w:t>
+            </w:r>
+          </w:p>
+        </w:tc>
+        <w:tc>
+          <w:tcPr>
+            <w:tcW w:type="dxa" w:w="3120"/>
+            <w:vAlign w:val="top"/>
+          </w:tcPr>
+          <w:p>
+            <w:pPr>
+              <w:spacing w:after="40" w:line="259" w:lineRule="auto"/>
+            </w:pPr>
+            <w:r>
+              <w:rPr>
+                <w:b w:val="0"/>
+                <w:sz w:val="16"/>
+              </w:rPr>
+              <w:t>Float/quantized verifier parity, calibration, memory/throughput, portability, and rollback</w:t>
+            </w:r>
+          </w:p>
+        </w:tc>
+      </w:tr>
+      <w:tr>
+        <w:trPr>
+          <w:cantSplit/>
+        </w:trPr>
+        <w:tc>
+          <w:tcPr>
+            <w:tcW w:type="dxa" w:w="3120"/>
+            <w:vAlign w:val="top"/>
+          </w:tcPr>
+          <w:p>
+            <w:pPr>
+              <w:spacing w:after="40" w:line="259" w:lineRule="auto"/>
+            </w:pPr>
+            <w:r>
+              <w:rPr>
+                <w:b w:val="0"/>
+                <w:sz w:val="16"/>
+              </w:rPr>
               <w:t>Stronger sandboxing</w:t>
             </w:r>
           </w:p>
@@ -8546,15 +9568,23 @@
         <w:pStyle w:val="Heading2"/>
       </w:pPr>
       <w:r>
-        <w:t>15.4 Pretraining research tracks</w:t>
-      </w:r>
-    </w:p>
-    <w:p>
-      <w:r>
-        <w:rPr>
-          <w:b w:val="0"/>
-        </w:rPr>
-        <w:t>Kimi Delta Attention, Attention Residuals, Stable LatentMoE, Quantile Balancing, SiTU-GLU, per-head Muon, MoonEP, and deployment-wide MXFP quantization are architecture/pretraining-system changes. They cannot be faithfully added to Qwen or gpt-oss with QLoRA. Test them only in small ablation models after the dense/adapted baseline, evaluator, and cluster telemetry are trustworthy.</w:t>
+        <w:t>15.5 Pretraining research tracks</w:t>
+      </w:r>
+    </w:p>
+    <w:p>
+      <w:r>
+        <w:rPr>
+          <w:b w:val="0"/>
+        </w:rPr>
+        <w:t>Kimi Delta Attention, Attention Residuals, Stable LatentMoE, Quantile Balancing, SiTU-GLU, per-head Muon, and MoonEP are backbone, optimizer, or distributed-system changes. They cannot be faithfully added to Qwen or gpt-oss with QLoRA. Test them only in small ablation models after the dense/adapted baseline, evaluator, and cluster telemetry are trustworthy.</w:t>
+      </w:r>
+    </w:p>
+    <w:p>
+      <w:r>
+        <w:rPr>
+          <w:b w:val="0"/>
+        </w:rPr>
+        <w:t>MXFP4-weight/MXFP8-activation QAT is instead deployment-aware post-training: the report starts it at SFT and aligns rollout/training precision. Hyperion treats it as a selected-base/hardware experiment whose float-versus-quantized verifier parity, calibration, memory, throughput, and rollback must pass.</w:t>
       </w:r>
     </w:p>
     <w:p>
@@ -8578,7 +9608,7 @@
         <w:pStyle w:val="Heading2"/>
       </w:pPr>
       <w:r>
-        <w:t>15.5 Permission-managed access and reproducibility</w:t>
+        <w:t>15.6 Permission-managed access and reproducibility</w:t>
       </w:r>
     </w:p>
     <w:p>
@@ -8602,7 +9632,7 @@
         <w:pStyle w:val="Heading2"/>
       </w:pPr>
       <w:r>
-        <w:t>15.6 Cross-family architecture decisions</w:t>
+        <w:t>15.7 Cross-family architecture decisions</w:t>
       </w:r>
     </w:p>
     <w:p>
@@ -9191,7 +10221,7 @@
         <w:pStyle w:val="Heading2"/>
       </w:pPr>
       <w:r>
-        <w:t>15.7 Target coordinator and agent runtime</w:t>
+        <w:t>15.8 Target coordinator and agent runtime</w:t>
       </w:r>
     </w:p>
     <w:p>
@@ -9223,7 +10253,7 @@
         <w:pStyle w:val="Heading2"/>
       </w:pPr>
       <w:r>
-        <w:t>15.8 Evaluation and promotion scorecard</w:t>
+        <w:t>15.9 Evaluation and promotion scorecard</w:t>
       </w:r>
     </w:p>
     <w:p>
@@ -9247,7 +10277,7 @@
         <w:pStyle w:val="Heading2"/>
       </w:pPr>
       <w:r>
-        <w:t>15.9 Target inference fabric</w:t>
+        <w:t>15.10 Target inference fabric</w:t>
       </w:r>
     </w:p>
     <w:p>
@@ -9263,7 +10293,7 @@
         <w:rPr>
           <w:b w:val="0"/>
         </w:rPr>
-        <w:t>Continuous batching, chunked prefill, structured decoding, tenant-safe prefix/KV caches, streaming, cancellation, overload, and canary/rollback are gateway responsibilities. Benchmark speculative decoding, Medusa/EAGLE, disaggregated prefill/decode, AWQ/GPTQ/SmoothQuant, FP8, or MXFP only on real Hyperion traffic; require output/verifier parity, acceptance, memory, throughput, and tail-latency evidence. Unsupported provider fields fail closed rather than silently changing semantics.</w:t>
+        <w:t>Continuous batching, chunked prefill, structured decoding, tenant-safe prefix/KV caches, streaming, cancellation, overload, and canary/rollback are gateway responsibilities. Cache-aware affinity may pin a session to a primary worker plus a bounded failover target; separate admission budgets protect short inference, long context, rollout, training, and sealed evaluation using queue, active-request, memory, and KV-pressure signals. Benchmark speculative decoding, Medusa/EAGLE, disaggregated prefill/decode, AWQ/GPTQ/SmoothQuant, FP8, or MXFP only on real Hyperion traffic. For a compatible MTP/draft path, compare an acceptance-rate-oriented objective with ordinary KL training. Every pilot must prove output/verifier parity, acceptance, failover cost, memory, throughput, and tail latency. Unsupported provider fields fail closed rather than silently changing semantics.</w:t>
       </w:r>
     </w:p>
     <w:p>
@@ -9276,14 +10306,15 @@
     </w:p>
     <w:p>
       <w:pPr>
+        <w:keepNext/>
         <w:keepLines/>
         <w:jc w:val="center"/>
       </w:pPr>
       <w:r>
         <w:drawing>
           <wp:inline xmlns:a="http://schemas.openxmlformats.org/drawingml/2006/main" xmlns:pic="http://schemas.openxmlformats.org/drawingml/2006/picture">
-            <wp:extent cx="5806440" cy="3354832"/>
-            <wp:docPr id="6" name="Picture 6" descr="Proposed Hyperion small-GPU-cluster topology" title="Proposed Hyperion small-GPU-cluster topology"/>
+            <wp:extent cx="5806440" cy="4264508"/>
+            <wp:docPr id="7" name="Picture 7" descr="Proposed small-cluster topology with control, storage, GPU, and isolation layers. Labelled arrows show signed run specifications, read-only snapshots, checkpoints, metrics, verification requests, verdicts, and recovery proof. Status badges show that immutable artifact contracts exist while the cluster, production corpus, KMS, GPU workers, and several isolation controls remain target or externally blocked." title="Proposed Hyperion small-GPU-cluster topology"/>
             <wp:cNvGraphicFramePr>
               <a:graphicFrameLocks noChangeAspect="1"/>
             </wp:cNvGraphicFramePr>
@@ -9295,7 +10326,7 @@
                     <pic:cNvPicPr/>
                   </pic:nvPicPr>
                   <pic:blipFill>
-                    <a:blip r:embed="rId16"/>
+                    <a:blip r:embed="rId17"/>
                     <a:stretch>
                       <a:fillRect/>
                     </a:stretch>
@@ -9303,7 +10334,7 @@
                   <pic:spPr>
                     <a:xfrm>
                       <a:off x="0" y="0"/>
-                      <a:ext cx="5806440" cy="3354832"/>
+                      <a:ext cx="5806440" cy="4264508"/>
                     </a:xfrm>
                     <a:prstGeom prst="rect"/>
                   </pic:spPr>
@@ -9317,10 +10348,11 @@
     <w:p>
       <w:pPr>
         <w:pStyle w:val="FigureCaption"/>
+        <w:keepLines/>
         <w:jc w:val="center"/>
       </w:pPr>
       <w:r>
-        <w:t>Figure 5. Proposed Hyperion small-GPU-cluster topology</w:t>
+        <w:t>Figure 7. Proposed Hyperion small-GPU-cluster topology</w:t>
       </w:r>
     </w:p>
     <w:p>
@@ -14581,7 +15613,7 @@
         <w:rPr>
           <w:b w:val="0"/>
         </w:rPr>
-        <w:t>Online primary sources in sections 22.2-22.4 were accessed 31 July 2026. Model cards, services, framework APIs, availability, prices, and terms are version-sensitive and must be re-pinned for a real acquisition or experiment.</w:t>
+        <w:t>Online primary sources in sections 22.2-22.4 were accessed 31 July 2026; Kimi K3 sources were rechecked 5 August 2026. Model cards, services, framework APIs, availability, prices, and terms are version-sensitive and must be re-pinned for a real acquisition or experiment.</w:t>
       </w:r>
     </w:p>
     <w:p>
@@ -14594,7 +15626,7 @@
         </w:rPr>
         <w:t xml:space="preserve">Hinton et al., “Distilling the Knowledge in a Neural Network,” </w:t>
       </w:r>
-      <w:hyperlink r:id="rId17">
+      <w:hyperlink r:id="rId18">
         <w:r>
           <w:rPr>
             <w:color w:val="2E74B5"/>
@@ -14617,7 +15649,7 @@
         </w:rPr>
         <w:t xml:space="preserve">Hsieh et al., “Distilling Step-by-Step,” </w:t>
       </w:r>
-      <w:hyperlink r:id="rId18">
+      <w:hyperlink r:id="rId19">
         <w:r>
           <w:rPr>
             <w:color w:val="2E74B5"/>
@@ -14640,7 +15672,7 @@
         </w:rPr>
         <w:t xml:space="preserve">Mukherjee et al., “Orca,” </w:t>
       </w:r>
-      <w:hyperlink r:id="rId19">
+      <w:hyperlink r:id="rId20">
         <w:r>
           <w:rPr>
             <w:color w:val="2E74B5"/>
@@ -14663,7 +15695,7 @@
         </w:rPr>
         <w:t xml:space="preserve">Hu et al., “LoRA,” </w:t>
       </w:r>
-      <w:hyperlink r:id="rId20">
+      <w:hyperlink r:id="rId21">
         <w:r>
           <w:rPr>
             <w:color w:val="2E74B5"/>
@@ -14686,7 +15718,7 @@
         </w:rPr>
         <w:t xml:space="preserve">Dettmers et al., “QLoRA,” </w:t>
       </w:r>
-      <w:hyperlink r:id="rId21">
+      <w:hyperlink r:id="rId22">
         <w:r>
           <w:rPr>
             <w:color w:val="2E74B5"/>
@@ -14709,7 +15741,7 @@
         </w:rPr>
         <w:t xml:space="preserve">Rafailov et al., “Direct Preference Optimization,” </w:t>
       </w:r>
-      <w:hyperlink r:id="rId22">
+      <w:hyperlink r:id="rId23">
         <w:r>
           <w:rPr>
             <w:color w:val="2E74B5"/>
@@ -14732,7 +15764,7 @@
         </w:rPr>
         <w:t xml:space="preserve">Ahmadian et al., “Back to Basics: Revisiting REINFORCE Style Optimization for Learning from Human Feedback in LLMs” (RLOO), </w:t>
       </w:r>
-      <w:hyperlink r:id="rId23">
+      <w:hyperlink r:id="rId24">
         <w:r>
           <w:rPr>
             <w:color w:val="2E74B5"/>
@@ -14755,7 +15787,7 @@
         </w:rPr>
         <w:t xml:space="preserve">DeepSeek-AI, “DeepSeekMath” (GRPO), </w:t>
       </w:r>
-      <w:hyperlink r:id="rId24">
+      <w:hyperlink r:id="rId25">
         <w:r>
           <w:rPr>
             <w:color w:val="2E74B5"/>
@@ -14778,7 +15810,7 @@
         </w:rPr>
         <w:t xml:space="preserve">Lightman et al., “Let's Verify Step by Step,” </w:t>
       </w:r>
-      <w:hyperlink r:id="rId25">
+      <w:hyperlink r:id="rId26">
         <w:r>
           <w:rPr>
             <w:color w:val="2E74B5"/>
@@ -14801,7 +15833,7 @@
         </w:rPr>
         <w:t xml:space="preserve">Agarwal et al., “On-Policy Distillation of Language Models” (GKD), </w:t>
       </w:r>
-      <w:hyperlink r:id="rId26">
+      <w:hyperlink r:id="rId27">
         <w:r>
           <w:rPr>
             <w:color w:val="2E74B5"/>
@@ -14824,7 +15856,7 @@
         </w:rPr>
         <w:t xml:space="preserve">Lambert et al., “Tülu 3,” </w:t>
       </w:r>
-      <w:hyperlink r:id="rId27">
+      <w:hyperlink r:id="rId28">
         <w:r>
           <w:rPr>
             <w:color w:val="2E74B5"/>
@@ -14847,7 +15879,7 @@
         </w:rPr>
         <w:t xml:space="preserve">Hui et al., “Qwen2.5-Coder Technical Report,” </w:t>
       </w:r>
-      <w:hyperlink r:id="rId28">
+      <w:hyperlink r:id="rId29">
         <w:r>
           <w:rPr>
             <w:color w:val="2E74B5"/>
@@ -14870,7 +15902,7 @@
         </w:rPr>
         <w:t xml:space="preserve">Qwen Team, “Qwen3 Technical Report,” </w:t>
       </w:r>
-      <w:hyperlink r:id="rId29">
+      <w:hyperlink r:id="rId30">
         <w:r>
           <w:rPr>
             <w:color w:val="2E74B5"/>
@@ -14893,7 +15925,7 @@
         </w:rPr>
         <w:t xml:space="preserve">DeepSeek-AI, DeepSeek-R1 report/repository, </w:t>
       </w:r>
-      <w:hyperlink r:id="rId30">
+      <w:hyperlink r:id="rId31">
         <w:r>
           <w:rPr>
             <w:color w:val="2E74B5"/>
@@ -14924,7 +15956,7 @@
         </w:rPr>
         <w:t xml:space="preserve">OpenAI, latest-model guide, </w:t>
       </w:r>
-      <w:hyperlink r:id="rId31">
+      <w:hyperlink r:id="rId32">
         <w:r>
           <w:rPr>
             <w:color w:val="2E74B5"/>
@@ -14942,7 +15974,7 @@
         </w:rPr>
         <w:t xml:space="preserve"> and gpt-oss repository, </w:t>
       </w:r>
-      <w:hyperlink r:id="rId32">
+      <w:hyperlink r:id="rId33">
         <w:r>
           <w:rPr>
             <w:color w:val="2E74B5"/>
@@ -14965,7 +15997,7 @@
         </w:rPr>
         <w:t xml:space="preserve">Qwen, Qwen3, </w:t>
       </w:r>
-      <w:hyperlink r:id="rId33">
+      <w:hyperlink r:id="rId34">
         <w:r>
           <w:rPr>
             <w:color w:val="2E74B5"/>
@@ -14983,7 +16015,7 @@
         </w:rPr>
         <w:t xml:space="preserve"> Qwen3-Coder, </w:t>
       </w:r>
-      <w:hyperlink r:id="rId34">
+      <w:hyperlink r:id="rId35">
         <w:r>
           <w:rPr>
             <w:color w:val="2E74B5"/>
@@ -15001,7 +16033,7 @@
         </w:rPr>
         <w:t xml:space="preserve"> and Qwen3.5-397B-A17B, </w:t>
       </w:r>
-      <w:hyperlink r:id="rId35">
+      <w:hyperlink r:id="rId36">
         <w:r>
           <w:rPr>
             <w:color w:val="2E74B5"/>
@@ -15024,7 +16056,7 @@
         </w:rPr>
         <w:t xml:space="preserve">DeepSeek-AI, DeepSeek-V3, </w:t>
       </w:r>
-      <w:hyperlink r:id="rId36">
+      <w:hyperlink r:id="rId37">
         <w:r>
           <w:rPr>
             <w:color w:val="2E74B5"/>
@@ -15042,7 +16074,7 @@
         </w:rPr>
         <w:t xml:space="preserve"> and DeepSeek-V3.2-Exp, </w:t>
       </w:r>
-      <w:hyperlink r:id="rId37">
+      <w:hyperlink r:id="rId38">
         <w:r>
           <w:rPr>
             <w:color w:val="2E74B5"/>
@@ -15065,7 +16097,7 @@
         </w:rPr>
         <w:t xml:space="preserve">Z.ai, GLM-5, </w:t>
       </w:r>
-      <w:hyperlink r:id="rId38">
+      <w:hyperlink r:id="rId39">
         <w:r>
           <w:rPr>
             <w:color w:val="2E74B5"/>
@@ -15083,7 +16115,7 @@
         </w:rPr>
         <w:t xml:space="preserve"> and GLM-5.2, </w:t>
       </w:r>
-      <w:hyperlink r:id="rId39">
+      <w:hyperlink r:id="rId40">
         <w:r>
           <w:rPr>
             <w:color w:val="2E74B5"/>
@@ -15106,7 +16138,7 @@
         </w:rPr>
         <w:t xml:space="preserve">Meta, Llama 4 architecture announcement, </w:t>
       </w:r>
-      <w:hyperlink r:id="rId40">
+      <w:hyperlink r:id="rId41">
         <w:r>
           <w:rPr>
             <w:color w:val="2E74B5"/>
@@ -15129,7 +16161,7 @@
         </w:rPr>
         <w:t xml:space="preserve">Google DeepMind, Gemini 3.1 Pro model card, </w:t>
       </w:r>
-      <w:hyperlink r:id="rId41">
+      <w:hyperlink r:id="rId42">
         <w:r>
           <w:rPr>
             <w:color w:val="2E74B5"/>
@@ -15152,7 +16184,7 @@
         </w:rPr>
         <w:t xml:space="preserve">Anthropic, Claude Fable 5/Mythos 5 announcement, </w:t>
       </w:r>
-      <w:hyperlink r:id="rId42">
+      <w:hyperlink r:id="rId43">
         <w:r>
           <w:rPr>
             <w:color w:val="2E74B5"/>
@@ -15175,7 +16207,7 @@
         </w:rPr>
         <w:t xml:space="preserve">MiniMax, MiniMax-M2.5 model card, </w:t>
       </w:r>
-      <w:hyperlink r:id="rId43">
+      <w:hyperlink r:id="rId44">
         <w:r>
           <w:rPr>
             <w:color w:val="2E74B5"/>
@@ -15198,7 +16230,7 @@
         </w:rPr>
         <w:t xml:space="preserve">TII, Falcon-H1-34B model card, </w:t>
       </w:r>
-      <w:hyperlink r:id="rId44">
+      <w:hyperlink r:id="rId45">
         <w:r>
           <w:rPr>
             <w:color w:val="2E74B5"/>
@@ -15221,7 +16253,7 @@
         </w:rPr>
         <w:t xml:space="preserve">Mistral, Devstral Small 2 24B model card, </w:t>
       </w:r>
-      <w:hyperlink r:id="rId45">
+      <w:hyperlink r:id="rId46">
         <w:r>
           <w:rPr>
             <w:color w:val="2E74B5"/>
@@ -15244,7 +16276,7 @@
         </w:rPr>
         <w:t xml:space="preserve">Kimi Team, “Kimi K3: Open Frontier Intelligence,” </w:t>
       </w:r>
-      <w:hyperlink r:id="rId46">
+      <w:hyperlink r:id="rId47">
         <w:r>
           <w:rPr>
             <w:color w:val="2E74B5"/>
@@ -15267,7 +16299,7 @@
         </w:rPr>
         <w:t xml:space="preserve">Official report snapshot at reviewed commit: </w:t>
       </w:r>
-      <w:hyperlink r:id="rId47">
+      <w:hyperlink r:id="rId48">
         <w:r>
           <w:rPr>
             <w:color w:val="2E74B5"/>
@@ -15290,7 +16322,7 @@
         </w:rPr>
         <w:t xml:space="preserve">Official repository, </w:t>
       </w:r>
-      <w:hyperlink r:id="rId48">
+      <w:hyperlink r:id="rId49">
         <w:r>
           <w:rPr>
             <w:color w:val="2E74B5"/>
@@ -15313,7 +16345,7 @@
         </w:rPr>
         <w:t xml:space="preserve">Official model page, </w:t>
       </w:r>
-      <w:hyperlink r:id="rId49">
+      <w:hyperlink r:id="rId50">
         <w:r>
           <w:rPr>
             <w:color w:val="2E74B5"/>
@@ -15336,7 +16368,7 @@
         </w:rPr>
         <w:t xml:space="preserve">Reviewed licence snapshot: </w:t>
       </w:r>
-      <w:hyperlink r:id="rId50">
+      <w:hyperlink r:id="rId51">
         <w:r>
           <w:rPr>
             <w:color w:val="2E74B5"/>
@@ -15367,7 +16399,7 @@
         </w:rPr>
         <w:t xml:space="preserve">Jimenez et al., “SWE-bench,” </w:t>
       </w:r>
-      <w:hyperlink r:id="rId51">
+      <w:hyperlink r:id="rId52">
         <w:r>
           <w:rPr>
             <w:color w:val="2E74B5"/>
@@ -15390,7 +16422,7 @@
         </w:rPr>
         <w:t xml:space="preserve">Jain et al., “LiveCodeBench,” </w:t>
       </w:r>
-      <w:hyperlink r:id="rId52">
+      <w:hyperlink r:id="rId53">
         <w:r>
           <w:rPr>
             <w:color w:val="2E74B5"/>
@@ -15413,7 +16445,7 @@
         </w:rPr>
         <w:t xml:space="preserve">Yao et al., “ReAct,” </w:t>
       </w:r>
-      <w:hyperlink r:id="rId53">
+      <w:hyperlink r:id="rId54">
         <w:r>
           <w:rPr>
             <w:color w:val="2E74B5"/>
@@ -15436,7 +16468,7 @@
         </w:rPr>
         <w:t xml:space="preserve">Zhou et al., “tau-bench,” </w:t>
       </w:r>
-      <w:hyperlink r:id="rId54">
+      <w:hyperlink r:id="rId55">
         <w:r>
           <w:rPr>
             <w:color w:val="2E74B5"/>
@@ -15454,7 +16486,7 @@
         </w:rPr>
         <w:t xml:space="preserve"> and Wu et al., “ToolSandbox,” </w:t>
       </w:r>
-      <w:hyperlink r:id="rId55">
+      <w:hyperlink r:id="rId56">
         <w:r>
           <w:rPr>
             <w:color w:val="2E74B5"/>
@@ -15477,7 +16509,7 @@
         </w:rPr>
         <w:t xml:space="preserve">Liang et al., “HELM,” </w:t>
       </w:r>
-      <w:hyperlink r:id="rId56">
+      <w:hyperlink r:id="rId57">
         <w:r>
           <w:rPr>
             <w:color w:val="2E74B5"/>
@@ -15495,7 +16527,7 @@
         </w:rPr>
         <w:t xml:space="preserve"> and Zhou et al., “IFEval,” </w:t>
       </w:r>
-      <w:hyperlink r:id="rId57">
+      <w:hyperlink r:id="rId58">
         <w:r>
           <w:rPr>
             <w:color w:val="2E74B5"/>
@@ -15518,7 +16550,7 @@
         </w:rPr>
         <w:t xml:space="preserve">Anthropic, “Building effective agents,” </w:t>
       </w:r>
-      <w:hyperlink r:id="rId58">
+      <w:hyperlink r:id="rId59">
         <w:r>
           <w:rPr>
             <w:color w:val="2E74B5"/>
@@ -15541,7 +16573,7 @@
         </w:rPr>
         <w:t xml:space="preserve">vLLM serving documentation, </w:t>
       </w:r>
-      <w:hyperlink r:id="rId59">
+      <w:hyperlink r:id="rId60">
         <w:r>
           <w:rPr>
             <w:color w:val="2E74B5"/>
@@ -15564,7 +16596,7 @@
         </w:rPr>
         <w:t xml:space="preserve">SGLang repository, </w:t>
       </w:r>
-      <w:hyperlink r:id="rId60">
+      <w:hyperlink r:id="rId61">
         <w:r>
           <w:rPr>
             <w:color w:val="2E74B5"/>
@@ -15582,7 +16614,7 @@
         </w:rPr>
         <w:t xml:space="preserve"> and NVIDIA TensorRT-LLM, </w:t>
       </w:r>
-      <w:hyperlink r:id="rId61">
+      <w:hyperlink r:id="rId62">
         <w:r>
           <w:rPr>
             <w:color w:val="2E74B5"/>
@@ -15605,7 +16637,7 @@
         </w:rPr>
         <w:t xml:space="preserve">Dao et al., “FlashAttention,” </w:t>
       </w:r>
-      <w:hyperlink r:id="rId62">
+      <w:hyperlink r:id="rId63">
         <w:r>
           <w:rPr>
             <w:color w:val="2E74B5"/>
@@ -15623,7 +16655,7 @@
         </w:rPr>
         <w:t xml:space="preserve"> and FlashAttention-2, </w:t>
       </w:r>
-      <w:hyperlink r:id="rId63">
+      <w:hyperlink r:id="rId64">
         <w:r>
           <w:rPr>
             <w:color w:val="2E74B5"/>
@@ -15646,7 +16678,7 @@
         </w:rPr>
         <w:t xml:space="preserve">PyTorch FSDP, </w:t>
       </w:r>
-      <w:hyperlink r:id="rId64">
+      <w:hyperlink r:id="rId65">
         <w:r>
           <w:rPr>
             <w:color w:val="2E74B5"/>
@@ -15664,7 +16696,7 @@
         </w:rPr>
         <w:t xml:space="preserve"> and TorchTitan, </w:t>
       </w:r>
-      <w:hyperlink r:id="rId65">
+      <w:hyperlink r:id="rId66">
         <w:r>
           <w:rPr>
             <w:color w:val="2E74B5"/>
@@ -15687,7 +16719,7 @@
         </w:rPr>
         <w:t xml:space="preserve">DeepSpeed ZeRO, </w:t>
       </w:r>
-      <w:hyperlink r:id="rId66">
+      <w:hyperlink r:id="rId67">
         <w:r>
           <w:rPr>
             <w:color w:val="2E74B5"/>
@@ -15705,7 +16737,7 @@
         </w:rPr>
         <w:t xml:space="preserve"> and NVIDIA Megatron-LM, </w:t>
       </w:r>
-      <w:hyperlink r:id="rId67">
+      <w:hyperlink r:id="rId68">
         <w:r>
           <w:rPr>
             <w:color w:val="2E74B5"/>
@@ -15728,7 +16760,7 @@
         </w:rPr>
         <w:t xml:space="preserve">Slurm documentation, </w:t>
       </w:r>
-      <w:hyperlink r:id="rId68">
+      <w:hyperlink r:id="rId69">
         <w:r>
           <w:rPr>
             <w:color w:val="2E74B5"/>
@@ -15746,7 +16778,7 @@
         </w:rPr>
         <w:t xml:space="preserve"> and NVIDIA NCCL, </w:t>
       </w:r>
-      <w:hyperlink r:id="rId69">
+      <w:hyperlink r:id="rId70">
         <w:r>
           <w:rPr>
             <w:color w:val="2E74B5"/>
@@ -15769,7 +16801,7 @@
         </w:rPr>
         <w:t xml:space="preserve">Python Packaging Authority, PEP 751, </w:t>
       </w:r>
-      <w:hyperlink r:id="rId70">
+      <w:hyperlink r:id="rId71">
         <w:r>
           <w:rPr>
             <w:color w:val="2E74B5"/>
@@ -15806,7 +16838,7 @@
         </w:rPr>
         <w:t xml:space="preserve">, </w:t>
       </w:r>
-      <w:hyperlink r:id="rId71">
+      <w:hyperlink r:id="rId72">
         <w:r>
           <w:rPr>
             <w:color w:val="2E74B5"/>
@@ -15829,7 +16861,7 @@
         </w:rPr>
         <w:t xml:space="preserve">IETF RFC 7518 §3.4 (ECDSA/JWA), </w:t>
       </w:r>
-      <w:hyperlink r:id="rId72">
+      <w:hyperlink r:id="rId73">
         <w:r>
           <w:rPr>
             <w:color w:val="2E74B5"/>
@@ -15866,7 +16898,7 @@
         </w:rPr>
         <w:t xml:space="preserve">, </w:t>
       </w:r>
-      <w:hyperlink r:id="rId73">
+      <w:hyperlink r:id="rId74">
         <w:r>
           <w:rPr>
             <w:color w:val="2E74B5"/>
@@ -15903,7 +16935,7 @@
         </w:rPr>
         <w:t xml:space="preserve">, </w:t>
       </w:r>
-      <w:hyperlink r:id="rId74">
+      <w:hyperlink r:id="rId75">
         <w:r>
           <w:rPr>
             <w:color w:val="2E74B5"/>
@@ -15940,7 +16972,7 @@
         </w:rPr>
         <w:t xml:space="preserve">, </w:t>
       </w:r>
-      <w:hyperlink r:id="rId75">
+      <w:hyperlink r:id="rId76">
         <w:r>
           <w:rPr>
             <w:color w:val="2E74B5"/>
@@ -16814,7 +17846,7 @@
         <w:rFonts w:asciiTheme="minorHAnsi" w:eastAsiaTheme="minorEastAsia" w:hAnsiTheme="minorHAnsi" w:cstheme="minorBidi"/>
         <w:sz w:val="22"/>
         <w:szCs w:val="22"/>
-        <w:lang w:val="en-US" w:eastAsia="en-US" w:bidi="ar-SA"/>
+        <w:lang w:val="en-GB" w:eastAsia="en-GB" w:bidi="en-GB"/>
       </w:rPr>
     </w:rPrDefault>
     <w:pPrDefault>
@@ -16974,6 +18006,7 @@
       <w:rFonts w:ascii="Calibri" w:hAnsi="Calibri"/>
       <w:color w:val="25313B"/>
       <w:sz w:val="22"/>
+      <w:lang w:val="en-GB" w:eastAsia="en-GB" w:bidi="en-GB"/>
     </w:rPr>
   </w:style>
   <w:style w:type="paragraph" w:styleId="Header">

</xml_diff>